<commit_message>
Añado licencias y completo un poco la memoria
</commit_message>
<xml_diff>
--- a/Memoria_ProyectoV1.docx
+++ b/Memoria_ProyectoV1.docx
@@ -410,7 +410,6 @@
         </w:rPr>
         <w:t xml:space="preserve">Proyecto: </w:t>
       </w:r>
-      <w:proofErr w:type="spellStart"/>
       <w:r>
         <w:rPr>
           <w:sz w:val="32"/>
@@ -418,7 +417,6 @@
         </w:rPr>
         <w:t>MrFinance</w:t>
       </w:r>
-      <w:proofErr w:type="spellEnd"/>
     </w:p>
     <w:p>
       <w:pPr>
@@ -455,10 +453,21 @@
       </w:r>
     </w:p>
     <w:p>
-      <w:r>
+      <w:pPr>
+        <w:rPr>
+          <w:lang w:val="en-US"/>
+        </w:rPr>
+      </w:pPr>
+      <w:r>
+        <w:rPr>
+          <w:lang w:val="en-US"/>
+        </w:rPr>
         <w:t xml:space="preserve">Email: </w:t>
       </w:r>
       <w:r>
+        <w:rPr>
+          <w:lang w:val="en-US"/>
+        </w:rPr>
         <w:t>carlosj.pilsan.1@educa.jcyl.es</w:t>
       </w:r>
     </w:p>
@@ -467,6 +476,7 @@
         <w:rPr>
           <w:sz w:val="32"/>
           <w:szCs w:val="32"/>
+          <w:lang w:val="en-US"/>
         </w:rPr>
       </w:pPr>
     </w:p>
@@ -475,6 +485,7 @@
         <w:rPr>
           <w:sz w:val="32"/>
           <w:szCs w:val="32"/>
+          <w:lang w:val="en-US"/>
         </w:rPr>
       </w:pPr>
     </w:p>
@@ -483,6 +494,7 @@
         <w:rPr>
           <w:sz w:val="32"/>
           <w:szCs w:val="32"/>
+          <w:lang w:val="en-US"/>
         </w:rPr>
       </w:pPr>
     </w:p>
@@ -500,31 +512,13 @@
         </w:rPr>
         <w:t xml:space="preserve">Tutor individual: </w:t>
       </w:r>
-      <w:proofErr w:type="spellStart"/>
       <w:r>
         <w:rPr>
           <w:sz w:val="32"/>
           <w:szCs w:val="32"/>
         </w:rPr>
-        <w:t>Maria</w:t>
-      </w:r>
-      <w:proofErr w:type="spellEnd"/>
-      <w:r>
-        <w:rPr>
-          <w:sz w:val="32"/>
-          <w:szCs w:val="32"/>
-        </w:rPr>
-        <w:t xml:space="preserve"> </w:t>
-      </w:r>
-      <w:proofErr w:type="spellStart"/>
-      <w:r>
-        <w:rPr>
-          <w:sz w:val="32"/>
-          <w:szCs w:val="32"/>
-        </w:rPr>
-        <w:t>Jose</w:t>
-      </w:r>
-      <w:proofErr w:type="spellEnd"/>
+        <w:t>Maria Jose</w:t>
+      </w:r>
     </w:p>
     <w:p>
       <w:pPr>
@@ -595,20 +589,12 @@
         </w:rPr>
       </w:pPr>
       <w:bookmarkStart w:id="0" w:name="_Toc225877697"/>
-      <w:proofErr w:type="spellStart"/>
       <w:r>
         <w:rPr>
           <w:rFonts w:ascii="Arial" w:hAnsi="Arial" w:cs="Arial"/>
         </w:rPr>
         <w:lastRenderedPageBreak/>
-        <w:t>Introduccion</w:t>
-      </w:r>
-      <w:proofErr w:type="spellEnd"/>
-      <w:r>
-        <w:rPr>
-          <w:rFonts w:ascii="Arial" w:hAnsi="Arial" w:cs="Arial"/>
-        </w:rPr>
-        <w:t xml:space="preserve"> al proyecto</w:t>
+        <w:t>Introduccion al proyecto</w:t>
       </w:r>
       <w:bookmarkEnd w:id="0"/>
     </w:p>
@@ -640,6 +626,146 @@
           <w:rFonts w:ascii="Arial" w:hAnsi="Arial" w:cs="Arial"/>
         </w:rPr>
       </w:pPr>
+    </w:p>
+    <w:p>
+      <w:pPr>
+        <w:rPr>
+          <w:rFonts w:ascii="Arial" w:hAnsi="Arial" w:cs="Arial"/>
+        </w:rPr>
+      </w:pPr>
+      <w:r>
+        <w:rPr>
+          <w:rFonts w:ascii="Arial" w:hAnsi="Arial" w:cs="Arial"/>
+        </w:rPr>
+        <w:t>Para el código uso</w:t>
+      </w:r>
+      <w:r>
+        <w:rPr>
+          <w:rFonts w:ascii="Arial" w:hAnsi="Arial" w:cs="Arial"/>
+        </w:rPr>
+        <w:t xml:space="preserve"> la licencia GNU AGPL v3 </w:t>
+      </w:r>
+      <w:r>
+        <w:rPr>
+          <w:rFonts w:ascii="Arial" w:hAnsi="Arial" w:cs="Arial"/>
+        </w:rPr>
+        <w:t>para</w:t>
+      </w:r>
+      <w:r>
+        <w:rPr>
+          <w:rFonts w:ascii="Arial" w:hAnsi="Arial" w:cs="Arial"/>
+        </w:rPr>
+        <w:t xml:space="preserve"> garantizar la libertad de uso, estudio y modificación, obligando a publicar mejoras incluso cuando el software se ofrece como servicio web</w:t>
+      </w:r>
+      <w:r>
+        <w:rPr>
+          <w:rFonts w:ascii="Arial" w:hAnsi="Arial" w:cs="Arial"/>
+        </w:rPr>
+        <w:t xml:space="preserve"> de manera gratuita</w:t>
+      </w:r>
+      <w:r>
+        <w:rPr>
+          <w:rFonts w:ascii="Arial" w:hAnsi="Arial" w:cs="Arial"/>
+        </w:rPr>
+        <w:t>.</w:t>
+      </w:r>
+      <w:r>
+        <w:rPr>
+          <w:rFonts w:ascii="Arial" w:hAnsi="Arial" w:cs="Arial"/>
+        </w:rPr>
+        <w:t xml:space="preserve"> </w:t>
+      </w:r>
+    </w:p>
+    <w:p>
+      <w:pPr>
+        <w:rPr>
+          <w:rFonts w:ascii="Arial" w:hAnsi="Arial" w:cs="Arial"/>
+        </w:rPr>
+      </w:pPr>
+      <w:r>
+        <w:rPr>
+          <w:rFonts w:ascii="Arial" w:hAnsi="Arial" w:cs="Arial"/>
+        </w:rPr>
+        <w:t>Para la documentación se utiliza CC BY-NC-SA 4.0, protegiendo la autoría y limitando usos comerciales no autorizados</w:t>
+      </w:r>
+      <w:r>
+        <w:rPr>
+          <w:rFonts w:ascii="Arial" w:hAnsi="Arial" w:cs="Arial"/>
+        </w:rPr>
+        <w:t xml:space="preserve"> para que no cualquiera pueda usar este trabajo sin </w:t>
+      </w:r>
+      <w:r>
+        <w:rPr>
+          <w:rFonts w:ascii="Arial" w:hAnsi="Arial" w:cs="Arial"/>
+        </w:rPr>
+        <w:t>autorización, aunque se copie el código de este trabajo</w:t>
+      </w:r>
+    </w:p>
+    <w:p>
+      <w:pPr>
+        <w:rPr>
+          <w:rFonts w:ascii="Arial" w:hAnsi="Arial" w:cs="Arial"/>
+        </w:rPr>
+      </w:pPr>
+      <w:r>
+        <w:rPr>
+          <w:rFonts w:ascii="Arial" w:hAnsi="Arial" w:cs="Arial"/>
+        </w:rPr>
+        <w:t xml:space="preserve">Y por ultimo la marca nobre de la </w:t>
+      </w:r>
+      <w:proofErr w:type="gramStart"/>
+      <w:r>
+        <w:rPr>
+          <w:rFonts w:ascii="Arial" w:hAnsi="Arial" w:cs="Arial"/>
+        </w:rPr>
+        <w:t>app</w:t>
+      </w:r>
+      <w:proofErr w:type="gramEnd"/>
+      <w:r>
+        <w:rPr>
+          <w:rFonts w:ascii="Arial" w:hAnsi="Arial" w:cs="Arial"/>
+        </w:rPr>
+        <w:t>, diseños y demás elementos característicos de la marca mr finance están resevados</w:t>
+      </w:r>
+      <w:r>
+        <w:rPr>
+          <w:rFonts w:ascii="Arial" w:hAnsi="Arial" w:cs="Arial"/>
+        </w:rPr>
+        <w:t>.</w:t>
+      </w:r>
+    </w:p>
+    <w:p>
+      <w:pPr>
+        <w:rPr>
+          <w:rFonts w:ascii="Arial" w:hAnsi="Arial" w:cs="Arial"/>
+        </w:rPr>
+      </w:pPr>
+      <w:r>
+        <w:rPr>
+          <w:rFonts w:ascii="Arial" w:hAnsi="Arial" w:cs="Arial"/>
+        </w:rPr>
+        <w:t xml:space="preserve">Esto se puede ver </w:t>
+      </w:r>
+      <w:proofErr w:type="gramStart"/>
+      <w:r>
+        <w:rPr>
+          <w:rFonts w:ascii="Arial" w:hAnsi="Arial" w:cs="Arial"/>
+        </w:rPr>
+        <w:t>el los</w:t>
+      </w:r>
+      <w:proofErr w:type="gramEnd"/>
+      <w:r>
+        <w:rPr>
+          <w:rFonts w:ascii="Arial" w:hAnsi="Arial" w:cs="Arial"/>
+        </w:rPr>
+        <w:t xml:space="preserve"> archivos README.md, LICENSE-docs y LICENSE</w:t>
+      </w:r>
+      <w:r>
+        <w:rPr>
+          <w:rFonts w:ascii="Arial" w:hAnsi="Arial" w:cs="Arial"/>
+        </w:rPr>
+        <w:t xml:space="preserve"> entro de la carpeta del proyecto.</w:t>
+      </w:r>
       <w:r>
         <w:rPr>
           <w:rFonts w:ascii="Arial" w:hAnsi="Arial" w:cs="Arial"/>
@@ -680,30 +806,8 @@
         <w:rPr>
           <w:rFonts w:ascii="Arial" w:hAnsi="Arial" w:cs="Arial"/>
         </w:rPr>
-        <w:t xml:space="preserve">Bla </w:t>
-      </w:r>
-      <w:proofErr w:type="spellStart"/>
-      <w:r>
-        <w:rPr>
-          <w:rFonts w:ascii="Arial" w:hAnsi="Arial" w:cs="Arial"/>
-        </w:rPr>
-        <w:t>bla</w:t>
-      </w:r>
-      <w:proofErr w:type="spellEnd"/>
-      <w:r>
-        <w:rPr>
-          <w:rFonts w:ascii="Arial" w:hAnsi="Arial" w:cs="Arial"/>
-        </w:rPr>
-        <w:t xml:space="preserve"> </w:t>
-      </w:r>
-      <w:proofErr w:type="spellStart"/>
-      <w:r>
-        <w:rPr>
-          <w:rFonts w:ascii="Arial" w:hAnsi="Arial" w:cs="Arial"/>
-        </w:rPr>
-        <w:t>bla</w:t>
-      </w:r>
-      <w:proofErr w:type="spellEnd"/>
+        <w:t>Bla bla bla</w:t>
+      </w:r>
     </w:p>
     <w:p>
       <w:pPr>
@@ -751,30 +855,8 @@
         <w:rPr>
           <w:rFonts w:ascii="Arial" w:hAnsi="Arial" w:cs="Arial"/>
         </w:rPr>
-        <w:t xml:space="preserve">Bla </w:t>
-      </w:r>
-      <w:proofErr w:type="spellStart"/>
-      <w:r>
-        <w:rPr>
-          <w:rFonts w:ascii="Arial" w:hAnsi="Arial" w:cs="Arial"/>
-        </w:rPr>
-        <w:t>bla</w:t>
-      </w:r>
-      <w:proofErr w:type="spellEnd"/>
-      <w:r>
-        <w:rPr>
-          <w:rFonts w:ascii="Arial" w:hAnsi="Arial" w:cs="Arial"/>
-        </w:rPr>
-        <w:t xml:space="preserve"> </w:t>
-      </w:r>
-      <w:proofErr w:type="spellStart"/>
-      <w:r>
-        <w:rPr>
-          <w:rFonts w:ascii="Arial" w:hAnsi="Arial" w:cs="Arial"/>
-        </w:rPr>
-        <w:t>bla</w:t>
-      </w:r>
-      <w:proofErr w:type="spellEnd"/>
+        <w:t>Bla bla bla</w:t>
+      </w:r>
       <w:r>
         <w:rPr>
           <w:rFonts w:ascii="Arial" w:hAnsi="Arial" w:cs="Arial"/>
@@ -797,19 +879,11 @@
         <w:lastRenderedPageBreak/>
         <w:t xml:space="preserve">0.3 </w:t>
       </w:r>
-      <w:proofErr w:type="spellStart"/>
-      <w:r>
-        <w:rPr>
-          <w:rFonts w:ascii="Arial" w:hAnsi="Arial" w:cs="Arial"/>
-        </w:rPr>
-        <w:t>Abstract</w:t>
-      </w:r>
-      <w:proofErr w:type="spellEnd"/>
-      <w:r>
-        <w:rPr>
-          <w:rFonts w:ascii="Arial" w:hAnsi="Arial" w:cs="Arial"/>
-        </w:rPr>
-        <w:t xml:space="preserve"> (</w:t>
+      <w:r>
+        <w:rPr>
+          <w:rFonts w:ascii="Arial" w:hAnsi="Arial" w:cs="Arial"/>
+        </w:rPr>
+        <w:t>Abstract (</w:t>
       </w:r>
       <w:proofErr w:type="gramStart"/>
       <w:r>
@@ -3872,35 +3946,7 @@
         <w:rPr>
           <w:rFonts w:ascii="Arial" w:hAnsi="Arial" w:cs="Arial"/>
         </w:rPr>
-        <w:t xml:space="preserve"> ahorro y gastos “</w:t>
-      </w:r>
-      <w:proofErr w:type="spellStart"/>
-      <w:r>
-        <w:rPr>
-          <w:rFonts w:ascii="Arial" w:hAnsi="Arial" w:cs="Arial"/>
-        </w:rPr>
-        <w:t>Mr</w:t>
-      </w:r>
-      <w:proofErr w:type="spellEnd"/>
-      <w:r>
-        <w:rPr>
-          <w:rFonts w:ascii="Arial" w:hAnsi="Arial" w:cs="Arial"/>
-        </w:rPr>
-        <w:t xml:space="preserve"> </w:t>
-      </w:r>
-      <w:proofErr w:type="spellStart"/>
-      <w:r>
-        <w:rPr>
-          <w:rFonts w:ascii="Arial" w:hAnsi="Arial" w:cs="Arial"/>
-        </w:rPr>
-        <w:t>finance</w:t>
-      </w:r>
-      <w:proofErr w:type="spellEnd"/>
-      <w:r>
-        <w:rPr>
-          <w:rFonts w:ascii="Arial" w:hAnsi="Arial" w:cs="Arial"/>
-        </w:rPr>
-        <w:t>”</w:t>
+        <w:t xml:space="preserve"> ahorro y gastos “Mr finance”</w:t>
       </w:r>
       <w:r>
         <w:rPr>
@@ -4350,16 +4396,8 @@
               <w:rPr>
                 <w:rFonts w:ascii="Arial" w:hAnsi="Arial" w:cs="Arial"/>
               </w:rPr>
-              <w:t xml:space="preserve">Solución que aporta </w:t>
-            </w:r>
-            <w:proofErr w:type="spellStart"/>
-            <w:r>
-              <w:rPr>
-                <w:rFonts w:ascii="Arial" w:hAnsi="Arial" w:cs="Arial"/>
-              </w:rPr>
-              <w:t>MrFinance</w:t>
-            </w:r>
-            <w:proofErr w:type="spellEnd"/>
+              <w:t>Solución que aporta MrFinance</w:t>
+            </w:r>
           </w:p>
         </w:tc>
       </w:tr>
@@ -4905,21 +4943,7 @@
         <w:rPr>
           <w:rFonts w:ascii="Arial" w:hAnsi="Arial" w:cs="Arial"/>
         </w:rPr>
-        <w:t xml:space="preserve">Conexión directa con bancos o </w:t>
-      </w:r>
-      <w:proofErr w:type="spellStart"/>
-      <w:r>
-        <w:rPr>
-          <w:rFonts w:ascii="Arial" w:hAnsi="Arial" w:cs="Arial"/>
-        </w:rPr>
-        <w:t>APIs</w:t>
-      </w:r>
-      <w:proofErr w:type="spellEnd"/>
-      <w:r>
-        <w:rPr>
-          <w:rFonts w:ascii="Arial" w:hAnsi="Arial" w:cs="Arial"/>
-        </w:rPr>
-        <w:t xml:space="preserve"> financieras externas</w:t>
+        <w:t>Conexión directa con bancos o APIs financieras externas</w:t>
       </w:r>
       <w:r>
         <w:rPr>
@@ -4949,21 +4973,7 @@
         <w:rPr>
           <w:rFonts w:ascii="Arial" w:hAnsi="Arial" w:cs="Arial"/>
         </w:rPr>
-        <w:t xml:space="preserve"> con personas o </w:t>
-      </w:r>
-      <w:proofErr w:type="spellStart"/>
-      <w:r>
-        <w:rPr>
-          <w:rFonts w:ascii="Arial" w:hAnsi="Arial" w:cs="Arial"/>
-        </w:rPr>
-        <w:t>ia</w:t>
-      </w:r>
-      <w:proofErr w:type="spellEnd"/>
-      <w:r>
-        <w:rPr>
-          <w:rFonts w:ascii="Arial" w:hAnsi="Arial" w:cs="Arial"/>
-        </w:rPr>
-        <w:t>.</w:t>
+        <w:t xml:space="preserve"> con personas o ia.</w:t>
       </w:r>
     </w:p>
     <w:p>
@@ -5051,18 +5061,8 @@
           <w:b/>
           <w:bCs/>
         </w:rPr>
-        <w:t>full-</w:t>
-      </w:r>
-      <w:proofErr w:type="spellStart"/>
-      <w:r>
-        <w:rPr>
-          <w:rFonts w:ascii="Arial" w:hAnsi="Arial" w:cs="Arial"/>
-          <w:b/>
-          <w:bCs/>
-        </w:rPr>
-        <w:t>stack</w:t>
-      </w:r>
-      <w:proofErr w:type="spellEnd"/>
+        <w:t>full-stack</w:t>
+      </w:r>
       <w:r>
         <w:rPr>
           <w:rFonts w:ascii="Arial" w:hAnsi="Arial" w:cs="Arial"/>
@@ -5121,25 +5121,7 @@
           <w:b/>
           <w:bCs/>
         </w:rPr>
-        <w:t xml:space="preserve">base de datos + </w:t>
-      </w:r>
-      <w:proofErr w:type="spellStart"/>
-      <w:r>
-        <w:rPr>
-          <w:rFonts w:ascii="Arial" w:hAnsi="Arial" w:cs="Arial"/>
-          <w:b/>
-          <w:bCs/>
-        </w:rPr>
-        <w:t>backend</w:t>
-      </w:r>
-      <w:proofErr w:type="spellEnd"/>
-      <w:r>
-        <w:rPr>
-          <w:rFonts w:ascii="Arial" w:hAnsi="Arial" w:cs="Arial"/>
-          <w:b/>
-          <w:bCs/>
-        </w:rPr>
-        <w:t xml:space="preserve"> con autenticación</w:t>
+        <w:t>base de datos + backend con autenticación</w:t>
       </w:r>
     </w:p>
     <w:p>
@@ -5205,23 +5187,13 @@
         </w:rPr>
         <w:t xml:space="preserve">La experiencia debe ser fluida y visual </w:t>
       </w:r>
-      <w:proofErr w:type="spellStart"/>
       <w:r>
         <w:rPr>
           <w:rFonts w:ascii="Arial" w:hAnsi="Arial" w:cs="Arial"/>
           <w:b/>
           <w:bCs/>
         </w:rPr>
-        <w:t>frontend</w:t>
-      </w:r>
-      <w:proofErr w:type="spellEnd"/>
-      <w:r>
-        <w:rPr>
-          <w:rFonts w:ascii="Arial" w:hAnsi="Arial" w:cs="Arial"/>
-          <w:b/>
-          <w:bCs/>
-        </w:rPr>
-        <w:t xml:space="preserve"> dinámico con gráficos</w:t>
+        <w:t>frontend dinámico con gráficos</w:t>
       </w:r>
     </w:p>
     <w:p>
@@ -5273,44 +5245,50 @@
           <w:b/>
           <w:bCs/>
         </w:rPr>
-        <w:t xml:space="preserve">diseño responsive + despliegue en </w:t>
-      </w:r>
-      <w:proofErr w:type="spellStart"/>
+        <w:t>diseño responsive + despliegue en cloud</w:t>
+      </w:r>
       <w:r>
         <w:rPr>
           <w:rFonts w:ascii="Arial" w:hAnsi="Arial" w:cs="Arial"/>
           <w:b/>
           <w:bCs/>
         </w:rPr>
-        <w:t>cloud</w:t>
-      </w:r>
-      <w:proofErr w:type="spellEnd"/>
-      <w:r>
+        <w:t>.</w:t>
+      </w:r>
+    </w:p>
+    <w:p>
+      <w:pPr>
+        <w:ind w:left="720"/>
+        <w:jc w:val="both"/>
+        <w:rPr>
+          <w:rFonts w:ascii="Arial" w:hAnsi="Arial" w:cs="Arial"/>
+        </w:rPr>
+      </w:pPr>
+    </w:p>
+    <w:p>
+      <w:pPr>
+        <w:jc w:val="both"/>
         <w:rPr>
           <w:rFonts w:ascii="Arial" w:hAnsi="Arial" w:cs="Arial"/>
           <w:b/>
           <w:bCs/>
         </w:rPr>
-        <w:t>.</w:t>
-      </w:r>
-    </w:p>
-    <w:p>
-      <w:pPr>
-        <w:ind w:left="720"/>
-        <w:jc w:val="both"/>
-        <w:rPr>
-          <w:rFonts w:ascii="Arial" w:hAnsi="Arial" w:cs="Arial"/>
-        </w:rPr>
-      </w:pPr>
-    </w:p>
-    <w:p>
-      <w:pPr>
-        <w:jc w:val="both"/>
+      </w:pPr>
+      <w:r>
         <w:rPr>
           <w:rFonts w:ascii="Arial" w:hAnsi="Arial" w:cs="Arial"/>
           <w:b/>
           <w:bCs/>
         </w:rPr>
+        <w:t>Resumen de la propuesta:</w:t>
+      </w:r>
+    </w:p>
+    <w:p>
+      <w:pPr>
+        <w:jc w:val="both"/>
+        <w:rPr>
+          <w:rFonts w:ascii="Arial" w:hAnsi="Arial" w:cs="Arial"/>
+        </w:rPr>
       </w:pPr>
       <w:r>
         <w:rPr>
@@ -5318,26 +5296,8 @@
           <w:b/>
           <w:bCs/>
         </w:rPr>
-        <w:t>Resumen de la propuesta:</w:t>
-      </w:r>
-    </w:p>
-    <w:p>
-      <w:pPr>
-        <w:jc w:val="both"/>
-        <w:rPr>
-          <w:rFonts w:ascii="Arial" w:hAnsi="Arial" w:cs="Arial"/>
-        </w:rPr>
-      </w:pPr>
-      <w:proofErr w:type="spellStart"/>
-      <w:r>
-        <w:rPr>
-          <w:rFonts w:ascii="Arial" w:hAnsi="Arial" w:cs="Arial"/>
-          <w:b/>
-          <w:bCs/>
-        </w:rPr>
         <w:t>MrFinance</w:t>
       </w:r>
-      <w:proofErr w:type="spellEnd"/>
       <w:r>
         <w:rPr>
           <w:rFonts w:ascii="Arial" w:hAnsi="Arial" w:cs="Arial"/>
@@ -5440,21 +5400,7 @@
         <w:rPr>
           <w:rFonts w:ascii="Arial" w:hAnsi="Arial" w:cs="Arial"/>
         </w:rPr>
-        <w:t xml:space="preserve"> como </w:t>
-      </w:r>
-      <w:proofErr w:type="spellStart"/>
-      <w:r>
-        <w:rPr>
-          <w:rFonts w:ascii="Arial" w:hAnsi="Arial" w:cs="Arial"/>
-        </w:rPr>
-        <w:t>tricount</w:t>
-      </w:r>
-      <w:proofErr w:type="spellEnd"/>
-      <w:r>
-        <w:rPr>
-          <w:rFonts w:ascii="Arial" w:hAnsi="Arial" w:cs="Arial"/>
-        </w:rPr>
-        <w:t xml:space="preserve"> que es una </w:t>
+        <w:t xml:space="preserve"> como tricount que es una </w:t>
       </w:r>
       <w:proofErr w:type="gramStart"/>
       <w:r>
@@ -5474,21 +5420,7 @@
         <w:rPr>
           <w:rFonts w:ascii="Arial" w:hAnsi="Arial" w:cs="Arial"/>
         </w:rPr>
-        <w:t xml:space="preserve"> </w:t>
-      </w:r>
-      <w:proofErr w:type="spellStart"/>
-      <w:r>
-        <w:rPr>
-          <w:rFonts w:ascii="Arial" w:hAnsi="Arial" w:cs="Arial"/>
-        </w:rPr>
-        <w:t>Monefy</w:t>
-      </w:r>
-      <w:proofErr w:type="spellEnd"/>
-      <w:r>
-        <w:rPr>
-          <w:rFonts w:ascii="Arial" w:hAnsi="Arial" w:cs="Arial"/>
-        </w:rPr>
-        <w:t xml:space="preserve">, estas </w:t>
+        <w:t xml:space="preserve"> Monefy, estas </w:t>
       </w:r>
       <w:proofErr w:type="gramStart"/>
       <w:r>
@@ -5502,21 +5434,7 @@
         <w:rPr>
           <w:rFonts w:ascii="Arial" w:hAnsi="Arial" w:cs="Arial"/>
         </w:rPr>
-        <w:t xml:space="preserve"> tienen grandes equipos de desarrollo detrás además de un </w:t>
-      </w:r>
-      <w:proofErr w:type="spellStart"/>
-      <w:r>
-        <w:rPr>
-          <w:rFonts w:ascii="Arial" w:hAnsi="Arial" w:cs="Arial"/>
-        </w:rPr>
-        <w:t>moton</w:t>
-      </w:r>
-      <w:proofErr w:type="spellEnd"/>
-      <w:r>
-        <w:rPr>
-          <w:rFonts w:ascii="Arial" w:hAnsi="Arial" w:cs="Arial"/>
-        </w:rPr>
-        <w:t xml:space="preserve"> de funcionalidades después de varios años de desarrollo, </w:t>
+        <w:t xml:space="preserve"> tienen grandes equipos de desarrollo detrás además de un moton de funcionalidades después de varios años de desarrollo, </w:t>
       </w:r>
       <w:r>
         <w:rPr>
@@ -5658,49 +5576,7 @@
         <w:rPr>
           <w:rFonts w:ascii="Arial" w:hAnsi="Arial" w:cs="Arial"/>
         </w:rPr>
-        <w:t xml:space="preserve">en este campo es muy complicado destacar ya que hay mucha competencia, pero muchas veces solo </w:t>
-      </w:r>
-      <w:proofErr w:type="spellStart"/>
-      <w:r>
-        <w:rPr>
-          <w:rFonts w:ascii="Arial" w:hAnsi="Arial" w:cs="Arial"/>
-        </w:rPr>
-        <w:t>vasta</w:t>
-      </w:r>
-      <w:proofErr w:type="spellEnd"/>
-      <w:r>
-        <w:rPr>
-          <w:rFonts w:ascii="Arial" w:hAnsi="Arial" w:cs="Arial"/>
-        </w:rPr>
-        <w:t xml:space="preserve"> con hacerte ver </w:t>
-      </w:r>
-      <w:proofErr w:type="spellStart"/>
-      <w:r>
-        <w:rPr>
-          <w:rFonts w:ascii="Arial" w:hAnsi="Arial" w:cs="Arial"/>
-        </w:rPr>
-        <w:t>mas</w:t>
-      </w:r>
-      <w:proofErr w:type="spellEnd"/>
-      <w:r>
-        <w:rPr>
-          <w:rFonts w:ascii="Arial" w:hAnsi="Arial" w:cs="Arial"/>
-        </w:rPr>
-        <w:t xml:space="preserve"> que los demás. Por esto mismo cuanto tenga mi proyecto terminado muy probablemente contacte con varios “</w:t>
-      </w:r>
-      <w:proofErr w:type="spellStart"/>
-      <w:r>
-        <w:rPr>
-          <w:rFonts w:ascii="Arial" w:hAnsi="Arial" w:cs="Arial"/>
-        </w:rPr>
-        <w:t>influencers</w:t>
-      </w:r>
-      <w:proofErr w:type="spellEnd"/>
-      <w:r>
-        <w:rPr>
-          <w:rFonts w:ascii="Arial" w:hAnsi="Arial" w:cs="Arial"/>
-        </w:rPr>
-        <w:t>” para darme a conocer y así poder ayudar a algunas personas a mejorar su vida económica.</w:t>
+        <w:t>en este campo es muy complicado destacar ya que hay mucha competencia, pero muchas veces solo vasta con hacerte ver mas que los demás. Por esto mismo cuanto tenga mi proyecto terminado muy probablemente contacte con varios “influencers” para darme a conocer y así poder ayudar a algunas personas a mejorar su vida económica.</w:t>
       </w:r>
     </w:p>
     <w:p>
@@ -5945,35 +5821,7 @@
         <w:rPr>
           <w:rFonts w:ascii="Arial" w:hAnsi="Arial" w:cs="Arial"/>
         </w:rPr>
-        <w:t xml:space="preserve">para alcanzar este logro hare uso de algunos </w:t>
-      </w:r>
-      <w:proofErr w:type="spellStart"/>
-      <w:r>
-        <w:rPr>
-          <w:rFonts w:ascii="Arial" w:hAnsi="Arial" w:cs="Arial"/>
-        </w:rPr>
-        <w:t>frameworks</w:t>
-      </w:r>
-      <w:proofErr w:type="spellEnd"/>
-      <w:r>
-        <w:rPr>
-          <w:rFonts w:ascii="Arial" w:hAnsi="Arial" w:cs="Arial"/>
-        </w:rPr>
-        <w:t xml:space="preserve"> y componentes para facilitar mi trabajo y al final obtener un producto </w:t>
-      </w:r>
-      <w:proofErr w:type="spellStart"/>
-      <w:r>
-        <w:rPr>
-          <w:rFonts w:ascii="Arial" w:hAnsi="Arial" w:cs="Arial"/>
-        </w:rPr>
-        <w:t>mas</w:t>
-      </w:r>
-      <w:proofErr w:type="spellEnd"/>
-      <w:r>
-        <w:rPr>
-          <w:rFonts w:ascii="Arial" w:hAnsi="Arial" w:cs="Arial"/>
-        </w:rPr>
-        <w:t xml:space="preserve"> profesional el menos tiempo ya que </w:t>
+        <w:t xml:space="preserve">para alcanzar este logro hare uso de algunos frameworks y componentes para facilitar mi trabajo y al final obtener un producto mas profesional el menos tiempo ya que </w:t>
       </w:r>
       <w:r>
         <w:rPr>
@@ -5993,21 +5841,7 @@
         <w:rPr>
           <w:rFonts w:ascii="Arial" w:hAnsi="Arial" w:cs="Arial"/>
         </w:rPr>
-        <w:t xml:space="preserve">Algunas posibles mejoras o </w:t>
-      </w:r>
-      <w:proofErr w:type="spellStart"/>
-      <w:r>
-        <w:rPr>
-          <w:rFonts w:ascii="Arial" w:hAnsi="Arial" w:cs="Arial"/>
-        </w:rPr>
-        <w:t>upgrades</w:t>
-      </w:r>
-      <w:proofErr w:type="spellEnd"/>
-      <w:r>
-        <w:rPr>
-          <w:rFonts w:ascii="Arial" w:hAnsi="Arial" w:cs="Arial"/>
-        </w:rPr>
-        <w:t xml:space="preserve"> sobre la base de la aplicación pueden ser:</w:t>
+        <w:t>Algunas posibles mejoras o upgrades sobre la base de la aplicación pueden ser:</w:t>
       </w:r>
     </w:p>
     <w:p>
@@ -6034,16 +5868,15 @@
           <w:b/>
           <w:bCs/>
         </w:rPr>
-        <w:t xml:space="preserve">servicio de </w:t>
-      </w:r>
-      <w:proofErr w:type="spellStart"/>
+        <w:t>servicio de ma</w:t>
+      </w:r>
       <w:r>
         <w:rPr>
           <w:rFonts w:ascii="Arial" w:hAnsi="Arial" w:cs="Arial"/>
           <w:b/>
           <w:bCs/>
         </w:rPr>
-        <w:t>ma</w:t>
+        <w:t>i</w:t>
       </w:r>
       <w:r>
         <w:rPr>
@@ -6051,17 +5884,8 @@
           <w:b/>
           <w:bCs/>
         </w:rPr>
-        <w:t>i</w:t>
-      </w:r>
-      <w:r>
-        <w:rPr>
-          <w:rFonts w:ascii="Arial" w:hAnsi="Arial" w:cs="Arial"/>
-          <w:b/>
-          <w:bCs/>
-        </w:rPr>
         <w:t>ling</w:t>
       </w:r>
-      <w:proofErr w:type="spellEnd"/>
       <w:r>
         <w:rPr>
           <w:rFonts w:ascii="Arial" w:hAnsi="Arial" w:cs="Arial"/>
@@ -6072,21 +5896,7 @@
         <w:rPr>
           <w:rFonts w:ascii="Arial" w:hAnsi="Arial" w:cs="Arial"/>
         </w:rPr>
-        <w:t xml:space="preserve"> y evitando de esta manera duplicados y </w:t>
-      </w:r>
-      <w:proofErr w:type="spellStart"/>
-      <w:r>
-        <w:rPr>
-          <w:rFonts w:ascii="Arial" w:hAnsi="Arial" w:cs="Arial"/>
-        </w:rPr>
-        <w:t>multicuentas</w:t>
-      </w:r>
-      <w:proofErr w:type="spellEnd"/>
-      <w:r>
-        <w:rPr>
-          <w:rFonts w:ascii="Arial" w:hAnsi="Arial" w:cs="Arial"/>
-        </w:rPr>
-        <w:t>.</w:t>
+        <w:t xml:space="preserve"> y evitando de esta manera duplicados y multicuentas.</w:t>
       </w:r>
     </w:p>
     <w:p>
@@ -6113,18 +5923,8 @@
           <w:b/>
           <w:bCs/>
         </w:rPr>
-        <w:t xml:space="preserve">dominio </w:t>
-      </w:r>
-      <w:proofErr w:type="spellStart"/>
-      <w:r>
-        <w:rPr>
-          <w:rFonts w:ascii="Arial" w:hAnsi="Arial" w:cs="Arial"/>
-          <w:b/>
-          <w:bCs/>
-        </w:rPr>
-        <w:t>publico</w:t>
-      </w:r>
-      <w:proofErr w:type="spellEnd"/>
+        <w:t>dominio publico</w:t>
+      </w:r>
       <w:r>
         <w:rPr>
           <w:rFonts w:ascii="Arial" w:hAnsi="Arial" w:cs="Arial"/>
@@ -6137,20 +5937,12 @@
         </w:rPr>
         <w:t xml:space="preserve">servidor (de preferencia </w:t>
       </w:r>
-      <w:proofErr w:type="spellStart"/>
       <w:proofErr w:type="gramStart"/>
       <w:r>
         <w:rPr>
           <w:rFonts w:ascii="Arial" w:hAnsi="Arial" w:cs="Arial"/>
         </w:rPr>
-        <w:t>vercel</w:t>
-      </w:r>
-      <w:proofErr w:type="spellEnd"/>
-      <w:r>
-        <w:rPr>
-          <w:rFonts w:ascii="Arial" w:hAnsi="Arial" w:cs="Arial"/>
-        </w:rPr>
-        <w:t xml:space="preserve"> )</w:t>
+        <w:t>vercel )</w:t>
       </w:r>
       <w:proofErr w:type="gramEnd"/>
     </w:p>
@@ -6172,7 +5964,6 @@
         </w:rPr>
         <w:t xml:space="preserve">El uso de </w:t>
       </w:r>
-      <w:proofErr w:type="spellStart"/>
       <w:r>
         <w:rPr>
           <w:rFonts w:ascii="Arial" w:hAnsi="Arial" w:cs="Arial"/>
@@ -6181,7 +5972,6 @@
         </w:rPr>
         <w:t>frameworks</w:t>
       </w:r>
-      <w:proofErr w:type="spellEnd"/>
       <w:r>
         <w:rPr>
           <w:rFonts w:ascii="Arial" w:hAnsi="Arial" w:cs="Arial"/>
@@ -6213,7 +6003,6 @@
         </w:rPr>
         <w:t xml:space="preserve">El uso de </w:t>
       </w:r>
-      <w:proofErr w:type="spellStart"/>
       <w:r>
         <w:rPr>
           <w:rFonts w:ascii="Arial" w:hAnsi="Arial" w:cs="Arial"/>
@@ -6222,7 +6011,6 @@
         </w:rPr>
         <w:t>react</w:t>
       </w:r>
-      <w:proofErr w:type="spellEnd"/>
       <w:r>
         <w:rPr>
           <w:rFonts w:ascii="Arial" w:hAnsi="Arial" w:cs="Arial"/>
@@ -6334,45 +6122,13 @@
           <w:b/>
           <w:bCs/>
         </w:rPr>
-        <w:t xml:space="preserve"> </w:t>
-      </w:r>
-      <w:proofErr w:type="spellStart"/>
-      <w:r>
-        <w:rPr>
-          <w:rFonts w:ascii="Arial" w:hAnsi="Arial" w:cs="Arial"/>
-          <w:b/>
-          <w:bCs/>
-        </w:rPr>
-        <w:t>ia</w:t>
-      </w:r>
-      <w:proofErr w:type="spellEnd"/>
-      <w:r>
-        <w:rPr>
-          <w:rFonts w:ascii="Arial" w:hAnsi="Arial" w:cs="Arial"/>
-          <w:b/>
-          <w:bCs/>
-        </w:rPr>
-        <w:t xml:space="preserve"> </w:t>
-      </w:r>
-      <w:r>
-        <w:rPr>
-          <w:rFonts w:ascii="Arial" w:hAnsi="Arial" w:cs="Arial"/>
-        </w:rPr>
-        <w:t xml:space="preserve">para la predicción de los gastos (muy improbable por un tema </w:t>
-      </w:r>
-      <w:proofErr w:type="spellStart"/>
-      <w:r>
-        <w:rPr>
-          <w:rFonts w:ascii="Arial" w:hAnsi="Arial" w:cs="Arial"/>
-        </w:rPr>
-        <w:t>economico</w:t>
-      </w:r>
-      <w:proofErr w:type="spellEnd"/>
-      <w:r>
-        <w:rPr>
-          <w:rFonts w:ascii="Arial" w:hAnsi="Arial" w:cs="Arial"/>
-        </w:rPr>
-        <w:t>)</w:t>
+        <w:t xml:space="preserve"> ia </w:t>
+      </w:r>
+      <w:r>
+        <w:rPr>
+          <w:rFonts w:ascii="Arial" w:hAnsi="Arial" w:cs="Arial"/>
+        </w:rPr>
+        <w:t>para la predicción de los gastos (muy improbable por un tema economico)</w:t>
       </w:r>
     </w:p>
     <w:p>
@@ -6386,21 +6142,7 @@
         <w:rPr>
           <w:rFonts w:ascii="Arial" w:hAnsi="Arial" w:cs="Arial"/>
         </w:rPr>
-        <w:t xml:space="preserve">Estos </w:t>
-      </w:r>
-      <w:proofErr w:type="spellStart"/>
-      <w:r>
-        <w:rPr>
-          <w:rFonts w:ascii="Arial" w:hAnsi="Arial" w:cs="Arial"/>
-        </w:rPr>
-        <w:t>upgrades</w:t>
-      </w:r>
-      <w:proofErr w:type="spellEnd"/>
-      <w:r>
-        <w:rPr>
-          <w:rFonts w:ascii="Arial" w:hAnsi="Arial" w:cs="Arial"/>
-        </w:rPr>
-        <w:t xml:space="preserve"> se entiende que son promesas a futuro </w:t>
+        <w:t xml:space="preserve">Estos upgrades se entiende que son promesas a futuro </w:t>
       </w:r>
       <w:r>
         <w:rPr>
@@ -6599,36 +6341,8 @@
           <w:b/>
           <w:bCs/>
         </w:rPr>
-        <w:t xml:space="preserve">visual </w:t>
-      </w:r>
-      <w:proofErr w:type="spellStart"/>
-      <w:r>
-        <w:rPr>
-          <w:rFonts w:ascii="Arial" w:hAnsi="Arial" w:cs="Arial"/>
-          <w:b/>
-          <w:bCs/>
-        </w:rPr>
-        <w:t>studio</w:t>
-      </w:r>
-      <w:proofErr w:type="spellEnd"/>
-      <w:r>
-        <w:rPr>
-          <w:rFonts w:ascii="Arial" w:hAnsi="Arial" w:cs="Arial"/>
-          <w:b/>
-          <w:bCs/>
-        </w:rPr>
-        <w:t xml:space="preserve"> </w:t>
-      </w:r>
-      <w:proofErr w:type="spellStart"/>
-      <w:r>
-        <w:rPr>
-          <w:rFonts w:ascii="Arial" w:hAnsi="Arial" w:cs="Arial"/>
-          <w:b/>
-          <w:bCs/>
-        </w:rPr>
-        <w:t>code</w:t>
-      </w:r>
-      <w:proofErr w:type="spellEnd"/>
+        <w:t>visual studio code</w:t>
+      </w:r>
       <w:r>
         <w:rPr>
           <w:rFonts w:ascii="Arial" w:hAnsi="Arial" w:cs="Arial"/>
@@ -6744,106 +6458,30 @@
         </w:rPr>
         <w:t xml:space="preserve">aplicación: </w:t>
       </w:r>
-      <w:proofErr w:type="spellStart"/>
       <w:r>
         <w:rPr>
           <w:rFonts w:ascii="Arial" w:hAnsi="Arial" w:cs="Arial"/>
           <w:b/>
           <w:bCs/>
         </w:rPr>
-        <w:t>nodejs</w:t>
-      </w:r>
-      <w:proofErr w:type="spellEnd"/>
+        <w:t xml:space="preserve">nodejs, </w:t>
+      </w:r>
       <w:r>
         <w:rPr>
           <w:rFonts w:ascii="Arial" w:hAnsi="Arial" w:cs="Arial"/>
           <w:b/>
           <w:bCs/>
         </w:rPr>
-        <w:t xml:space="preserve">, </w:t>
-      </w:r>
-      <w:proofErr w:type="spellStart"/>
+        <w:t xml:space="preserve">nextjs, </w:t>
+      </w:r>
       <w:r>
         <w:rPr>
           <w:rFonts w:ascii="Arial" w:hAnsi="Arial" w:cs="Arial"/>
           <w:b/>
           <w:bCs/>
         </w:rPr>
-        <w:t>nextjs</w:t>
-      </w:r>
-      <w:proofErr w:type="spellEnd"/>
-      <w:r>
-        <w:rPr>
-          <w:rFonts w:ascii="Arial" w:hAnsi="Arial" w:cs="Arial"/>
-          <w:b/>
-          <w:bCs/>
-        </w:rPr>
-        <w:t xml:space="preserve">, </w:t>
-      </w:r>
-      <w:proofErr w:type="spellStart"/>
-      <w:r>
-        <w:rPr>
-          <w:rFonts w:ascii="Arial" w:hAnsi="Arial" w:cs="Arial"/>
-          <w:b/>
-          <w:bCs/>
-        </w:rPr>
-        <w:t>react</w:t>
-      </w:r>
-      <w:proofErr w:type="spellEnd"/>
-      <w:r>
-        <w:rPr>
-          <w:rFonts w:ascii="Arial" w:hAnsi="Arial" w:cs="Arial"/>
-          <w:b/>
-          <w:bCs/>
-        </w:rPr>
-        <w:t xml:space="preserve">, </w:t>
-      </w:r>
-      <w:proofErr w:type="spellStart"/>
-      <w:r>
-        <w:rPr>
-          <w:rFonts w:ascii="Arial" w:hAnsi="Arial" w:cs="Arial"/>
-          <w:b/>
-          <w:bCs/>
-        </w:rPr>
-        <w:t>javascript</w:t>
-      </w:r>
-      <w:proofErr w:type="spellEnd"/>
-      <w:r>
-        <w:rPr>
-          <w:rFonts w:ascii="Arial" w:hAnsi="Arial" w:cs="Arial"/>
-          <w:b/>
-          <w:bCs/>
-        </w:rPr>
-        <w:t xml:space="preserve">, </w:t>
-      </w:r>
-      <w:proofErr w:type="spellStart"/>
-      <w:r>
-        <w:rPr>
-          <w:rFonts w:ascii="Arial" w:hAnsi="Arial" w:cs="Arial"/>
-          <w:b/>
-          <w:bCs/>
-        </w:rPr>
-        <w:t>html</w:t>
-      </w:r>
-      <w:proofErr w:type="spellEnd"/>
-      <w:r>
-        <w:rPr>
-          <w:rFonts w:ascii="Arial" w:hAnsi="Arial" w:cs="Arial"/>
-          <w:b/>
-          <w:bCs/>
-        </w:rPr>
-        <w:t xml:space="preserve"> y </w:t>
-      </w:r>
-      <w:proofErr w:type="spellStart"/>
-      <w:r>
-        <w:rPr>
-          <w:rFonts w:ascii="Arial" w:hAnsi="Arial" w:cs="Arial"/>
-          <w:b/>
-          <w:bCs/>
-        </w:rPr>
-        <w:t>css</w:t>
-      </w:r>
-      <w:proofErr w:type="spellEnd"/>
+        <w:t>react, javascript, html y css</w:t>
+      </w:r>
       <w:r>
         <w:rPr>
           <w:rFonts w:ascii="Arial" w:hAnsi="Arial" w:cs="Arial"/>
@@ -7354,21 +6992,7 @@
         <w:rPr>
           <w:rFonts w:ascii="Arial" w:hAnsi="Arial" w:cs="Arial"/>
         </w:rPr>
-        <w:t xml:space="preserve"> </w:t>
-      </w:r>
-      <w:proofErr w:type="spellStart"/>
-      <w:r>
-        <w:rPr>
-          <w:rFonts w:ascii="Arial" w:hAnsi="Arial" w:cs="Arial"/>
-        </w:rPr>
-        <w:t>y</w:t>
-      </w:r>
-      <w:proofErr w:type="spellEnd"/>
-      <w:r>
-        <w:rPr>
-          <w:rFonts w:ascii="Arial" w:hAnsi="Arial" w:cs="Arial"/>
-        </w:rPr>
-        <w:t xml:space="preserve"> inspiración artística </w:t>
+        <w:t xml:space="preserve"> y inspiración artística </w:t>
       </w:r>
       <w:r>
         <w:rPr>
@@ -7400,7 +7024,6 @@
         </w:rPr>
         <w:t xml:space="preserve"> y </w:t>
       </w:r>
-      <w:proofErr w:type="spellStart"/>
       <w:r>
         <w:rPr>
           <w:rFonts w:ascii="Arial" w:hAnsi="Arial" w:cs="Arial"/>
@@ -7409,7 +7032,6 @@
         </w:rPr>
         <w:t>ninjamok</w:t>
       </w:r>
-      <w:proofErr w:type="spellEnd"/>
       <w:r>
         <w:rPr>
           <w:rFonts w:ascii="Arial" w:hAnsi="Arial" w:cs="Arial"/>
@@ -7492,7 +7114,7 @@
           <w:noProof/>
         </w:rPr>
         <w:drawing>
-          <wp:inline distT="0" distB="0" distL="0" distR="0" wp14:anchorId="27328E49" wp14:editId="2FF6F6A5">
+          <wp:inline distT="0" distB="0" distL="0" distR="0" wp14:anchorId="27328E49" wp14:editId="71C05E4B">
             <wp:extent cx="620725" cy="620725"/>
             <wp:effectExtent l="0" t="0" r="8255" b="8255"/>
             <wp:docPr id="86521544" name="Imagen 19" descr="Ninjamock | LinkedIn"/>
@@ -7608,21 +7230,7 @@
         <w:rPr>
           <w:rFonts w:ascii="Arial" w:hAnsi="Arial" w:cs="Arial"/>
         </w:rPr>
-        <w:t xml:space="preserve">Para ejecutar </w:t>
-      </w:r>
-      <w:proofErr w:type="spellStart"/>
-      <w:r>
-        <w:rPr>
-          <w:rFonts w:ascii="Arial" w:hAnsi="Arial" w:cs="Arial"/>
-        </w:rPr>
-        <w:t>nodejs</w:t>
-      </w:r>
-      <w:proofErr w:type="spellEnd"/>
-      <w:r>
-        <w:rPr>
-          <w:rFonts w:ascii="Arial" w:hAnsi="Arial" w:cs="Arial"/>
-        </w:rPr>
-        <w:t xml:space="preserve"> y tener un proyecto portable </w:t>
+        <w:t xml:space="preserve">Para ejecutar nodejs y tener un proyecto portable </w:t>
       </w:r>
       <w:r>
         <w:rPr>
@@ -7711,7 +7319,6 @@
         </w:rPr>
         <w:t xml:space="preserve">Para el versionado </w:t>
       </w:r>
-      <w:proofErr w:type="spellStart"/>
       <w:r>
         <w:rPr>
           <w:rFonts w:ascii="Arial" w:hAnsi="Arial" w:cs="Arial"/>
@@ -7720,14 +7327,12 @@
         </w:rPr>
         <w:t>git</w:t>
       </w:r>
-      <w:proofErr w:type="spellEnd"/>
       <w:r>
         <w:rPr>
           <w:rFonts w:ascii="Arial" w:hAnsi="Arial" w:cs="Arial"/>
         </w:rPr>
         <w:t xml:space="preserve"> y </w:t>
       </w:r>
-      <w:proofErr w:type="spellStart"/>
       <w:r>
         <w:rPr>
           <w:rFonts w:ascii="Arial" w:hAnsi="Arial" w:cs="Arial"/>
@@ -7736,7 +7341,6 @@
         </w:rPr>
         <w:t>github</w:t>
       </w:r>
-      <w:proofErr w:type="spellEnd"/>
       <w:r>
         <w:rPr>
           <w:rFonts w:ascii="Arial" w:hAnsi="Arial" w:cs="Arial"/>
@@ -8020,35 +7624,7 @@
         <w:rPr>
           <w:rFonts w:ascii="Arial" w:hAnsi="Arial" w:cs="Arial"/>
         </w:rPr>
-        <w:t xml:space="preserve">Next.js y </w:t>
-      </w:r>
-      <w:proofErr w:type="spellStart"/>
-      <w:r>
-        <w:rPr>
-          <w:rFonts w:ascii="Arial" w:hAnsi="Arial" w:cs="Arial"/>
-        </w:rPr>
-        <w:t>React</w:t>
-      </w:r>
-      <w:proofErr w:type="spellEnd"/>
-      <w:r>
-        <w:rPr>
-          <w:rFonts w:ascii="Arial" w:hAnsi="Arial" w:cs="Arial"/>
-        </w:rPr>
-        <w:t xml:space="preserve"> para el </w:t>
-      </w:r>
-      <w:proofErr w:type="spellStart"/>
-      <w:r>
-        <w:rPr>
-          <w:rFonts w:ascii="Arial" w:hAnsi="Arial" w:cs="Arial"/>
-        </w:rPr>
-        <w:t>frontend</w:t>
-      </w:r>
-      <w:proofErr w:type="spellEnd"/>
-      <w:r>
-        <w:rPr>
-          <w:rFonts w:ascii="Arial" w:hAnsi="Arial" w:cs="Arial"/>
-        </w:rPr>
-        <w:t>, Node.js para la lógica del servidor y MySQL como base de datos. El entorno corre sobre Docker, lo que garantiza que el proyecto sea portable y funcione igual en cualquier máquina, facilitando tanto el desarrollo como un posible despliegue futuro en un dominio público, preferiblemente en</w:t>
+        <w:t>Next.js y React para el frontend, Node.js para la lógica del servidor y MySQL como base de datos. El entorno corre sobre Docker, lo que garantiza que el proyecto sea portable y funcione igual en cualquier máquina, facilitando tanto el desarrollo como un posible despliegue futuro en un dominio público, preferiblemente en</w:t>
       </w:r>
       <w:r>
         <w:rPr>
@@ -8060,21 +7636,7 @@
         <w:rPr>
           <w:rFonts w:ascii="Arial" w:hAnsi="Arial" w:cs="Arial"/>
         </w:rPr>
-        <w:t xml:space="preserve"> </w:t>
-      </w:r>
-      <w:proofErr w:type="spellStart"/>
-      <w:r>
-        <w:rPr>
-          <w:rFonts w:ascii="Arial" w:hAnsi="Arial" w:cs="Arial"/>
-        </w:rPr>
-        <w:t>Vercel</w:t>
-      </w:r>
-      <w:proofErr w:type="spellEnd"/>
-      <w:r>
-        <w:rPr>
-          <w:rFonts w:ascii="Arial" w:hAnsi="Arial" w:cs="Arial"/>
-        </w:rPr>
-        <w:t>.</w:t>
+        <w:t xml:space="preserve"> Vercel.</w:t>
       </w:r>
     </w:p>
     <w:p>
@@ -8152,35 +7714,7 @@
         <w:rPr>
           <w:rFonts w:ascii="Arial" w:hAnsi="Arial" w:cs="Arial"/>
         </w:rPr>
-        <w:t xml:space="preserve">El navegador del usuario, que es el punto de entrada a la aplicación a través del </w:t>
-      </w:r>
-      <w:proofErr w:type="spellStart"/>
-      <w:r>
-        <w:rPr>
-          <w:rFonts w:ascii="Arial" w:hAnsi="Arial" w:cs="Arial"/>
-        </w:rPr>
-        <w:t>frontend</w:t>
-      </w:r>
-      <w:proofErr w:type="spellEnd"/>
-      <w:r>
-        <w:rPr>
-          <w:rFonts w:ascii="Arial" w:hAnsi="Arial" w:cs="Arial"/>
-        </w:rPr>
-        <w:t xml:space="preserve"> construido con Next.js y </w:t>
-      </w:r>
-      <w:proofErr w:type="spellStart"/>
-      <w:r>
-        <w:rPr>
-          <w:rFonts w:ascii="Arial" w:hAnsi="Arial" w:cs="Arial"/>
-        </w:rPr>
-        <w:t>React</w:t>
-      </w:r>
-      <w:proofErr w:type="spellEnd"/>
-      <w:r>
-        <w:rPr>
-          <w:rFonts w:ascii="Arial" w:hAnsi="Arial" w:cs="Arial"/>
-        </w:rPr>
-        <w:t>.</w:t>
+        <w:t>El navegador del usuario, que es el punto de entrada a la aplicación a través del frontend construido con Next.js y React.</w:t>
       </w:r>
     </w:p>
     <w:p>
@@ -8277,21 +7811,7 @@
         <w:rPr>
           <w:rFonts w:ascii="Arial" w:hAnsi="Arial" w:cs="Arial"/>
         </w:rPr>
-        <w:t xml:space="preserve"> limitado claramente desde el punto de vista de la gestión de activos en tiempo real, como por ejemplo la gestión de acciones, </w:t>
-      </w:r>
-      <w:proofErr w:type="spellStart"/>
-      <w:r>
-        <w:rPr>
-          <w:rFonts w:ascii="Arial" w:hAnsi="Arial" w:cs="Arial"/>
-        </w:rPr>
-        <w:t>criptos</w:t>
-      </w:r>
-      <w:proofErr w:type="spellEnd"/>
-      <w:r>
-        <w:rPr>
-          <w:rFonts w:ascii="Arial" w:hAnsi="Arial" w:cs="Arial"/>
-        </w:rPr>
-        <w:t xml:space="preserve"> o </w:t>
+        <w:t xml:space="preserve"> limitado claramente desde el punto de vista de la gestión de activos en tiempo real, como por ejemplo la gestión de acciones, criptos o </w:t>
       </w:r>
       <w:r>
         <w:rPr>
@@ -8311,21 +7831,7 @@
         <w:rPr>
           <w:rFonts w:ascii="Arial" w:hAnsi="Arial" w:cs="Arial"/>
         </w:rPr>
-        <w:t xml:space="preserve"> valor de manera </w:t>
-      </w:r>
-      <w:proofErr w:type="spellStart"/>
-      <w:r>
-        <w:rPr>
-          <w:rFonts w:ascii="Arial" w:hAnsi="Arial" w:cs="Arial"/>
-        </w:rPr>
-        <w:t>semialeatoria</w:t>
-      </w:r>
-      <w:proofErr w:type="spellEnd"/>
-      <w:r>
-        <w:rPr>
-          <w:rFonts w:ascii="Arial" w:hAnsi="Arial" w:cs="Arial"/>
-        </w:rPr>
-        <w:t xml:space="preserve"> y es imposible predecirlos de cara al </w:t>
+        <w:t xml:space="preserve"> valor de manera semialeatoria y es imposible predecirlos de cara al </w:t>
       </w:r>
       <w:r>
         <w:rPr>
@@ -8496,19 +8002,11 @@
           <w:rFonts w:ascii="Arial" w:hAnsi="Arial" w:cs="Arial"/>
         </w:rPr>
       </w:pPr>
-      <w:proofErr w:type="spellStart"/>
-      <w:r>
-        <w:rPr>
-          <w:rFonts w:ascii="Arial" w:hAnsi="Arial" w:cs="Arial"/>
-        </w:rPr>
-        <w:t>Grafico</w:t>
-      </w:r>
-      <w:proofErr w:type="spellEnd"/>
-      <w:r>
-        <w:rPr>
-          <w:rFonts w:ascii="Arial" w:hAnsi="Arial" w:cs="Arial"/>
-        </w:rPr>
-        <w:t xml:space="preserve"> de evolución económica</w:t>
+      <w:r>
+        <w:rPr>
+          <w:rFonts w:ascii="Arial" w:hAnsi="Arial" w:cs="Arial"/>
+        </w:rPr>
+        <w:t>Grafico de evolución económica</w:t>
       </w:r>
     </w:p>
     <w:p>
@@ -8546,21 +8044,7 @@
         <w:rPr>
           <w:rFonts w:ascii="Arial" w:hAnsi="Arial" w:cs="Arial"/>
         </w:rPr>
-        <w:t>Añadir ingresos periódicos (</w:t>
-      </w:r>
-      <w:proofErr w:type="spellStart"/>
-      <w:r>
-        <w:rPr>
-          <w:rFonts w:ascii="Arial" w:hAnsi="Arial" w:cs="Arial"/>
-        </w:rPr>
-        <w:t>Ej</w:t>
-      </w:r>
-      <w:proofErr w:type="spellEnd"/>
-      <w:r>
-        <w:rPr>
-          <w:rFonts w:ascii="Arial" w:hAnsi="Arial" w:cs="Arial"/>
-        </w:rPr>
-        <w:t xml:space="preserve"> sueldo)</w:t>
+        <w:t>Añadir ingresos periódicos (Ej sueldo)</w:t>
       </w:r>
     </w:p>
     <w:p>
@@ -8617,49 +8101,7 @@
         <w:rPr>
           <w:rFonts w:ascii="Arial" w:hAnsi="Arial" w:cs="Arial"/>
         </w:rPr>
-        <w:t xml:space="preserve">aplicación son </w:t>
-      </w:r>
-      <w:proofErr w:type="spellStart"/>
-      <w:r>
-        <w:rPr>
-          <w:rFonts w:ascii="Arial" w:hAnsi="Arial" w:cs="Arial"/>
-        </w:rPr>
-        <w:t>admin</w:t>
-      </w:r>
-      <w:proofErr w:type="spellEnd"/>
-      <w:r>
-        <w:rPr>
-          <w:rFonts w:ascii="Arial" w:hAnsi="Arial" w:cs="Arial"/>
-        </w:rPr>
-        <w:t xml:space="preserve"> y usuario, también puede existir un usuario teórico que </w:t>
-      </w:r>
-      <w:proofErr w:type="spellStart"/>
-      <w:r>
-        <w:rPr>
-          <w:rFonts w:ascii="Arial" w:hAnsi="Arial" w:cs="Arial"/>
-        </w:rPr>
-        <w:t>seria</w:t>
-      </w:r>
-      <w:proofErr w:type="spellEnd"/>
-      <w:r>
-        <w:rPr>
-          <w:rFonts w:ascii="Arial" w:hAnsi="Arial" w:cs="Arial"/>
-        </w:rPr>
-        <w:t xml:space="preserve"> el </w:t>
-      </w:r>
-      <w:proofErr w:type="spellStart"/>
-      <w:r>
-        <w:rPr>
-          <w:rFonts w:ascii="Arial" w:hAnsi="Arial" w:cs="Arial"/>
-        </w:rPr>
-        <w:t>guest</w:t>
-      </w:r>
-      <w:proofErr w:type="spellEnd"/>
-      <w:r>
-        <w:rPr>
-          <w:rFonts w:ascii="Arial" w:hAnsi="Arial" w:cs="Arial"/>
-        </w:rPr>
-        <w:t xml:space="preserve"> que es un usuario que no ha iniciado sesión</w:t>
+        <w:t>aplicación son admin y usuario, también puede existir un usuario teórico que seria el guest que es un usuario que no ha iniciado sesión</w:t>
       </w:r>
     </w:p>
     <w:p>
@@ -8687,21 +8129,7 @@
         <w:rPr>
           <w:rFonts w:ascii="Arial" w:hAnsi="Arial" w:cs="Arial"/>
         </w:rPr>
-        <w:t xml:space="preserve"> en una tabla de </w:t>
-      </w:r>
-      <w:proofErr w:type="spellStart"/>
-      <w:r>
-        <w:rPr>
-          <w:rFonts w:ascii="Arial" w:hAnsi="Arial" w:cs="Arial"/>
-        </w:rPr>
-        <w:t>users</w:t>
-      </w:r>
-      <w:proofErr w:type="spellEnd"/>
-      <w:r>
-        <w:rPr>
-          <w:rFonts w:ascii="Arial" w:hAnsi="Arial" w:cs="Arial"/>
-        </w:rPr>
-        <w:t>.</w:t>
+        <w:t xml:space="preserve"> en una tabla de users.</w:t>
       </w:r>
     </w:p>
     <w:p>
@@ -8758,30 +8186,8 @@
         <w:rPr>
           <w:rFonts w:ascii="Arial" w:hAnsi="Arial" w:cs="Arial"/>
         </w:rPr>
-        <w:t xml:space="preserve">(panel web de inicio de sesión, </w:t>
-      </w:r>
-      <w:proofErr w:type="spellStart"/>
-      <w:r>
-        <w:rPr>
-          <w:rFonts w:ascii="Arial" w:hAnsi="Arial" w:cs="Arial"/>
-        </w:rPr>
-        <w:t>bd</w:t>
-      </w:r>
-      <w:proofErr w:type="spellEnd"/>
-      <w:r>
-        <w:rPr>
-          <w:rFonts w:ascii="Arial" w:hAnsi="Arial" w:cs="Arial"/>
-        </w:rPr>
-        <w:t xml:space="preserve">, rol de </w:t>
-      </w:r>
-      <w:proofErr w:type="spellStart"/>
-      <w:r>
-        <w:rPr>
-          <w:rFonts w:ascii="Arial" w:hAnsi="Arial" w:cs="Arial"/>
-        </w:rPr>
-        <w:t>admin</w:t>
-      </w:r>
-      <w:proofErr w:type="spellEnd"/>
+        <w:t>(panel web de inicio de sesión, bd, rol de admin</w:t>
+      </w:r>
       <w:r>
         <w:rPr>
           <w:rFonts w:ascii="Arial" w:hAnsi="Arial" w:cs="Arial"/>
@@ -8868,16 +8274,8 @@
         <w:rPr>
           <w:rFonts w:ascii="Arial" w:hAnsi="Arial" w:cs="Arial"/>
         </w:rPr>
-        <w:t xml:space="preserve"> estará alojada en un servidor de </w:t>
-      </w:r>
-      <w:proofErr w:type="spellStart"/>
-      <w:r>
-        <w:rPr>
-          <w:rFonts w:ascii="Arial" w:hAnsi="Arial" w:cs="Arial"/>
-        </w:rPr>
-        <w:t>vercel</w:t>
-      </w:r>
-      <w:proofErr w:type="spellEnd"/>
+        <w:t xml:space="preserve"> estará alojada en un servidor de vercel</w:t>
+      </w:r>
       <w:r>
         <w:rPr>
           <w:rFonts w:ascii="Arial" w:hAnsi="Arial" w:cs="Arial"/>
@@ -8901,41 +8299,13 @@
         <w:rPr>
           <w:rFonts w:ascii="Arial" w:hAnsi="Arial" w:cs="Arial"/>
         </w:rPr>
-        <w:t xml:space="preserve">El Docker </w:t>
-      </w:r>
-      <w:proofErr w:type="spellStart"/>
-      <w:r>
-        <w:rPr>
-          <w:rFonts w:ascii="Arial" w:hAnsi="Arial" w:cs="Arial"/>
-        </w:rPr>
-        <w:t>compose</w:t>
-      </w:r>
-      <w:proofErr w:type="spellEnd"/>
-      <w:r>
-        <w:rPr>
-          <w:rFonts w:ascii="Arial" w:hAnsi="Arial" w:cs="Arial"/>
-        </w:rPr>
-        <w:t xml:space="preserve"> </w:t>
-      </w:r>
-      <w:r>
-        <w:rPr>
-          <w:rFonts w:ascii="Arial" w:hAnsi="Arial" w:cs="Arial"/>
-        </w:rPr>
-        <w:t xml:space="preserve">y </w:t>
-      </w:r>
-      <w:proofErr w:type="spellStart"/>
-      <w:r>
-        <w:rPr>
-          <w:rFonts w:ascii="Arial" w:hAnsi="Arial" w:cs="Arial"/>
-        </w:rPr>
-        <w:t>Dockerfile</w:t>
-      </w:r>
-      <w:proofErr w:type="spellEnd"/>
-      <w:r>
-        <w:rPr>
-          <w:rFonts w:ascii="Arial" w:hAnsi="Arial" w:cs="Arial"/>
-        </w:rPr>
-        <w:t xml:space="preserve"> </w:t>
+        <w:t xml:space="preserve">El Docker compose </w:t>
+      </w:r>
+      <w:r>
+        <w:rPr>
+          <w:rFonts w:ascii="Arial" w:hAnsi="Arial" w:cs="Arial"/>
+        </w:rPr>
+        <w:t xml:space="preserve">y Dockerfile </w:t>
       </w:r>
       <w:r>
         <w:rPr>
@@ -8964,20 +8334,12 @@
           <w:rFonts w:ascii="Arial" w:hAnsi="Arial" w:cs="Arial"/>
         </w:rPr>
       </w:pPr>
-      <w:proofErr w:type="spellStart"/>
       <w:r>
         <w:rPr>
           <w:rFonts w:ascii="Arial" w:hAnsi="Arial" w:cs="Arial"/>
         </w:rPr>
         <w:lastRenderedPageBreak/>
-        <w:t>Compose</w:t>
-      </w:r>
-      <w:proofErr w:type="spellEnd"/>
-      <w:r>
-        <w:rPr>
-          <w:rFonts w:ascii="Arial" w:hAnsi="Arial" w:cs="Arial"/>
-        </w:rPr>
-        <w:t>:</w:t>
+        <w:t>Compose:</w:t>
       </w:r>
       <w:r>
         <w:rPr>
@@ -9083,19 +8445,11 @@
           <w:rFonts w:ascii="Arial" w:hAnsi="Arial" w:cs="Arial"/>
         </w:rPr>
       </w:pPr>
-      <w:proofErr w:type="spellStart"/>
-      <w:r>
-        <w:rPr>
-          <w:rFonts w:ascii="Arial" w:hAnsi="Arial" w:cs="Arial"/>
-        </w:rPr>
-        <w:t>Dokerfile</w:t>
-      </w:r>
-      <w:proofErr w:type="spellEnd"/>
-      <w:r>
-        <w:rPr>
-          <w:rFonts w:ascii="Arial" w:hAnsi="Arial" w:cs="Arial"/>
-        </w:rPr>
-        <w:t>:</w:t>
+      <w:r>
+        <w:rPr>
+          <w:rFonts w:ascii="Arial" w:hAnsi="Arial" w:cs="Arial"/>
+        </w:rPr>
+        <w:t>Dokerfile:</w:t>
       </w:r>
     </w:p>
     <w:p>
@@ -9159,23 +8513,7 @@
           <w:lang w:val="en-US"/>
         </w:rPr>
         <w:lastRenderedPageBreak/>
-        <w:t xml:space="preserve">Script </w:t>
-      </w:r>
-      <w:proofErr w:type="spellStart"/>
-      <w:r>
-        <w:rPr>
-          <w:rFonts w:ascii="Arial" w:hAnsi="Arial" w:cs="Arial"/>
-          <w:lang w:val="en-US"/>
-        </w:rPr>
-        <w:t>entrypoint</w:t>
-      </w:r>
-      <w:proofErr w:type="spellEnd"/>
-      <w:r>
-        <w:rPr>
-          <w:rFonts w:ascii="Arial" w:hAnsi="Arial" w:cs="Arial"/>
-          <w:lang w:val="en-US"/>
-        </w:rPr>
-        <w:t xml:space="preserve"> de auto </w:t>
+        <w:t xml:space="preserve">Script entrypoint de auto </w:t>
       </w:r>
       <w:proofErr w:type="gramStart"/>
       <w:r>
@@ -9263,133 +8601,7 @@
         <w:rPr>
           <w:rFonts w:ascii="Arial" w:hAnsi="Arial" w:cs="Arial"/>
         </w:rPr>
-        <w:t xml:space="preserve">Una vez descargado el </w:t>
-      </w:r>
-      <w:proofErr w:type="spellStart"/>
-      <w:r>
-        <w:rPr>
-          <w:rFonts w:ascii="Arial" w:hAnsi="Arial" w:cs="Arial"/>
-        </w:rPr>
-        <w:t>docker</w:t>
-      </w:r>
-      <w:proofErr w:type="spellEnd"/>
-      <w:r>
-        <w:rPr>
-          <w:rFonts w:ascii="Arial" w:hAnsi="Arial" w:cs="Arial"/>
-        </w:rPr>
-        <w:t xml:space="preserve"> </w:t>
-      </w:r>
-      <w:proofErr w:type="spellStart"/>
-      <w:r>
-        <w:rPr>
-          <w:rFonts w:ascii="Arial" w:hAnsi="Arial" w:cs="Arial"/>
-        </w:rPr>
-        <w:t>compose</w:t>
-      </w:r>
-      <w:proofErr w:type="spellEnd"/>
-      <w:r>
-        <w:rPr>
-          <w:rFonts w:ascii="Arial" w:hAnsi="Arial" w:cs="Arial"/>
-        </w:rPr>
-        <w:t xml:space="preserve"> con el proyecto que estará en </w:t>
-      </w:r>
-      <w:proofErr w:type="spellStart"/>
-      <w:r>
-        <w:rPr>
-          <w:rFonts w:ascii="Arial" w:hAnsi="Arial" w:cs="Arial"/>
-        </w:rPr>
-        <w:t>github</w:t>
-      </w:r>
-      <w:proofErr w:type="spellEnd"/>
-      <w:r>
-        <w:rPr>
-          <w:rFonts w:ascii="Arial" w:hAnsi="Arial" w:cs="Arial"/>
-        </w:rPr>
-        <w:t xml:space="preserve"> simplemente haciendo un </w:t>
-      </w:r>
-      <w:proofErr w:type="spellStart"/>
-      <w:r>
-        <w:rPr>
-          <w:rFonts w:ascii="Arial" w:hAnsi="Arial" w:cs="Arial"/>
-        </w:rPr>
-        <w:t>compose</w:t>
-      </w:r>
-      <w:proofErr w:type="spellEnd"/>
-      <w:r>
-        <w:rPr>
-          <w:rFonts w:ascii="Arial" w:hAnsi="Arial" w:cs="Arial"/>
-        </w:rPr>
-        <w:t xml:space="preserve"> up y ejecutando el script </w:t>
-      </w:r>
-      <w:proofErr w:type="spellStart"/>
-      <w:r>
-        <w:rPr>
-          <w:rFonts w:ascii="Arial" w:hAnsi="Arial" w:cs="Arial"/>
-        </w:rPr>
-        <w:t>sql</w:t>
-      </w:r>
-      <w:proofErr w:type="spellEnd"/>
-      <w:r>
-        <w:rPr>
-          <w:rFonts w:ascii="Arial" w:hAnsi="Arial" w:cs="Arial"/>
-        </w:rPr>
-        <w:t xml:space="preserve"> de la </w:t>
-      </w:r>
-      <w:proofErr w:type="spellStart"/>
-      <w:r>
-        <w:rPr>
-          <w:rFonts w:ascii="Arial" w:hAnsi="Arial" w:cs="Arial"/>
-        </w:rPr>
-        <w:t>bd</w:t>
-      </w:r>
-      <w:proofErr w:type="spellEnd"/>
-      <w:r>
-        <w:rPr>
-          <w:rFonts w:ascii="Arial" w:hAnsi="Arial" w:cs="Arial"/>
-        </w:rPr>
-        <w:t xml:space="preserve"> con el </w:t>
-      </w:r>
-      <w:proofErr w:type="spellStart"/>
-      <w:r>
-        <w:rPr>
-          <w:rFonts w:ascii="Arial" w:hAnsi="Arial" w:cs="Arial"/>
-        </w:rPr>
-        <w:t>php</w:t>
-      </w:r>
-      <w:proofErr w:type="spellEnd"/>
-      <w:r>
-        <w:rPr>
-          <w:rFonts w:ascii="Arial" w:hAnsi="Arial" w:cs="Arial"/>
-        </w:rPr>
-        <w:t xml:space="preserve"> </w:t>
-      </w:r>
-      <w:proofErr w:type="spellStart"/>
-      <w:r>
-        <w:rPr>
-          <w:rFonts w:ascii="Arial" w:hAnsi="Arial" w:cs="Arial"/>
-        </w:rPr>
-        <w:t>my</w:t>
-      </w:r>
-      <w:proofErr w:type="spellEnd"/>
-      <w:r>
-        <w:rPr>
-          <w:rFonts w:ascii="Arial" w:hAnsi="Arial" w:cs="Arial"/>
-        </w:rPr>
-        <w:t xml:space="preserve"> </w:t>
-      </w:r>
-      <w:proofErr w:type="spellStart"/>
-      <w:r>
-        <w:rPr>
-          <w:rFonts w:ascii="Arial" w:hAnsi="Arial" w:cs="Arial"/>
-        </w:rPr>
-        <w:t>admin</w:t>
-      </w:r>
-      <w:proofErr w:type="spellEnd"/>
-      <w:r>
-        <w:rPr>
-          <w:rFonts w:ascii="Arial" w:hAnsi="Arial" w:cs="Arial"/>
-        </w:rPr>
-        <w:t xml:space="preserve"> se debería </w:t>
+        <w:t xml:space="preserve">Una vez descargado el docker compose con el proyecto que estará en github simplemente haciendo un compose up y ejecutando el script sql de la bd con el php my admin se debería </w:t>
       </w:r>
       <w:r>
         <w:rPr>
@@ -9401,21 +8613,7 @@
         <w:rPr>
           <w:rFonts w:ascii="Arial" w:hAnsi="Arial" w:cs="Arial"/>
         </w:rPr>
-        <w:t xml:space="preserve"> </w:t>
-      </w:r>
-      <w:proofErr w:type="spellStart"/>
-      <w:r>
-        <w:rPr>
-          <w:rFonts w:ascii="Arial" w:hAnsi="Arial" w:cs="Arial"/>
-        </w:rPr>
-        <w:t>ql</w:t>
-      </w:r>
-      <w:proofErr w:type="spellEnd"/>
-      <w:r>
-        <w:rPr>
-          <w:rFonts w:ascii="Arial" w:hAnsi="Arial" w:cs="Arial"/>
-        </w:rPr>
-        <w:t xml:space="preserve"> 100% la </w:t>
+        <w:t xml:space="preserve"> ql 100% la </w:t>
       </w:r>
       <w:proofErr w:type="gramStart"/>
       <w:r>
@@ -9451,14 +8649,12 @@
         </w:rPr>
         <w:t xml:space="preserve">Incluso se pude valorar incluir un manual de </w:t>
       </w:r>
-      <w:proofErr w:type="spellStart"/>
       <w:r>
         <w:rPr>
           <w:rFonts w:ascii="Arial" w:hAnsi="Arial" w:cs="Arial"/>
         </w:rPr>
         <w:t>deploy</w:t>
       </w:r>
-      <w:proofErr w:type="spellEnd"/>
       <w:r>
         <w:rPr>
           <w:rFonts w:ascii="Arial" w:hAnsi="Arial" w:cs="Arial"/>
@@ -11507,33 +10703,7 @@
                 <w:lang w:eastAsia="es-ES"/>
                 <w14:ligatures w14:val="none"/>
               </w:rPr>
-              <w:t>Despliegue a producción (</w:t>
-            </w:r>
-            <w:proofErr w:type="spellStart"/>
-            <w:r>
-              <w:rPr>
-                <w:rFonts w:ascii="Arial" w:eastAsia="Times New Roman" w:hAnsi="Arial" w:cs="Arial"/>
-                <w:color w:val="000000"/>
-                <w:kern w:val="0"/>
-                <w:sz w:val="22"/>
-                <w:szCs w:val="22"/>
-                <w:lang w:eastAsia="es-ES"/>
-                <w14:ligatures w14:val="none"/>
-              </w:rPr>
-              <w:t>vps</w:t>
-            </w:r>
-            <w:proofErr w:type="spellEnd"/>
-            <w:r>
-              <w:rPr>
-                <w:rFonts w:ascii="Arial" w:eastAsia="Times New Roman" w:hAnsi="Arial" w:cs="Arial"/>
-                <w:color w:val="000000"/>
-                <w:kern w:val="0"/>
-                <w:sz w:val="22"/>
-                <w:szCs w:val="22"/>
-                <w:lang w:eastAsia="es-ES"/>
-                <w14:ligatures w14:val="none"/>
-              </w:rPr>
-              <w:t>)</w:t>
+              <w:t>Despliegue a producción (vps)</w:t>
             </w:r>
           </w:p>
         </w:tc>
@@ -11901,35 +11071,7 @@
         <w:rPr>
           <w:rFonts w:ascii="Arial" w:hAnsi="Arial" w:cs="Arial"/>
         </w:rPr>
-        <w:t>¿</w:t>
-      </w:r>
-      <w:proofErr w:type="spellStart"/>
-      <w:r>
-        <w:rPr>
-          <w:rFonts w:ascii="Arial" w:hAnsi="Arial" w:cs="Arial"/>
-        </w:rPr>
-        <w:t>Cuanto</w:t>
-      </w:r>
-      <w:proofErr w:type="spellEnd"/>
-      <w:r>
-        <w:rPr>
-          <w:rFonts w:ascii="Arial" w:hAnsi="Arial" w:cs="Arial"/>
-        </w:rPr>
-        <w:t xml:space="preserve"> podría costar mi </w:t>
-      </w:r>
-      <w:proofErr w:type="spellStart"/>
-      <w:r>
-        <w:rPr>
-          <w:rFonts w:ascii="Arial" w:hAnsi="Arial" w:cs="Arial"/>
-        </w:rPr>
-        <w:t>applicacion</w:t>
-      </w:r>
-      <w:proofErr w:type="spellEnd"/>
-      <w:r>
-        <w:rPr>
-          <w:rFonts w:ascii="Arial" w:hAnsi="Arial" w:cs="Arial"/>
-        </w:rPr>
-        <w:t>?</w:t>
+        <w:t>¿Cuanto podría costar mi applicacion?</w:t>
       </w:r>
     </w:p>
     <w:p>
@@ -11949,21 +11091,7 @@
         <w:rPr>
           <w:rFonts w:ascii="Arial" w:hAnsi="Arial" w:cs="Arial"/>
         </w:rPr>
-        <w:t xml:space="preserve">dependiendo de muchos factores el desarrollo puede durar </w:t>
-      </w:r>
-      <w:proofErr w:type="spellStart"/>
-      <w:r>
-        <w:rPr>
-          <w:rFonts w:ascii="Arial" w:hAnsi="Arial" w:cs="Arial"/>
-        </w:rPr>
-        <w:t>mas</w:t>
-      </w:r>
-      <w:proofErr w:type="spellEnd"/>
-      <w:r>
-        <w:rPr>
-          <w:rFonts w:ascii="Arial" w:hAnsi="Arial" w:cs="Arial"/>
-        </w:rPr>
-        <w:t xml:space="preserve"> o </w:t>
+        <w:t xml:space="preserve">dependiendo de muchos factores el desarrollo puede durar mas o </w:t>
       </w:r>
       <w:proofErr w:type="gramStart"/>
       <w:r>
@@ -11997,63 +11125,7 @@
         <w:rPr>
           <w:rFonts w:ascii="Arial" w:hAnsi="Arial" w:cs="Arial"/>
         </w:rPr>
-        <w:t xml:space="preserve">sobre </w:t>
-      </w:r>
-      <w:proofErr w:type="spellStart"/>
-      <w:r>
-        <w:rPr>
-          <w:rFonts w:ascii="Arial" w:hAnsi="Arial" w:cs="Arial"/>
-        </w:rPr>
-        <w:t>javascript</w:t>
-      </w:r>
-      <w:proofErr w:type="spellEnd"/>
-      <w:r>
-        <w:rPr>
-          <w:rFonts w:ascii="Arial" w:hAnsi="Arial" w:cs="Arial"/>
-        </w:rPr>
-        <w:t xml:space="preserve">, </w:t>
-      </w:r>
-      <w:proofErr w:type="spellStart"/>
-      <w:r>
-        <w:rPr>
-          <w:rFonts w:ascii="Arial" w:hAnsi="Arial" w:cs="Arial"/>
-        </w:rPr>
-        <w:t>typescript</w:t>
-      </w:r>
-      <w:proofErr w:type="spellEnd"/>
-      <w:r>
-        <w:rPr>
-          <w:rFonts w:ascii="Arial" w:hAnsi="Arial" w:cs="Arial"/>
-        </w:rPr>
-        <w:t xml:space="preserve">, </w:t>
-      </w:r>
-      <w:proofErr w:type="spellStart"/>
-      <w:r>
-        <w:rPr>
-          <w:rFonts w:ascii="Arial" w:hAnsi="Arial" w:cs="Arial"/>
-        </w:rPr>
-        <w:t>react</w:t>
-      </w:r>
-      <w:proofErr w:type="spellEnd"/>
-      <w:r>
-        <w:rPr>
-          <w:rFonts w:ascii="Arial" w:hAnsi="Arial" w:cs="Arial"/>
-        </w:rPr>
-        <w:t xml:space="preserve"> ni ningún </w:t>
-      </w:r>
-      <w:proofErr w:type="spellStart"/>
-      <w:r>
-        <w:rPr>
-          <w:rFonts w:ascii="Arial" w:hAnsi="Arial" w:cs="Arial"/>
-        </w:rPr>
-        <w:t>fremwork</w:t>
-      </w:r>
-      <w:proofErr w:type="spellEnd"/>
-      <w:r>
-        <w:rPr>
-          <w:rFonts w:ascii="Arial" w:hAnsi="Arial" w:cs="Arial"/>
-        </w:rPr>
-        <w:t xml:space="preserve"> realizaría el proyecto.</w:t>
+        <w:t>sobre javascript, typescript, react ni ningún fremwork realizaría el proyecto.</w:t>
       </w:r>
     </w:p>
     <w:p>
@@ -12082,21 +11154,7 @@
         <w:rPr>
           <w:rFonts w:ascii="Arial" w:hAnsi="Arial" w:cs="Arial"/>
         </w:rPr>
-        <w:t xml:space="preserve"> </w:t>
-      </w:r>
-      <w:proofErr w:type="spellStart"/>
-      <w:r>
-        <w:rPr>
-          <w:rFonts w:ascii="Arial" w:hAnsi="Arial" w:cs="Arial"/>
-        </w:rPr>
-        <w:t>y</w:t>
-      </w:r>
-      <w:proofErr w:type="spellEnd"/>
-      <w:r>
-        <w:rPr>
-          <w:rFonts w:ascii="Arial" w:hAnsi="Arial" w:cs="Arial"/>
-        </w:rPr>
-        <w:t xml:space="preserve"> </w:t>
+        <w:t xml:space="preserve"> y </w:t>
       </w:r>
       <w:proofErr w:type="gramStart"/>
       <w:r>
@@ -12110,49 +11168,7 @@
         <w:rPr>
           <w:rFonts w:ascii="Arial" w:hAnsi="Arial" w:cs="Arial"/>
         </w:rPr>
-        <w:t xml:space="preserve"> aprender a programar en </w:t>
-      </w:r>
-      <w:proofErr w:type="spellStart"/>
-      <w:r>
-        <w:rPr>
-          <w:rFonts w:ascii="Arial" w:hAnsi="Arial" w:cs="Arial"/>
-        </w:rPr>
-        <w:t>react</w:t>
-      </w:r>
-      <w:proofErr w:type="spellEnd"/>
-      <w:r>
-        <w:rPr>
-          <w:rFonts w:ascii="Arial" w:hAnsi="Arial" w:cs="Arial"/>
-        </w:rPr>
-        <w:t xml:space="preserve"> </w:t>
-      </w:r>
-      <w:proofErr w:type="spellStart"/>
-      <w:r>
-        <w:rPr>
-          <w:rFonts w:ascii="Arial" w:hAnsi="Arial" w:cs="Arial"/>
-        </w:rPr>
-        <w:t>javascript</w:t>
-      </w:r>
-      <w:proofErr w:type="spellEnd"/>
-      <w:r>
-        <w:rPr>
-          <w:rFonts w:ascii="Arial" w:hAnsi="Arial" w:cs="Arial"/>
-        </w:rPr>
-        <w:t xml:space="preserve"> y usar el </w:t>
-      </w:r>
-      <w:proofErr w:type="spellStart"/>
-      <w:r>
-        <w:rPr>
-          <w:rFonts w:ascii="Arial" w:hAnsi="Arial" w:cs="Arial"/>
-        </w:rPr>
-        <w:t>framwork</w:t>
-      </w:r>
-      <w:proofErr w:type="spellEnd"/>
-      <w:r>
-        <w:rPr>
-          <w:rFonts w:ascii="Arial" w:hAnsi="Arial" w:cs="Arial"/>
-        </w:rPr>
-        <w:t xml:space="preserve"> en el que esta desarrollado la </w:t>
+        <w:t xml:space="preserve"> aprender a programar en react javascript y usar el framwork en el que esta desarrollado la </w:t>
       </w:r>
       <w:proofErr w:type="gramStart"/>
       <w:r>
@@ -12402,21 +11418,7 @@
         <w:rPr>
           <w:rFonts w:ascii="Arial" w:hAnsi="Arial" w:cs="Arial"/>
         </w:rPr>
-        <w:t xml:space="preserve">Este </w:t>
-      </w:r>
-      <w:proofErr w:type="spellStart"/>
-      <w:r>
-        <w:rPr>
-          <w:rFonts w:ascii="Arial" w:hAnsi="Arial" w:cs="Arial"/>
-        </w:rPr>
-        <w:t>seria</w:t>
-      </w:r>
-      <w:proofErr w:type="spellEnd"/>
-      <w:r>
-        <w:rPr>
-          <w:rFonts w:ascii="Arial" w:hAnsi="Arial" w:cs="Arial"/>
-        </w:rPr>
-        <w:t xml:space="preserve"> el coste de una persona para una empresa realizando esta </w:t>
+        <w:t xml:space="preserve">Este seria el coste de una persona para una empresa realizando esta </w:t>
       </w:r>
       <w:r>
         <w:rPr>
@@ -12567,41 +11569,13 @@
         <w:rPr>
           <w:rFonts w:ascii="Arial" w:hAnsi="Arial" w:cs="Arial"/>
         </w:rPr>
-        <w:t xml:space="preserve">EL sistema ha de permitir visualizar los datos con un </w:t>
-      </w:r>
-      <w:proofErr w:type="spellStart"/>
-      <w:r>
-        <w:rPr>
-          <w:rFonts w:ascii="Arial" w:hAnsi="Arial" w:cs="Arial"/>
-        </w:rPr>
-        <w:t>grafico</w:t>
-      </w:r>
-      <w:proofErr w:type="spellEnd"/>
-      <w:r>
-        <w:rPr>
-          <w:rFonts w:ascii="Arial" w:hAnsi="Arial" w:cs="Arial"/>
-        </w:rPr>
-        <w:t xml:space="preserve"> interactivo. </w:t>
-      </w:r>
-      <w:r>
-        <w:rPr>
-          <w:rFonts w:ascii="Arial" w:hAnsi="Arial" w:cs="Arial"/>
-        </w:rPr>
-        <w:t xml:space="preserve">Separado por </w:t>
-      </w:r>
-      <w:proofErr w:type="spellStart"/>
-      <w:r>
-        <w:rPr>
-          <w:rFonts w:ascii="Arial" w:hAnsi="Arial" w:cs="Arial"/>
-        </w:rPr>
-        <w:t>timestamps</w:t>
-      </w:r>
-      <w:proofErr w:type="spellEnd"/>
-      <w:r>
-        <w:rPr>
-          <w:rFonts w:ascii="Arial" w:hAnsi="Arial" w:cs="Arial"/>
-        </w:rPr>
-        <w:t xml:space="preserve"> </w:t>
+        <w:t xml:space="preserve">EL sistema ha de permitir visualizar los datos con un grafico interactivo. </w:t>
+      </w:r>
+      <w:r>
+        <w:rPr>
+          <w:rFonts w:ascii="Arial" w:hAnsi="Arial" w:cs="Arial"/>
+        </w:rPr>
+        <w:t xml:space="preserve">Separado por timestamps </w:t>
       </w:r>
       <w:r>
         <w:rPr>
@@ -12715,21 +11689,7 @@
         <w:rPr>
           <w:rFonts w:ascii="Arial" w:hAnsi="Arial" w:cs="Arial"/>
         </w:rPr>
-        <w:t xml:space="preserve"> (</w:t>
-      </w:r>
-      <w:proofErr w:type="spellStart"/>
-      <w:r>
-        <w:rPr>
-          <w:rFonts w:ascii="Arial" w:hAnsi="Arial" w:cs="Arial"/>
-        </w:rPr>
-        <w:t>ej</w:t>
-      </w:r>
-      <w:proofErr w:type="spellEnd"/>
-      <w:r>
-        <w:rPr>
-          <w:rFonts w:ascii="Arial" w:hAnsi="Arial" w:cs="Arial"/>
-        </w:rPr>
-        <w:t xml:space="preserve"> sueldo, alquiler, …) (RF-06)</w:t>
+        <w:t xml:space="preserve"> (ej sueldo, alquiler, …) (RF-06)</w:t>
       </w:r>
     </w:p>
     <w:p>
@@ -12929,21 +11889,7 @@
         <w:rPr>
           <w:rFonts w:ascii="Arial" w:hAnsi="Arial" w:cs="Arial"/>
         </w:rPr>
-        <w:t xml:space="preserve">Contraseñas cifradas (hash tipo </w:t>
-      </w:r>
-      <w:proofErr w:type="spellStart"/>
-      <w:r>
-        <w:rPr>
-          <w:rFonts w:ascii="Arial" w:hAnsi="Arial" w:cs="Arial"/>
-        </w:rPr>
-        <w:t>bcrypt</w:t>
-      </w:r>
-      <w:proofErr w:type="spellEnd"/>
-      <w:r>
-        <w:rPr>
-          <w:rFonts w:ascii="Arial" w:hAnsi="Arial" w:cs="Arial"/>
-        </w:rPr>
-        <w:t>)</w:t>
+        <w:t>Contraseñas cifradas (hash tipo bcrypt)</w:t>
       </w:r>
       <w:r>
         <w:rPr>
@@ -12968,35 +11914,7 @@
         <w:rPr>
           <w:rFonts w:ascii="Arial" w:hAnsi="Arial" w:cs="Arial"/>
         </w:rPr>
-        <w:t xml:space="preserve">Validación de datos en </w:t>
-      </w:r>
-      <w:proofErr w:type="spellStart"/>
-      <w:r>
-        <w:rPr>
-          <w:rFonts w:ascii="Arial" w:hAnsi="Arial" w:cs="Arial"/>
-        </w:rPr>
-        <w:t>frontend</w:t>
-      </w:r>
-      <w:proofErr w:type="spellEnd"/>
-      <w:r>
-        <w:rPr>
-          <w:rFonts w:ascii="Arial" w:hAnsi="Arial" w:cs="Arial"/>
-        </w:rPr>
-        <w:t xml:space="preserve"> y </w:t>
-      </w:r>
-      <w:proofErr w:type="spellStart"/>
-      <w:r>
-        <w:rPr>
-          <w:rFonts w:ascii="Arial" w:hAnsi="Arial" w:cs="Arial"/>
-        </w:rPr>
-        <w:t>backend</w:t>
-      </w:r>
-      <w:proofErr w:type="spellEnd"/>
-      <w:r>
-        <w:rPr>
-          <w:rFonts w:ascii="Arial" w:hAnsi="Arial" w:cs="Arial"/>
-        </w:rPr>
-        <w:t xml:space="preserve"> (RNF-06)</w:t>
+        <w:t>Validación de datos en frontend y backend (RNF-06)</w:t>
       </w:r>
     </w:p>
     <w:p>
@@ -13088,19 +12006,11 @@
           <w:rFonts w:ascii="Arial" w:hAnsi="Arial" w:cs="Arial"/>
         </w:rPr>
       </w:pPr>
-      <w:proofErr w:type="spellStart"/>
-      <w:r>
-        <w:rPr>
-          <w:rFonts w:ascii="Arial" w:hAnsi="Arial" w:cs="Arial"/>
-        </w:rPr>
-        <w:t>Admin</w:t>
-      </w:r>
-      <w:proofErr w:type="spellEnd"/>
-      <w:r>
-        <w:rPr>
-          <w:rFonts w:ascii="Arial" w:hAnsi="Arial" w:cs="Arial"/>
-        </w:rPr>
-        <w:t xml:space="preserve">: Puede acceder a la base de datos y ver </w:t>
+      <w:r>
+        <w:rPr>
+          <w:rFonts w:ascii="Arial" w:hAnsi="Arial" w:cs="Arial"/>
+        </w:rPr>
+        <w:t xml:space="preserve">Admin: Puede acceder a la base de datos y ver </w:t>
       </w:r>
       <w:r>
         <w:rPr>
@@ -13355,21 +12265,7 @@
         <w:rPr>
           <w:rFonts w:ascii="Arial" w:hAnsi="Arial" w:cs="Arial"/>
         </w:rPr>
-        <w:t>Un usuario tiene un rol (</w:t>
-      </w:r>
-      <w:proofErr w:type="spellStart"/>
-      <w:r>
-        <w:rPr>
-          <w:rFonts w:ascii="Arial" w:hAnsi="Arial" w:cs="Arial"/>
-        </w:rPr>
-        <w:t>admin</w:t>
-      </w:r>
-      <w:proofErr w:type="spellEnd"/>
-      <w:r>
-        <w:rPr>
-          <w:rFonts w:ascii="Arial" w:hAnsi="Arial" w:cs="Arial"/>
-        </w:rPr>
-        <w:t xml:space="preserve"> o normal)</w:t>
+        <w:t>Un usuario tiene un rol (admin o normal)</w:t>
       </w:r>
       <w:r>
         <w:rPr>
@@ -13421,7 +12317,6 @@
         </w:rPr>
         <w:t xml:space="preserve">Cada usuario tiene un id y </w:t>
       </w:r>
-      <w:proofErr w:type="spellStart"/>
       <w:proofErr w:type="gramStart"/>
       <w:r>
         <w:rPr>
@@ -13429,7 +12324,6 @@
         </w:rPr>
         <w:t>password</w:t>
       </w:r>
-      <w:proofErr w:type="spellEnd"/>
       <w:proofErr w:type="gramEnd"/>
       <w:r>
         <w:rPr>
@@ -13688,6 +12582,7 @@
       <w:r>
         <w:rPr>
           <w:rFonts w:ascii="Arial" w:hAnsi="Arial" w:cs="Arial"/>
+          <w:noProof/>
         </w:rPr>
         <w:drawing>
           <wp:inline distT="0" distB="0" distL="0" distR="0" wp14:anchorId="3124474C" wp14:editId="3E925939">
@@ -13891,23 +12786,7 @@
         <w:pStyle w:val="Textonotapie"/>
       </w:pPr>
       <w:r>
-        <w:t>Este trabajo se distribuye bajo licencia Creative Commons Atribución-</w:t>
-      </w:r>
-      <w:proofErr w:type="spellStart"/>
-      <w:r>
-        <w:t>NoComercial</w:t>
-      </w:r>
-      <w:proofErr w:type="spellEnd"/>
-      <w:r>
-        <w:t>-</w:t>
-      </w:r>
-      <w:proofErr w:type="spellStart"/>
-      <w:r>
-        <w:t>CompartirIgual</w:t>
-      </w:r>
-      <w:proofErr w:type="spellEnd"/>
-      <w:r>
-        <w:t xml:space="preserve"> 4.0 Internacional.</w:t>
+        <w:t>Este trabajo se distribuye bajo licencia Creative Commons Atribución-NoComercial-CompartirIgual 4.0 Internacional.</w:t>
       </w:r>
     </w:p>
   </w:footnote>

</xml_diff>

<commit_message>
18/4 Añado y cambio cosas en la memoria y borro docxs
</commit_message>
<xml_diff>
--- a/Memoria_ProyectoV1.docx
+++ b/Memoria_ProyectoV1.docx
@@ -37,7 +37,7 @@
                     <pic:cNvPicPr/>
                   </pic:nvPicPr>
                   <pic:blipFill>
-                    <a:blip r:embed="rId8">
+                    <a:blip r:embed="rId9">
                       <a:extLst>
                         <a:ext uri="{28A0092B-C50C-407E-A947-70E740481C1C}">
                           <a14:useLocalDpi xmlns:a14="http://schemas.microsoft.com/office/drawing/2010/main" val="0"/>
@@ -310,7 +310,7 @@
         <mc:AlternateContent>
           <mc:Choice Requires="wps">
             <w:drawing>
-              <wp:anchor distT="0" distB="0" distL="114300" distR="114300" simplePos="0" relativeHeight="251660288" behindDoc="0" locked="0" layoutInCell="1" allowOverlap="1" wp14:anchorId="5982337E" wp14:editId="7821B8B2">
+              <wp:anchor distT="0" distB="0" distL="114300" distR="114300" simplePos="0" relativeHeight="251660288" behindDoc="0" locked="0" layoutInCell="1" allowOverlap="1" wp14:anchorId="5982337E" wp14:editId="0BB556E5">
                 <wp:simplePos x="0" y="0"/>
                 <wp:positionH relativeFrom="column">
                   <wp:posOffset>-192405</wp:posOffset>
@@ -410,6 +410,7 @@
         </w:rPr>
         <w:t xml:space="preserve">Proyecto: </w:t>
       </w:r>
+      <w:proofErr w:type="spellStart"/>
       <w:r>
         <w:rPr>
           <w:sz w:val="32"/>
@@ -417,6 +418,7 @@
         </w:rPr>
         <w:t>MrFinance</w:t>
       </w:r>
+      <w:proofErr w:type="spellEnd"/>
     </w:p>
     <w:p>
       <w:pPr>
@@ -512,28 +514,31 @@
         </w:rPr>
         <w:t xml:space="preserve">Tutor individual: </w:t>
       </w:r>
+      <w:proofErr w:type="spellStart"/>
       <w:r>
         <w:rPr>
           <w:sz w:val="32"/>
           <w:szCs w:val="32"/>
         </w:rPr>
-        <w:t>Maria Jose</w:t>
-      </w:r>
-    </w:p>
-    <w:p>
-      <w:pPr>
+        <w:t>Maria</w:t>
+      </w:r>
+      <w:proofErr w:type="spellEnd"/>
+      <w:r>
         <w:rPr>
           <w:sz w:val="32"/>
           <w:szCs w:val="32"/>
         </w:rPr>
-      </w:pPr>
+        <w:t xml:space="preserve"> </w:t>
+      </w:r>
+      <w:proofErr w:type="spellStart"/>
       <w:r>
         <w:rPr>
           <w:sz w:val="32"/>
           <w:szCs w:val="32"/>
         </w:rPr>
-        <w:t>Tutor colectivo: Enrique Carballo Albarrán</w:t>
-      </w:r>
+        <w:t>Jose</w:t>
+      </w:r>
+      <w:proofErr w:type="spellEnd"/>
     </w:p>
     <w:p>
       <w:pPr>
@@ -542,6 +547,81 @@
           <w:szCs w:val="32"/>
         </w:rPr>
       </w:pPr>
+      <w:r>
+        <w:rPr>
+          <w:sz w:val="32"/>
+          <w:szCs w:val="32"/>
+        </w:rPr>
+        <w:t>Tutor colectivo: Enrique Carballo Albarrán</w:t>
+      </w:r>
+    </w:p>
+    <w:p>
+      <w:pPr>
+        <w:rPr>
+          <w:sz w:val="32"/>
+          <w:szCs w:val="32"/>
+        </w:rPr>
+      </w:pPr>
+      <w:r>
+        <w:rPr>
+          <w:noProof/>
+        </w:rPr>
+        <w:drawing>
+          <wp:anchor distT="0" distB="0" distL="114300" distR="114300" simplePos="0" relativeHeight="251663360" behindDoc="0" locked="0" layoutInCell="1" allowOverlap="1" wp14:anchorId="691CDB89" wp14:editId="3D5AF9C3">
+            <wp:simplePos x="0" y="0"/>
+            <wp:positionH relativeFrom="margin">
+              <wp:align>left</wp:align>
+            </wp:positionH>
+            <wp:positionV relativeFrom="paragraph">
+              <wp:posOffset>367030</wp:posOffset>
+            </wp:positionV>
+            <wp:extent cx="4495165" cy="621098"/>
+            <wp:effectExtent l="0" t="0" r="635" b="7620"/>
+            <wp:wrapNone/>
+            <wp:docPr id="132468486" name="Imagen 1"/>
+            <wp:cNvGraphicFramePr>
+              <a:graphicFrameLocks xmlns:a="http://schemas.openxmlformats.org/drawingml/2006/main" noChangeAspect="1"/>
+            </wp:cNvGraphicFramePr>
+            <a:graphic xmlns:a="http://schemas.openxmlformats.org/drawingml/2006/main">
+              <a:graphicData uri="http://schemas.openxmlformats.org/drawingml/2006/picture">
+                <pic:pic xmlns:pic="http://schemas.openxmlformats.org/drawingml/2006/picture">
+                  <pic:nvPicPr>
+                    <pic:cNvPr id="132468486" name=""/>
+                    <pic:cNvPicPr/>
+                  </pic:nvPicPr>
+                  <pic:blipFill>
+                    <a:blip r:embed="rId10">
+                      <a:extLst>
+                        <a:ext uri="{28A0092B-C50C-407E-A947-70E740481C1C}">
+                          <a14:useLocalDpi xmlns:a14="http://schemas.microsoft.com/office/drawing/2010/main" val="0"/>
+                        </a:ext>
+                      </a:extLst>
+                    </a:blip>
+                    <a:stretch>
+                      <a:fillRect/>
+                    </a:stretch>
+                  </pic:blipFill>
+                  <pic:spPr>
+                    <a:xfrm>
+                      <a:off x="0" y="0"/>
+                      <a:ext cx="4495165" cy="621098"/>
+                    </a:xfrm>
+                    <a:prstGeom prst="rect">
+                      <a:avLst/>
+                    </a:prstGeom>
+                  </pic:spPr>
+                </pic:pic>
+              </a:graphicData>
+            </a:graphic>
+            <wp14:sizeRelH relativeFrom="margin">
+              <wp14:pctWidth>0</wp14:pctWidth>
+            </wp14:sizeRelH>
+            <wp14:sizeRelV relativeFrom="margin">
+              <wp14:pctHeight>0</wp14:pctHeight>
+            </wp14:sizeRelV>
+          </wp:anchor>
+        </w:drawing>
+      </w:r>
       <w:r>
         <w:rPr>
           <w:sz w:val="32"/>
@@ -589,12 +669,20 @@
         </w:rPr>
       </w:pPr>
       <w:bookmarkStart w:id="0" w:name="_Toc225877697"/>
+      <w:proofErr w:type="spellStart"/>
       <w:r>
         <w:rPr>
           <w:rFonts w:ascii="Arial" w:hAnsi="Arial" w:cs="Arial"/>
         </w:rPr>
         <w:lastRenderedPageBreak/>
-        <w:t>Introduccion al proyecto</w:t>
+        <w:t>Introduccion</w:t>
+      </w:r>
+      <w:proofErr w:type="spellEnd"/>
+      <w:r>
+        <w:rPr>
+          <w:rFonts w:ascii="Arial" w:hAnsi="Arial" w:cs="Arial"/>
+        </w:rPr>
+        <w:t xml:space="preserve"> al proyecto</w:t>
       </w:r>
       <w:bookmarkEnd w:id="0"/>
     </w:p>
@@ -711,7 +799,31 @@
         <w:rPr>
           <w:rFonts w:ascii="Arial" w:hAnsi="Arial" w:cs="Arial"/>
         </w:rPr>
-        <w:t xml:space="preserve">Y por ultimo la marca nobre de la </w:t>
+        <w:t xml:space="preserve">Y por </w:t>
+      </w:r>
+      <w:r>
+        <w:rPr>
+          <w:rFonts w:ascii="Arial" w:hAnsi="Arial" w:cs="Arial"/>
+        </w:rPr>
+        <w:t>último</w:t>
+      </w:r>
+      <w:r>
+        <w:rPr>
+          <w:rFonts w:ascii="Arial" w:hAnsi="Arial" w:cs="Arial"/>
+        </w:rPr>
+        <w:t xml:space="preserve"> la marca </w:t>
+      </w:r>
+      <w:r>
+        <w:rPr>
+          <w:rFonts w:ascii="Arial" w:hAnsi="Arial" w:cs="Arial"/>
+        </w:rPr>
+        <w:t>nombre</w:t>
+      </w:r>
+      <w:r>
+        <w:rPr>
+          <w:rFonts w:ascii="Arial" w:hAnsi="Arial" w:cs="Arial"/>
+        </w:rPr>
+        <w:t xml:space="preserve"> de la </w:t>
       </w:r>
       <w:proofErr w:type="gramStart"/>
       <w:r>
@@ -725,7 +837,33 @@
         <w:rPr>
           <w:rFonts w:ascii="Arial" w:hAnsi="Arial" w:cs="Arial"/>
         </w:rPr>
-        <w:t>, diseños y demás elementos característicos de la marca mr finance están resevados</w:t>
+        <w:t xml:space="preserve">, diseños y demás elementos característicos de la </w:t>
+      </w:r>
+      <w:r>
+        <w:rPr>
+          <w:rFonts w:ascii="Arial" w:hAnsi="Arial" w:cs="Arial"/>
+        </w:rPr>
+        <w:t xml:space="preserve">marca </w:t>
+      </w:r>
+      <w:proofErr w:type="spellStart"/>
+      <w:r>
+        <w:rPr>
+          <w:rFonts w:ascii="Arial" w:hAnsi="Arial" w:cs="Arial"/>
+        </w:rPr>
+        <w:t>MrFinance</w:t>
+      </w:r>
+      <w:proofErr w:type="spellEnd"/>
+      <w:r>
+        <w:rPr>
+          <w:rFonts w:ascii="Arial" w:hAnsi="Arial" w:cs="Arial"/>
+        </w:rPr>
+        <w:t xml:space="preserve"> están </w:t>
+      </w:r>
+      <w:r>
+        <w:rPr>
+          <w:rFonts w:ascii="Arial" w:hAnsi="Arial" w:cs="Arial"/>
+        </w:rPr>
+        <w:t>reservados</w:t>
       </w:r>
       <w:r>
         <w:rPr>
@@ -746,25 +884,49 @@
         </w:rPr>
         <w:t xml:space="preserve">Esto se puede ver </w:t>
       </w:r>
-      <w:proofErr w:type="gramStart"/>
-      <w:r>
-        <w:rPr>
-          <w:rFonts w:ascii="Arial" w:hAnsi="Arial" w:cs="Arial"/>
-        </w:rPr>
-        <w:t>el los</w:t>
-      </w:r>
-      <w:proofErr w:type="gramEnd"/>
-      <w:r>
-        <w:rPr>
-          <w:rFonts w:ascii="Arial" w:hAnsi="Arial" w:cs="Arial"/>
-        </w:rPr>
-        <w:t xml:space="preserve"> archivos README.md, LICENSE-docs y LICENSE</w:t>
-      </w:r>
-      <w:r>
-        <w:rPr>
-          <w:rFonts w:ascii="Arial" w:hAnsi="Arial" w:cs="Arial"/>
-        </w:rPr>
-        <w:t xml:space="preserve"> entro de la carpeta del proyecto.</w:t>
+      <w:r>
+        <w:rPr>
+          <w:rFonts w:ascii="Arial" w:hAnsi="Arial" w:cs="Arial"/>
+        </w:rPr>
+        <w:t>en los</w:t>
+      </w:r>
+      <w:r>
+        <w:rPr>
+          <w:rFonts w:ascii="Arial" w:hAnsi="Arial" w:cs="Arial"/>
+        </w:rPr>
+        <w:t xml:space="preserve"> archivos README.md, LICENSE-</w:t>
+      </w:r>
+      <w:proofErr w:type="spellStart"/>
+      <w:r>
+        <w:rPr>
+          <w:rFonts w:ascii="Arial" w:hAnsi="Arial" w:cs="Arial"/>
+        </w:rPr>
+        <w:t>docs</w:t>
+      </w:r>
+      <w:proofErr w:type="spellEnd"/>
+      <w:r>
+        <w:rPr>
+          <w:rFonts w:ascii="Arial" w:hAnsi="Arial" w:cs="Arial"/>
+        </w:rPr>
+        <w:t xml:space="preserve"> y LICENSE</w:t>
+      </w:r>
+      <w:r>
+        <w:rPr>
+          <w:rFonts w:ascii="Arial" w:hAnsi="Arial" w:cs="Arial"/>
+        </w:rPr>
+        <w:t xml:space="preserve"> </w:t>
+      </w:r>
+      <w:r>
+        <w:rPr>
+          <w:rFonts w:ascii="Arial" w:hAnsi="Arial" w:cs="Arial"/>
+        </w:rPr>
+        <w:t>d</w:t>
+      </w:r>
+      <w:r>
+        <w:rPr>
+          <w:rFonts w:ascii="Arial" w:hAnsi="Arial" w:cs="Arial"/>
+        </w:rPr>
+        <w:t>entro de la carpeta del proyecto.</w:t>
       </w:r>
       <w:r>
         <w:rPr>
@@ -806,8 +968,30 @@
         <w:rPr>
           <w:rFonts w:ascii="Arial" w:hAnsi="Arial" w:cs="Arial"/>
         </w:rPr>
-        <w:t>Bla bla bla</w:t>
-      </w:r>
+        <w:t xml:space="preserve">Bla </w:t>
+      </w:r>
+      <w:proofErr w:type="spellStart"/>
+      <w:r>
+        <w:rPr>
+          <w:rFonts w:ascii="Arial" w:hAnsi="Arial" w:cs="Arial"/>
+        </w:rPr>
+        <w:t>bla</w:t>
+      </w:r>
+      <w:proofErr w:type="spellEnd"/>
+      <w:r>
+        <w:rPr>
+          <w:rFonts w:ascii="Arial" w:hAnsi="Arial" w:cs="Arial"/>
+        </w:rPr>
+        <w:t xml:space="preserve"> </w:t>
+      </w:r>
+      <w:proofErr w:type="spellStart"/>
+      <w:r>
+        <w:rPr>
+          <w:rFonts w:ascii="Arial" w:hAnsi="Arial" w:cs="Arial"/>
+        </w:rPr>
+        <w:t>bla</w:t>
+      </w:r>
+      <w:proofErr w:type="spellEnd"/>
     </w:p>
     <w:p>
       <w:pPr>
@@ -855,8 +1039,30 @@
         <w:rPr>
           <w:rFonts w:ascii="Arial" w:hAnsi="Arial" w:cs="Arial"/>
         </w:rPr>
-        <w:t>Bla bla bla</w:t>
-      </w:r>
+        <w:t xml:space="preserve">Bla </w:t>
+      </w:r>
+      <w:proofErr w:type="spellStart"/>
+      <w:r>
+        <w:rPr>
+          <w:rFonts w:ascii="Arial" w:hAnsi="Arial" w:cs="Arial"/>
+        </w:rPr>
+        <w:t>bla</w:t>
+      </w:r>
+      <w:proofErr w:type="spellEnd"/>
+      <w:r>
+        <w:rPr>
+          <w:rFonts w:ascii="Arial" w:hAnsi="Arial" w:cs="Arial"/>
+        </w:rPr>
+        <w:t xml:space="preserve"> </w:t>
+      </w:r>
+      <w:proofErr w:type="spellStart"/>
+      <w:r>
+        <w:rPr>
+          <w:rFonts w:ascii="Arial" w:hAnsi="Arial" w:cs="Arial"/>
+        </w:rPr>
+        <w:t>bla</w:t>
+      </w:r>
+      <w:proofErr w:type="spellEnd"/>
       <w:r>
         <w:rPr>
           <w:rFonts w:ascii="Arial" w:hAnsi="Arial" w:cs="Arial"/>
@@ -879,11 +1085,19 @@
         <w:lastRenderedPageBreak/>
         <w:t xml:space="preserve">0.3 </w:t>
       </w:r>
-      <w:r>
-        <w:rPr>
-          <w:rFonts w:ascii="Arial" w:hAnsi="Arial" w:cs="Arial"/>
-        </w:rPr>
-        <w:t>Abstract (</w:t>
+      <w:proofErr w:type="spellStart"/>
+      <w:r>
+        <w:rPr>
+          <w:rFonts w:ascii="Arial" w:hAnsi="Arial" w:cs="Arial"/>
+        </w:rPr>
+        <w:t>Abstract</w:t>
+      </w:r>
+      <w:proofErr w:type="spellEnd"/>
+      <w:r>
+        <w:rPr>
+          <w:rFonts w:ascii="Arial" w:hAnsi="Arial" w:cs="Arial"/>
+        </w:rPr>
+        <w:t xml:space="preserve"> (</w:t>
       </w:r>
       <w:proofErr w:type="gramStart"/>
       <w:r>
@@ -3946,7 +4160,35 @@
         <w:rPr>
           <w:rFonts w:ascii="Arial" w:hAnsi="Arial" w:cs="Arial"/>
         </w:rPr>
-        <w:t xml:space="preserve"> ahorro y gastos “Mr finance”</w:t>
+        <w:t xml:space="preserve"> ahorro y gastos “</w:t>
+      </w:r>
+      <w:proofErr w:type="spellStart"/>
+      <w:r>
+        <w:rPr>
+          <w:rFonts w:ascii="Arial" w:hAnsi="Arial" w:cs="Arial"/>
+        </w:rPr>
+        <w:t>Mr</w:t>
+      </w:r>
+      <w:proofErr w:type="spellEnd"/>
+      <w:r>
+        <w:rPr>
+          <w:rFonts w:ascii="Arial" w:hAnsi="Arial" w:cs="Arial"/>
+        </w:rPr>
+        <w:t xml:space="preserve"> </w:t>
+      </w:r>
+      <w:proofErr w:type="spellStart"/>
+      <w:r>
+        <w:rPr>
+          <w:rFonts w:ascii="Arial" w:hAnsi="Arial" w:cs="Arial"/>
+        </w:rPr>
+        <w:t>finance</w:t>
+      </w:r>
+      <w:proofErr w:type="spellEnd"/>
+      <w:r>
+        <w:rPr>
+          <w:rFonts w:ascii="Arial" w:hAnsi="Arial" w:cs="Arial"/>
+        </w:rPr>
+        <w:t>”</w:t>
       </w:r>
       <w:r>
         <w:rPr>
@@ -4396,8 +4638,16 @@
               <w:rPr>
                 <w:rFonts w:ascii="Arial" w:hAnsi="Arial" w:cs="Arial"/>
               </w:rPr>
-              <w:t>Solución que aporta MrFinance</w:t>
-            </w:r>
+              <w:t xml:space="preserve">Solución que aporta </w:t>
+            </w:r>
+            <w:proofErr w:type="spellStart"/>
+            <w:r>
+              <w:rPr>
+                <w:rFonts w:ascii="Arial" w:hAnsi="Arial" w:cs="Arial"/>
+              </w:rPr>
+              <w:t>MrFinance</w:t>
+            </w:r>
+            <w:proofErr w:type="spellEnd"/>
           </w:p>
         </w:tc>
       </w:tr>
@@ -4943,7 +5193,21 @@
         <w:rPr>
           <w:rFonts w:ascii="Arial" w:hAnsi="Arial" w:cs="Arial"/>
         </w:rPr>
-        <w:t>Conexión directa con bancos o APIs financieras externas</w:t>
+        <w:t xml:space="preserve">Conexión directa con bancos o </w:t>
+      </w:r>
+      <w:proofErr w:type="spellStart"/>
+      <w:r>
+        <w:rPr>
+          <w:rFonts w:ascii="Arial" w:hAnsi="Arial" w:cs="Arial"/>
+        </w:rPr>
+        <w:t>APIs</w:t>
+      </w:r>
+      <w:proofErr w:type="spellEnd"/>
+      <w:r>
+        <w:rPr>
+          <w:rFonts w:ascii="Arial" w:hAnsi="Arial" w:cs="Arial"/>
+        </w:rPr>
+        <w:t xml:space="preserve"> financieras externas</w:t>
       </w:r>
       <w:r>
         <w:rPr>
@@ -4973,7 +5237,21 @@
         <w:rPr>
           <w:rFonts w:ascii="Arial" w:hAnsi="Arial" w:cs="Arial"/>
         </w:rPr>
-        <w:t xml:space="preserve"> con personas o ia.</w:t>
+        <w:t xml:space="preserve"> con personas o </w:t>
+      </w:r>
+      <w:proofErr w:type="spellStart"/>
+      <w:r>
+        <w:rPr>
+          <w:rFonts w:ascii="Arial" w:hAnsi="Arial" w:cs="Arial"/>
+        </w:rPr>
+        <w:t>ia</w:t>
+      </w:r>
+      <w:proofErr w:type="spellEnd"/>
+      <w:r>
+        <w:rPr>
+          <w:rFonts w:ascii="Arial" w:hAnsi="Arial" w:cs="Arial"/>
+        </w:rPr>
+        <w:t>.</w:t>
       </w:r>
     </w:p>
     <w:p>
@@ -5061,8 +5339,18 @@
           <w:b/>
           <w:bCs/>
         </w:rPr>
-        <w:t>full-stack</w:t>
-      </w:r>
+        <w:t>full-</w:t>
+      </w:r>
+      <w:proofErr w:type="spellStart"/>
+      <w:r>
+        <w:rPr>
+          <w:rFonts w:ascii="Arial" w:hAnsi="Arial" w:cs="Arial"/>
+          <w:b/>
+          <w:bCs/>
+        </w:rPr>
+        <w:t>stack</w:t>
+      </w:r>
+      <w:proofErr w:type="spellEnd"/>
       <w:r>
         <w:rPr>
           <w:rFonts w:ascii="Arial" w:hAnsi="Arial" w:cs="Arial"/>
@@ -5121,7 +5409,25 @@
           <w:b/>
           <w:bCs/>
         </w:rPr>
-        <w:t>base de datos + backend con autenticación</w:t>
+        <w:t xml:space="preserve">base de datos + </w:t>
+      </w:r>
+      <w:proofErr w:type="spellStart"/>
+      <w:r>
+        <w:rPr>
+          <w:rFonts w:ascii="Arial" w:hAnsi="Arial" w:cs="Arial"/>
+          <w:b/>
+          <w:bCs/>
+        </w:rPr>
+        <w:t>backend</w:t>
+      </w:r>
+      <w:proofErr w:type="spellEnd"/>
+      <w:r>
+        <w:rPr>
+          <w:rFonts w:ascii="Arial" w:hAnsi="Arial" w:cs="Arial"/>
+          <w:b/>
+          <w:bCs/>
+        </w:rPr>
+        <w:t xml:space="preserve"> con autenticación</w:t>
       </w:r>
     </w:p>
     <w:p>
@@ -5187,13 +5493,23 @@
         </w:rPr>
         <w:t xml:space="preserve">La experiencia debe ser fluida y visual </w:t>
       </w:r>
+      <w:proofErr w:type="spellStart"/>
       <w:r>
         <w:rPr>
           <w:rFonts w:ascii="Arial" w:hAnsi="Arial" w:cs="Arial"/>
           <w:b/>
           <w:bCs/>
         </w:rPr>
-        <w:t>frontend dinámico con gráficos</w:t>
+        <w:t>frontend</w:t>
+      </w:r>
+      <w:proofErr w:type="spellEnd"/>
+      <w:r>
+        <w:rPr>
+          <w:rFonts w:ascii="Arial" w:hAnsi="Arial" w:cs="Arial"/>
+          <w:b/>
+          <w:bCs/>
+        </w:rPr>
+        <w:t xml:space="preserve"> dinámico con gráficos</w:t>
       </w:r>
     </w:p>
     <w:p>
@@ -5245,14 +5561,24 @@
           <w:b/>
           <w:bCs/>
         </w:rPr>
-        <w:t>diseño responsive + despliegue en cloud</w:t>
-      </w:r>
+        <w:t xml:space="preserve">diseño responsive + despliegue en </w:t>
+      </w:r>
+      <w:proofErr w:type="spellStart"/>
       <w:r>
         <w:rPr>
           <w:rFonts w:ascii="Arial" w:hAnsi="Arial" w:cs="Arial"/>
           <w:b/>
           <w:bCs/>
         </w:rPr>
+        <w:t>cloud</w:t>
+      </w:r>
+      <w:proofErr w:type="spellEnd"/>
+      <w:r>
+        <w:rPr>
+          <w:rFonts w:ascii="Arial" w:hAnsi="Arial" w:cs="Arial"/>
+          <w:b/>
+          <w:bCs/>
+        </w:rPr>
         <w:t>.</w:t>
       </w:r>
     </w:p>
@@ -5290,6 +5616,7 @@
           <w:rFonts w:ascii="Arial" w:hAnsi="Arial" w:cs="Arial"/>
         </w:rPr>
       </w:pPr>
+      <w:proofErr w:type="spellStart"/>
       <w:r>
         <w:rPr>
           <w:rFonts w:ascii="Arial" w:hAnsi="Arial" w:cs="Arial"/>
@@ -5298,6 +5625,7 @@
         </w:rPr>
         <w:t>MrFinance</w:t>
       </w:r>
+      <w:proofErr w:type="spellEnd"/>
       <w:r>
         <w:rPr>
           <w:rFonts w:ascii="Arial" w:hAnsi="Arial" w:cs="Arial"/>
@@ -5400,7 +5728,21 @@
         <w:rPr>
           <w:rFonts w:ascii="Arial" w:hAnsi="Arial" w:cs="Arial"/>
         </w:rPr>
-        <w:t xml:space="preserve"> como tricount que es una </w:t>
+        <w:t xml:space="preserve"> como </w:t>
+      </w:r>
+      <w:proofErr w:type="spellStart"/>
+      <w:r>
+        <w:rPr>
+          <w:rFonts w:ascii="Arial" w:hAnsi="Arial" w:cs="Arial"/>
+        </w:rPr>
+        <w:t>tricount</w:t>
+      </w:r>
+      <w:proofErr w:type="spellEnd"/>
+      <w:r>
+        <w:rPr>
+          <w:rFonts w:ascii="Arial" w:hAnsi="Arial" w:cs="Arial"/>
+        </w:rPr>
+        <w:t xml:space="preserve"> que es una </w:t>
       </w:r>
       <w:proofErr w:type="gramStart"/>
       <w:r>
@@ -5420,7 +5762,21 @@
         <w:rPr>
           <w:rFonts w:ascii="Arial" w:hAnsi="Arial" w:cs="Arial"/>
         </w:rPr>
-        <w:t xml:space="preserve"> Monefy, estas </w:t>
+        <w:t xml:space="preserve"> </w:t>
+      </w:r>
+      <w:proofErr w:type="spellStart"/>
+      <w:r>
+        <w:rPr>
+          <w:rFonts w:ascii="Arial" w:hAnsi="Arial" w:cs="Arial"/>
+        </w:rPr>
+        <w:t>Monefy</w:t>
+      </w:r>
+      <w:proofErr w:type="spellEnd"/>
+      <w:r>
+        <w:rPr>
+          <w:rFonts w:ascii="Arial" w:hAnsi="Arial" w:cs="Arial"/>
+        </w:rPr>
+        <w:t xml:space="preserve">, estas </w:t>
       </w:r>
       <w:proofErr w:type="gramStart"/>
       <w:r>
@@ -5434,7 +5790,21 @@
         <w:rPr>
           <w:rFonts w:ascii="Arial" w:hAnsi="Arial" w:cs="Arial"/>
         </w:rPr>
-        <w:t xml:space="preserve"> tienen grandes equipos de desarrollo detrás además de un moton de funcionalidades después de varios años de desarrollo, </w:t>
+        <w:t xml:space="preserve"> tienen grandes equipos de desarrollo detrás además de un </w:t>
+      </w:r>
+      <w:proofErr w:type="spellStart"/>
+      <w:r>
+        <w:rPr>
+          <w:rFonts w:ascii="Arial" w:hAnsi="Arial" w:cs="Arial"/>
+        </w:rPr>
+        <w:t>moton</w:t>
+      </w:r>
+      <w:proofErr w:type="spellEnd"/>
+      <w:r>
+        <w:rPr>
+          <w:rFonts w:ascii="Arial" w:hAnsi="Arial" w:cs="Arial"/>
+        </w:rPr>
+        <w:t xml:space="preserve"> de funcionalidades después de varios años de desarrollo, </w:t>
       </w:r>
       <w:r>
         <w:rPr>
@@ -5576,7 +5946,49 @@
         <w:rPr>
           <w:rFonts w:ascii="Arial" w:hAnsi="Arial" w:cs="Arial"/>
         </w:rPr>
-        <w:t>en este campo es muy complicado destacar ya que hay mucha competencia, pero muchas veces solo vasta con hacerte ver mas que los demás. Por esto mismo cuanto tenga mi proyecto terminado muy probablemente contacte con varios “influencers” para darme a conocer y así poder ayudar a algunas personas a mejorar su vida económica.</w:t>
+        <w:t xml:space="preserve">en este campo es muy complicado destacar ya que hay mucha competencia, pero muchas veces solo </w:t>
+      </w:r>
+      <w:proofErr w:type="spellStart"/>
+      <w:r>
+        <w:rPr>
+          <w:rFonts w:ascii="Arial" w:hAnsi="Arial" w:cs="Arial"/>
+        </w:rPr>
+        <w:t>vasta</w:t>
+      </w:r>
+      <w:proofErr w:type="spellEnd"/>
+      <w:r>
+        <w:rPr>
+          <w:rFonts w:ascii="Arial" w:hAnsi="Arial" w:cs="Arial"/>
+        </w:rPr>
+        <w:t xml:space="preserve"> con hacerte ver </w:t>
+      </w:r>
+      <w:proofErr w:type="spellStart"/>
+      <w:r>
+        <w:rPr>
+          <w:rFonts w:ascii="Arial" w:hAnsi="Arial" w:cs="Arial"/>
+        </w:rPr>
+        <w:t>mas</w:t>
+      </w:r>
+      <w:proofErr w:type="spellEnd"/>
+      <w:r>
+        <w:rPr>
+          <w:rFonts w:ascii="Arial" w:hAnsi="Arial" w:cs="Arial"/>
+        </w:rPr>
+        <w:t xml:space="preserve"> que los demás. Por esto mismo cuanto tenga mi proyecto terminado muy probablemente contacte con varios “</w:t>
+      </w:r>
+      <w:proofErr w:type="spellStart"/>
+      <w:r>
+        <w:rPr>
+          <w:rFonts w:ascii="Arial" w:hAnsi="Arial" w:cs="Arial"/>
+        </w:rPr>
+        <w:t>influencers</w:t>
+      </w:r>
+      <w:proofErr w:type="spellEnd"/>
+      <w:r>
+        <w:rPr>
+          <w:rFonts w:ascii="Arial" w:hAnsi="Arial" w:cs="Arial"/>
+        </w:rPr>
+        <w:t>” para darme a conocer y así poder ayudar a algunas personas a mejorar su vida económica.</w:t>
       </w:r>
     </w:p>
     <w:p>
@@ -5821,7 +6233,35 @@
         <w:rPr>
           <w:rFonts w:ascii="Arial" w:hAnsi="Arial" w:cs="Arial"/>
         </w:rPr>
-        <w:t xml:space="preserve">para alcanzar este logro hare uso de algunos frameworks y componentes para facilitar mi trabajo y al final obtener un producto mas profesional el menos tiempo ya que </w:t>
+        <w:t xml:space="preserve">para alcanzar este logro hare uso de algunos </w:t>
+      </w:r>
+      <w:proofErr w:type="spellStart"/>
+      <w:r>
+        <w:rPr>
+          <w:rFonts w:ascii="Arial" w:hAnsi="Arial" w:cs="Arial"/>
+        </w:rPr>
+        <w:t>frameworks</w:t>
+      </w:r>
+      <w:proofErr w:type="spellEnd"/>
+      <w:r>
+        <w:rPr>
+          <w:rFonts w:ascii="Arial" w:hAnsi="Arial" w:cs="Arial"/>
+        </w:rPr>
+        <w:t xml:space="preserve"> y componentes para facilitar mi trabajo y al final obtener un producto </w:t>
+      </w:r>
+      <w:proofErr w:type="spellStart"/>
+      <w:r>
+        <w:rPr>
+          <w:rFonts w:ascii="Arial" w:hAnsi="Arial" w:cs="Arial"/>
+        </w:rPr>
+        <w:t>mas</w:t>
+      </w:r>
+      <w:proofErr w:type="spellEnd"/>
+      <w:r>
+        <w:rPr>
+          <w:rFonts w:ascii="Arial" w:hAnsi="Arial" w:cs="Arial"/>
+        </w:rPr>
+        <w:t xml:space="preserve"> profesional el menos tiempo ya que </w:t>
       </w:r>
       <w:r>
         <w:rPr>
@@ -5841,7 +6281,21 @@
         <w:rPr>
           <w:rFonts w:ascii="Arial" w:hAnsi="Arial" w:cs="Arial"/>
         </w:rPr>
-        <w:t>Algunas posibles mejoras o upgrades sobre la base de la aplicación pueden ser:</w:t>
+        <w:t xml:space="preserve">Algunas posibles mejoras o </w:t>
+      </w:r>
+      <w:proofErr w:type="spellStart"/>
+      <w:r>
+        <w:rPr>
+          <w:rFonts w:ascii="Arial" w:hAnsi="Arial" w:cs="Arial"/>
+        </w:rPr>
+        <w:t>upgrades</w:t>
+      </w:r>
+      <w:proofErr w:type="spellEnd"/>
+      <w:r>
+        <w:rPr>
+          <w:rFonts w:ascii="Arial" w:hAnsi="Arial" w:cs="Arial"/>
+        </w:rPr>
+        <w:t xml:space="preserve"> sobre la base de la aplicación pueden ser:</w:t>
       </w:r>
     </w:p>
     <w:p>
@@ -5868,15 +6322,16 @@
           <w:b/>
           <w:bCs/>
         </w:rPr>
-        <w:t>servicio de ma</w:t>
-      </w:r>
+        <w:t xml:space="preserve">servicio de </w:t>
+      </w:r>
+      <w:proofErr w:type="spellStart"/>
       <w:r>
         <w:rPr>
           <w:rFonts w:ascii="Arial" w:hAnsi="Arial" w:cs="Arial"/>
           <w:b/>
           <w:bCs/>
         </w:rPr>
-        <w:t>i</w:t>
+        <w:t>ma</w:t>
       </w:r>
       <w:r>
         <w:rPr>
@@ -5884,8 +6339,17 @@
           <w:b/>
           <w:bCs/>
         </w:rPr>
+        <w:t>i</w:t>
+      </w:r>
+      <w:r>
+        <w:rPr>
+          <w:rFonts w:ascii="Arial" w:hAnsi="Arial" w:cs="Arial"/>
+          <w:b/>
+          <w:bCs/>
+        </w:rPr>
         <w:t>ling</w:t>
       </w:r>
+      <w:proofErr w:type="spellEnd"/>
       <w:r>
         <w:rPr>
           <w:rFonts w:ascii="Arial" w:hAnsi="Arial" w:cs="Arial"/>
@@ -5896,7 +6360,21 @@
         <w:rPr>
           <w:rFonts w:ascii="Arial" w:hAnsi="Arial" w:cs="Arial"/>
         </w:rPr>
-        <w:t xml:space="preserve"> y evitando de esta manera duplicados y multicuentas.</w:t>
+        <w:t xml:space="preserve"> y evitando de esta manera duplicados y </w:t>
+      </w:r>
+      <w:proofErr w:type="spellStart"/>
+      <w:r>
+        <w:rPr>
+          <w:rFonts w:ascii="Arial" w:hAnsi="Arial" w:cs="Arial"/>
+        </w:rPr>
+        <w:t>multicuentas</w:t>
+      </w:r>
+      <w:proofErr w:type="spellEnd"/>
+      <w:r>
+        <w:rPr>
+          <w:rFonts w:ascii="Arial" w:hAnsi="Arial" w:cs="Arial"/>
+        </w:rPr>
+        <w:t>.</w:t>
       </w:r>
     </w:p>
     <w:p>
@@ -5923,8 +6401,18 @@
           <w:b/>
           <w:bCs/>
         </w:rPr>
-        <w:t>dominio publico</w:t>
-      </w:r>
+        <w:t xml:space="preserve">dominio </w:t>
+      </w:r>
+      <w:proofErr w:type="spellStart"/>
+      <w:r>
+        <w:rPr>
+          <w:rFonts w:ascii="Arial" w:hAnsi="Arial" w:cs="Arial"/>
+          <w:b/>
+          <w:bCs/>
+        </w:rPr>
+        <w:t>publico</w:t>
+      </w:r>
+      <w:proofErr w:type="spellEnd"/>
       <w:r>
         <w:rPr>
           <w:rFonts w:ascii="Arial" w:hAnsi="Arial" w:cs="Arial"/>
@@ -5937,12 +6425,20 @@
         </w:rPr>
         <w:t xml:space="preserve">servidor (de preferencia </w:t>
       </w:r>
+      <w:proofErr w:type="spellStart"/>
       <w:proofErr w:type="gramStart"/>
       <w:r>
         <w:rPr>
           <w:rFonts w:ascii="Arial" w:hAnsi="Arial" w:cs="Arial"/>
         </w:rPr>
-        <w:t>vercel )</w:t>
+        <w:t>vercel</w:t>
+      </w:r>
+      <w:proofErr w:type="spellEnd"/>
+      <w:r>
+        <w:rPr>
+          <w:rFonts w:ascii="Arial" w:hAnsi="Arial" w:cs="Arial"/>
+        </w:rPr>
+        <w:t xml:space="preserve"> )</w:t>
       </w:r>
       <w:proofErr w:type="gramEnd"/>
     </w:p>
@@ -5964,6 +6460,7 @@
         </w:rPr>
         <w:t xml:space="preserve">El uso de </w:t>
       </w:r>
+      <w:proofErr w:type="spellStart"/>
       <w:r>
         <w:rPr>
           <w:rFonts w:ascii="Arial" w:hAnsi="Arial" w:cs="Arial"/>
@@ -5972,6 +6469,7 @@
         </w:rPr>
         <w:t>frameworks</w:t>
       </w:r>
+      <w:proofErr w:type="spellEnd"/>
       <w:r>
         <w:rPr>
           <w:rFonts w:ascii="Arial" w:hAnsi="Arial" w:cs="Arial"/>
@@ -6003,6 +6501,7 @@
         </w:rPr>
         <w:t xml:space="preserve">El uso de </w:t>
       </w:r>
+      <w:proofErr w:type="spellStart"/>
       <w:r>
         <w:rPr>
           <w:rFonts w:ascii="Arial" w:hAnsi="Arial" w:cs="Arial"/>
@@ -6011,6 +6510,7 @@
         </w:rPr>
         <w:t>react</w:t>
       </w:r>
+      <w:proofErr w:type="spellEnd"/>
       <w:r>
         <w:rPr>
           <w:rFonts w:ascii="Arial" w:hAnsi="Arial" w:cs="Arial"/>
@@ -6122,13 +6622,45 @@
           <w:b/>
           <w:bCs/>
         </w:rPr>
-        <w:t xml:space="preserve"> ia </w:t>
-      </w:r>
-      <w:r>
-        <w:rPr>
-          <w:rFonts w:ascii="Arial" w:hAnsi="Arial" w:cs="Arial"/>
-        </w:rPr>
-        <w:t>para la predicción de los gastos (muy improbable por un tema economico)</w:t>
+        <w:t xml:space="preserve"> </w:t>
+      </w:r>
+      <w:proofErr w:type="spellStart"/>
+      <w:r>
+        <w:rPr>
+          <w:rFonts w:ascii="Arial" w:hAnsi="Arial" w:cs="Arial"/>
+          <w:b/>
+          <w:bCs/>
+        </w:rPr>
+        <w:t>ia</w:t>
+      </w:r>
+      <w:proofErr w:type="spellEnd"/>
+      <w:r>
+        <w:rPr>
+          <w:rFonts w:ascii="Arial" w:hAnsi="Arial" w:cs="Arial"/>
+          <w:b/>
+          <w:bCs/>
+        </w:rPr>
+        <w:t xml:space="preserve"> </w:t>
+      </w:r>
+      <w:r>
+        <w:rPr>
+          <w:rFonts w:ascii="Arial" w:hAnsi="Arial" w:cs="Arial"/>
+        </w:rPr>
+        <w:t xml:space="preserve">para la predicción de los gastos (muy improbable por un tema </w:t>
+      </w:r>
+      <w:proofErr w:type="spellStart"/>
+      <w:r>
+        <w:rPr>
+          <w:rFonts w:ascii="Arial" w:hAnsi="Arial" w:cs="Arial"/>
+        </w:rPr>
+        <w:t>economico</w:t>
+      </w:r>
+      <w:proofErr w:type="spellEnd"/>
+      <w:r>
+        <w:rPr>
+          <w:rFonts w:ascii="Arial" w:hAnsi="Arial" w:cs="Arial"/>
+        </w:rPr>
+        <w:t>)</w:t>
       </w:r>
     </w:p>
     <w:p>
@@ -6142,7 +6674,21 @@
         <w:rPr>
           <w:rFonts w:ascii="Arial" w:hAnsi="Arial" w:cs="Arial"/>
         </w:rPr>
-        <w:t xml:space="preserve">Estos upgrades se entiende que son promesas a futuro </w:t>
+        <w:t xml:space="preserve">Estos </w:t>
+      </w:r>
+      <w:proofErr w:type="spellStart"/>
+      <w:r>
+        <w:rPr>
+          <w:rFonts w:ascii="Arial" w:hAnsi="Arial" w:cs="Arial"/>
+        </w:rPr>
+        <w:t>upgrades</w:t>
+      </w:r>
+      <w:proofErr w:type="spellEnd"/>
+      <w:r>
+        <w:rPr>
+          <w:rFonts w:ascii="Arial" w:hAnsi="Arial" w:cs="Arial"/>
+        </w:rPr>
+        <w:t xml:space="preserve"> se entiende que son promesas a futuro </w:t>
       </w:r>
       <w:r>
         <w:rPr>
@@ -6341,7 +6887,25 @@
           <w:b/>
           <w:bCs/>
         </w:rPr>
-        <w:t>visual studio code</w:t>
+        <w:t xml:space="preserve">visual </w:t>
+      </w:r>
+      <w:proofErr w:type="spellStart"/>
+      <w:r>
+        <w:rPr>
+          <w:rFonts w:ascii="Arial" w:hAnsi="Arial" w:cs="Arial"/>
+          <w:b/>
+          <w:bCs/>
+        </w:rPr>
+        <w:t>studio</w:t>
+      </w:r>
+      <w:proofErr w:type="spellEnd"/>
+      <w:r>
+        <w:rPr>
+          <w:rFonts w:ascii="Arial" w:hAnsi="Arial" w:cs="Arial"/>
+          <w:b/>
+          <w:bCs/>
+        </w:rPr>
+        <w:t xml:space="preserve"> code</w:t>
       </w:r>
       <w:r>
         <w:rPr>
@@ -6396,7 +6960,7 @@
                     </pic:cNvPicPr>
                   </pic:nvPicPr>
                   <pic:blipFill>
-                    <a:blip r:embed="rId9" cstate="print">
+                    <a:blip r:embed="rId11" cstate="print">
                       <a:extLst>
                         <a:ext uri="{28A0092B-C50C-407E-A947-70E740481C1C}">
                           <a14:useLocalDpi xmlns:a14="http://schemas.microsoft.com/office/drawing/2010/main" val="0"/>
@@ -6464,7 +7028,7 @@
           <w:b/>
           <w:bCs/>
         </w:rPr>
-        <w:t xml:space="preserve">nodejs, </w:t>
+        <w:t>vite</w:t>
       </w:r>
       <w:r>
         <w:rPr>
@@ -6472,15 +7036,16 @@
           <w:b/>
           <w:bCs/>
         </w:rPr>
-        <w:t xml:space="preserve">nextjs, </w:t>
-      </w:r>
+        <w:t xml:space="preserve">, </w:t>
+      </w:r>
+      <w:proofErr w:type="spellStart"/>
       <w:r>
         <w:rPr>
           <w:rFonts w:ascii="Arial" w:hAnsi="Arial" w:cs="Arial"/>
           <w:b/>
           <w:bCs/>
         </w:rPr>
-        <w:t>react, javascript, html y css</w:t>
+        <w:t>node</w:t>
       </w:r>
       <w:r>
         <w:rPr>
@@ -6488,6 +7053,87 @@
           <w:b/>
           <w:bCs/>
         </w:rPr>
+        <w:t>js</w:t>
+      </w:r>
+      <w:proofErr w:type="spellEnd"/>
+      <w:r>
+        <w:rPr>
+          <w:rFonts w:ascii="Arial" w:hAnsi="Arial" w:cs="Arial"/>
+          <w:b/>
+          <w:bCs/>
+        </w:rPr>
+        <w:t xml:space="preserve">, </w:t>
+      </w:r>
+      <w:proofErr w:type="spellStart"/>
+      <w:r>
+        <w:rPr>
+          <w:rFonts w:ascii="Arial" w:hAnsi="Arial" w:cs="Arial"/>
+          <w:b/>
+          <w:bCs/>
+        </w:rPr>
+        <w:t>react</w:t>
+      </w:r>
+      <w:proofErr w:type="spellEnd"/>
+      <w:r>
+        <w:rPr>
+          <w:rFonts w:ascii="Arial" w:hAnsi="Arial" w:cs="Arial"/>
+          <w:b/>
+          <w:bCs/>
+        </w:rPr>
+        <w:t xml:space="preserve">, </w:t>
+      </w:r>
+      <w:proofErr w:type="spellStart"/>
+      <w:r>
+        <w:rPr>
+          <w:rFonts w:ascii="Arial" w:hAnsi="Arial" w:cs="Arial"/>
+          <w:b/>
+          <w:bCs/>
+        </w:rPr>
+        <w:t>javascript</w:t>
+      </w:r>
+      <w:proofErr w:type="spellEnd"/>
+      <w:r>
+        <w:rPr>
+          <w:rFonts w:ascii="Arial" w:hAnsi="Arial" w:cs="Arial"/>
+          <w:b/>
+          <w:bCs/>
+        </w:rPr>
+        <w:t xml:space="preserve">, </w:t>
+      </w:r>
+      <w:proofErr w:type="spellStart"/>
+      <w:r>
+        <w:rPr>
+          <w:rFonts w:ascii="Arial" w:hAnsi="Arial" w:cs="Arial"/>
+          <w:b/>
+          <w:bCs/>
+        </w:rPr>
+        <w:t>html</w:t>
+      </w:r>
+      <w:proofErr w:type="spellEnd"/>
+      <w:r>
+        <w:rPr>
+          <w:rFonts w:ascii="Arial" w:hAnsi="Arial" w:cs="Arial"/>
+          <w:b/>
+          <w:bCs/>
+        </w:rPr>
+        <w:t xml:space="preserve"> y </w:t>
+      </w:r>
+      <w:proofErr w:type="spellStart"/>
+      <w:r>
+        <w:rPr>
+          <w:rFonts w:ascii="Arial" w:hAnsi="Arial" w:cs="Arial"/>
+          <w:b/>
+          <w:bCs/>
+        </w:rPr>
+        <w:t>css</w:t>
+      </w:r>
+      <w:proofErr w:type="spellEnd"/>
+      <w:r>
+        <w:rPr>
+          <w:rFonts w:ascii="Arial" w:hAnsi="Arial" w:cs="Arial"/>
+          <w:b/>
+          <w:bCs/>
+        </w:rPr>
         <w:t>.</w:t>
       </w:r>
     </w:p>
@@ -6504,10 +7150,10 @@
           <w:noProof/>
         </w:rPr>
         <w:drawing>
-          <wp:inline distT="0" distB="0" distL="0" distR="0" wp14:anchorId="06FD80F8" wp14:editId="4BD2BB3A">
-            <wp:extent cx="702260" cy="702260"/>
-            <wp:effectExtent l="0" t="0" r="3175" b="3175"/>
-            <wp:docPr id="1375732879" name="Imagen 10" descr="Next.js | Technology | Major Digital"/>
+          <wp:inline distT="0" distB="0" distL="0" distR="0" wp14:anchorId="5FF91FCF" wp14:editId="248B9FD0">
+            <wp:extent cx="1133475" cy="693687"/>
+            <wp:effectExtent l="0" t="0" r="0" b="0"/>
+            <wp:docPr id="1995965409" name="Imagen 3"/>
             <wp:cNvGraphicFramePr>
               <a:graphicFrameLocks xmlns:a="http://schemas.openxmlformats.org/drawingml/2006/main" noChangeAspect="1"/>
             </wp:cNvGraphicFramePr>
@@ -6515,13 +7161,13 @@
               <a:graphicData uri="http://schemas.openxmlformats.org/drawingml/2006/picture">
                 <pic:pic xmlns:pic="http://schemas.openxmlformats.org/drawingml/2006/picture">
                   <pic:nvPicPr>
-                    <pic:cNvPr id="0" name="Picture 2" descr="Next.js | Technology | Major Digital"/>
+                    <pic:cNvPr id="0" name="Picture 1"/>
                     <pic:cNvPicPr>
                       <a:picLocks noChangeAspect="1" noChangeArrowheads="1"/>
                     </pic:cNvPicPr>
                   </pic:nvPicPr>
                   <pic:blipFill>
-                    <a:blip r:embed="rId10" cstate="print">
+                    <a:blip r:embed="rId12">
                       <a:extLst>
                         <a:ext uri="{28A0092B-C50C-407E-A947-70E740481C1C}">
                           <a14:useLocalDpi xmlns:a14="http://schemas.microsoft.com/office/drawing/2010/main" val="0"/>
@@ -6536,7 +7182,7 @@
                   <pic:spPr bwMode="auto">
                     <a:xfrm>
                       <a:off x="0" y="0"/>
-                      <a:ext cx="708010" cy="708010"/>
+                      <a:ext cx="1150008" cy="703805"/>
                     </a:xfrm>
                     <a:prstGeom prst="rect">
                       <a:avLst/>
@@ -6582,7 +7228,7 @@
                     </pic:cNvPicPr>
                   </pic:nvPicPr>
                   <pic:blipFill>
-                    <a:blip r:embed="rId11" cstate="print">
+                    <a:blip r:embed="rId13" cstate="print">
                       <a:extLst>
                         <a:ext uri="{28A0092B-C50C-407E-A947-70E740481C1C}">
                           <a14:useLocalDpi xmlns:a14="http://schemas.microsoft.com/office/drawing/2010/main" val="0"/>
@@ -6648,7 +7294,7 @@
                     </pic:cNvPicPr>
                   </pic:nvPicPr>
                   <pic:blipFill>
-                    <a:blip r:embed="rId12" cstate="print">
+                    <a:blip r:embed="rId14" cstate="print">
                       <a:extLst>
                         <a:ext uri="{28A0092B-C50C-407E-A947-70E740481C1C}">
                           <a14:useLocalDpi xmlns:a14="http://schemas.microsoft.com/office/drawing/2010/main" val="0"/>
@@ -6714,7 +7360,7 @@
                     </pic:cNvPicPr>
                   </pic:nvPicPr>
                   <pic:blipFill>
-                    <a:blip r:embed="rId13" cstate="print">
+                    <a:blip r:embed="rId15" cstate="print">
                       <a:extLst>
                         <a:ext uri="{28A0092B-C50C-407E-A947-70E740481C1C}">
                           <a14:useLocalDpi xmlns:a14="http://schemas.microsoft.com/office/drawing/2010/main" val="0"/>
@@ -6780,7 +7426,7 @@
                     </pic:cNvPicPr>
                   </pic:nvPicPr>
                   <pic:blipFill>
-                    <a:blip r:embed="rId14" cstate="print">
+                    <a:blip r:embed="rId16" cstate="print">
                       <a:extLst>
                         <a:ext uri="{28A0092B-C50C-407E-A947-70E740481C1C}">
                           <a14:useLocalDpi xmlns:a14="http://schemas.microsoft.com/office/drawing/2010/main" val="0"/>
@@ -6846,7 +7492,7 @@
                     </pic:cNvPicPr>
                   </pic:nvPicPr>
                   <pic:blipFill>
-                    <a:blip r:embed="rId15" cstate="print">
+                    <a:blip r:embed="rId17" cstate="print">
                       <a:extLst>
                         <a:ext uri="{28A0092B-C50C-407E-A947-70E740481C1C}">
                           <a14:useLocalDpi xmlns:a14="http://schemas.microsoft.com/office/drawing/2010/main" val="0"/>
@@ -6946,7 +7592,7 @@
                     </pic:cNvPicPr>
                   </pic:nvPicPr>
                   <pic:blipFill>
-                    <a:blip r:embed="rId16">
+                    <a:blip r:embed="rId18">
                       <a:extLst>
                         <a:ext uri="{28A0092B-C50C-407E-A947-70E740481C1C}">
                           <a14:useLocalDpi xmlns:a14="http://schemas.microsoft.com/office/drawing/2010/main" val="0"/>
@@ -6992,7 +7638,21 @@
         <w:rPr>
           <w:rFonts w:ascii="Arial" w:hAnsi="Arial" w:cs="Arial"/>
         </w:rPr>
-        <w:t xml:space="preserve"> y inspiración artística </w:t>
+        <w:t xml:space="preserve"> </w:t>
+      </w:r>
+      <w:proofErr w:type="spellStart"/>
+      <w:r>
+        <w:rPr>
+          <w:rFonts w:ascii="Arial" w:hAnsi="Arial" w:cs="Arial"/>
+        </w:rPr>
+        <w:t>y</w:t>
+      </w:r>
+      <w:proofErr w:type="spellEnd"/>
+      <w:r>
+        <w:rPr>
+          <w:rFonts w:ascii="Arial" w:hAnsi="Arial" w:cs="Arial"/>
+        </w:rPr>
+        <w:t xml:space="preserve"> inspiración artística </w:t>
       </w:r>
       <w:r>
         <w:rPr>
@@ -7024,6 +7684,7 @@
         </w:rPr>
         <w:t xml:space="preserve"> y </w:t>
       </w:r>
+      <w:proofErr w:type="spellStart"/>
       <w:r>
         <w:rPr>
           <w:rFonts w:ascii="Arial" w:hAnsi="Arial" w:cs="Arial"/>
@@ -7032,6 +7693,7 @@
         </w:rPr>
         <w:t>ninjamok</w:t>
       </w:r>
+      <w:proofErr w:type="spellEnd"/>
       <w:r>
         <w:rPr>
           <w:rFonts w:ascii="Arial" w:hAnsi="Arial" w:cs="Arial"/>
@@ -7077,7 +7739,7 @@
                     </pic:cNvPicPr>
                   </pic:nvPicPr>
                   <pic:blipFill>
-                    <a:blip r:embed="rId17" cstate="print">
+                    <a:blip r:embed="rId19" cstate="print">
                       <a:extLst>
                         <a:ext uri="{28A0092B-C50C-407E-A947-70E740481C1C}">
                           <a14:useLocalDpi xmlns:a14="http://schemas.microsoft.com/office/drawing/2010/main" val="0"/>
@@ -7114,7 +7776,7 @@
           <w:noProof/>
         </w:rPr>
         <w:drawing>
-          <wp:inline distT="0" distB="0" distL="0" distR="0" wp14:anchorId="27328E49" wp14:editId="71C05E4B">
+          <wp:inline distT="0" distB="0" distL="0" distR="0" wp14:anchorId="27328E49" wp14:editId="720630E0">
             <wp:extent cx="620725" cy="620725"/>
             <wp:effectExtent l="0" t="0" r="8255" b="8255"/>
             <wp:docPr id="86521544" name="Imagen 19" descr="Ninjamock | LinkedIn"/>
@@ -7131,7 +7793,7 @@
                     </pic:cNvPicPr>
                   </pic:nvPicPr>
                   <pic:blipFill>
-                    <a:blip r:embed="rId18" cstate="print">
+                    <a:blip r:embed="rId20" cstate="print">
                       <a:extLst>
                         <a:ext uri="{28A0092B-C50C-407E-A947-70E740481C1C}">
                           <a14:useLocalDpi xmlns:a14="http://schemas.microsoft.com/office/drawing/2010/main" val="0"/>
@@ -7185,7 +7847,7 @@
                     </pic:cNvPicPr>
                   </pic:nvPicPr>
                   <pic:blipFill>
-                    <a:blip r:embed="rId19">
+                    <a:blip r:embed="rId21">
                       <a:extLst>
                         <a:ext uri="{28A0092B-C50C-407E-A947-70E740481C1C}">
                           <a14:useLocalDpi xmlns:a14="http://schemas.microsoft.com/office/drawing/2010/main" val="0"/>
@@ -7230,7 +7892,21 @@
         <w:rPr>
           <w:rFonts w:ascii="Arial" w:hAnsi="Arial" w:cs="Arial"/>
         </w:rPr>
-        <w:t xml:space="preserve">Para ejecutar nodejs y tener un proyecto portable </w:t>
+        <w:t xml:space="preserve">Para ejecutar </w:t>
+      </w:r>
+      <w:proofErr w:type="spellStart"/>
+      <w:r>
+        <w:rPr>
+          <w:rFonts w:ascii="Arial" w:hAnsi="Arial" w:cs="Arial"/>
+        </w:rPr>
+        <w:t>nodejs</w:t>
+      </w:r>
+      <w:proofErr w:type="spellEnd"/>
+      <w:r>
+        <w:rPr>
+          <w:rFonts w:ascii="Arial" w:hAnsi="Arial" w:cs="Arial"/>
+        </w:rPr>
+        <w:t xml:space="preserve"> y tener un proyecto portable </w:t>
       </w:r>
       <w:r>
         <w:rPr>
@@ -7272,7 +7948,7 @@
                     </pic:cNvPicPr>
                   </pic:nvPicPr>
                   <pic:blipFill>
-                    <a:blip r:embed="rId20" cstate="print">
+                    <a:blip r:embed="rId22" cstate="print">
                       <a:extLst>
                         <a:ext uri="{28A0092B-C50C-407E-A947-70E740481C1C}">
                           <a14:useLocalDpi xmlns:a14="http://schemas.microsoft.com/office/drawing/2010/main" val="0"/>
@@ -7380,7 +8056,7 @@
                     </pic:cNvPicPr>
                   </pic:nvPicPr>
                   <pic:blipFill>
-                    <a:blip r:embed="rId21">
+                    <a:blip r:embed="rId23">
                       <a:extLst>
                         <a:ext uri="{28A0092B-C50C-407E-A947-70E740481C1C}">
                           <a14:useLocalDpi xmlns:a14="http://schemas.microsoft.com/office/drawing/2010/main" val="0"/>
@@ -7434,7 +8110,7 @@
                     </pic:cNvPicPr>
                   </pic:nvPicPr>
                   <pic:blipFill>
-                    <a:blip r:embed="rId22" cstate="print">
+                    <a:blip r:embed="rId24" cstate="print">
                       <a:extLst>
                         <a:ext uri="{28A0092B-C50C-407E-A947-70E740481C1C}">
                           <a14:useLocalDpi xmlns:a14="http://schemas.microsoft.com/office/drawing/2010/main" val="0"/>
@@ -7624,7 +8300,35 @@
         <w:rPr>
           <w:rFonts w:ascii="Arial" w:hAnsi="Arial" w:cs="Arial"/>
         </w:rPr>
-        <w:t>Next.js y React para el frontend, Node.js para la lógica del servidor y MySQL como base de datos. El entorno corre sobre Docker, lo que garantiza que el proyecto sea portable y funcione igual en cualquier máquina, facilitando tanto el desarrollo como un posible despliegue futuro en un dominio público, preferiblemente en</w:t>
+        <w:t xml:space="preserve">Next.js y </w:t>
+      </w:r>
+      <w:proofErr w:type="spellStart"/>
+      <w:r>
+        <w:rPr>
+          <w:rFonts w:ascii="Arial" w:hAnsi="Arial" w:cs="Arial"/>
+        </w:rPr>
+        <w:t>React</w:t>
+      </w:r>
+      <w:proofErr w:type="spellEnd"/>
+      <w:r>
+        <w:rPr>
+          <w:rFonts w:ascii="Arial" w:hAnsi="Arial" w:cs="Arial"/>
+        </w:rPr>
+        <w:t xml:space="preserve"> para el </w:t>
+      </w:r>
+      <w:proofErr w:type="spellStart"/>
+      <w:r>
+        <w:rPr>
+          <w:rFonts w:ascii="Arial" w:hAnsi="Arial" w:cs="Arial"/>
+        </w:rPr>
+        <w:t>frontend</w:t>
+      </w:r>
+      <w:proofErr w:type="spellEnd"/>
+      <w:r>
+        <w:rPr>
+          <w:rFonts w:ascii="Arial" w:hAnsi="Arial" w:cs="Arial"/>
+        </w:rPr>
+        <w:t>, Node.js para la lógica del servidor y MySQL como base de datos. El entorno corre sobre Docker, lo que garantiza que el proyecto sea portable y funcione igual en cualquier máquina, facilitando tanto el desarrollo como un posible despliegue futuro en un dominio público, preferiblemente en</w:t>
       </w:r>
       <w:r>
         <w:rPr>
@@ -7636,7 +8340,21 @@
         <w:rPr>
           <w:rFonts w:ascii="Arial" w:hAnsi="Arial" w:cs="Arial"/>
         </w:rPr>
-        <w:t xml:space="preserve"> Vercel.</w:t>
+        <w:t xml:space="preserve"> </w:t>
+      </w:r>
+      <w:proofErr w:type="spellStart"/>
+      <w:r>
+        <w:rPr>
+          <w:rFonts w:ascii="Arial" w:hAnsi="Arial" w:cs="Arial"/>
+        </w:rPr>
+        <w:t>Vercel</w:t>
+      </w:r>
+      <w:proofErr w:type="spellEnd"/>
+      <w:r>
+        <w:rPr>
+          <w:rFonts w:ascii="Arial" w:hAnsi="Arial" w:cs="Arial"/>
+        </w:rPr>
+        <w:t>.</w:t>
       </w:r>
     </w:p>
     <w:p>
@@ -7714,7 +8432,35 @@
         <w:rPr>
           <w:rFonts w:ascii="Arial" w:hAnsi="Arial" w:cs="Arial"/>
         </w:rPr>
-        <w:t>El navegador del usuario, que es el punto de entrada a la aplicación a través del frontend construido con Next.js y React.</w:t>
+        <w:t xml:space="preserve">El navegador del usuario, que es el punto de entrada a la aplicación a través del </w:t>
+      </w:r>
+      <w:proofErr w:type="spellStart"/>
+      <w:r>
+        <w:rPr>
+          <w:rFonts w:ascii="Arial" w:hAnsi="Arial" w:cs="Arial"/>
+        </w:rPr>
+        <w:t>frontend</w:t>
+      </w:r>
+      <w:proofErr w:type="spellEnd"/>
+      <w:r>
+        <w:rPr>
+          <w:rFonts w:ascii="Arial" w:hAnsi="Arial" w:cs="Arial"/>
+        </w:rPr>
+        <w:t xml:space="preserve"> construido con Next.js y </w:t>
+      </w:r>
+      <w:proofErr w:type="spellStart"/>
+      <w:r>
+        <w:rPr>
+          <w:rFonts w:ascii="Arial" w:hAnsi="Arial" w:cs="Arial"/>
+        </w:rPr>
+        <w:t>React</w:t>
+      </w:r>
+      <w:proofErr w:type="spellEnd"/>
+      <w:r>
+        <w:rPr>
+          <w:rFonts w:ascii="Arial" w:hAnsi="Arial" w:cs="Arial"/>
+        </w:rPr>
+        <w:t>.</w:t>
       </w:r>
     </w:p>
     <w:p>
@@ -7811,7 +8557,21 @@
         <w:rPr>
           <w:rFonts w:ascii="Arial" w:hAnsi="Arial" w:cs="Arial"/>
         </w:rPr>
-        <w:t xml:space="preserve"> limitado claramente desde el punto de vista de la gestión de activos en tiempo real, como por ejemplo la gestión de acciones, criptos o </w:t>
+        <w:t xml:space="preserve"> limitado claramente desde el punto de vista de la gestión de activos en tiempo real, como por ejemplo la gestión de acciones, </w:t>
+      </w:r>
+      <w:proofErr w:type="spellStart"/>
+      <w:r>
+        <w:rPr>
+          <w:rFonts w:ascii="Arial" w:hAnsi="Arial" w:cs="Arial"/>
+        </w:rPr>
+        <w:t>criptos</w:t>
+      </w:r>
+      <w:proofErr w:type="spellEnd"/>
+      <w:r>
+        <w:rPr>
+          <w:rFonts w:ascii="Arial" w:hAnsi="Arial" w:cs="Arial"/>
+        </w:rPr>
+        <w:t xml:space="preserve"> o </w:t>
       </w:r>
       <w:r>
         <w:rPr>
@@ -7831,7 +8591,21 @@
         <w:rPr>
           <w:rFonts w:ascii="Arial" w:hAnsi="Arial" w:cs="Arial"/>
         </w:rPr>
-        <w:t xml:space="preserve"> valor de manera semialeatoria y es imposible predecirlos de cara al </w:t>
+        <w:t xml:space="preserve"> valor de manera </w:t>
+      </w:r>
+      <w:proofErr w:type="spellStart"/>
+      <w:r>
+        <w:rPr>
+          <w:rFonts w:ascii="Arial" w:hAnsi="Arial" w:cs="Arial"/>
+        </w:rPr>
+        <w:t>semialeatoria</w:t>
+      </w:r>
+      <w:proofErr w:type="spellEnd"/>
+      <w:r>
+        <w:rPr>
+          <w:rFonts w:ascii="Arial" w:hAnsi="Arial" w:cs="Arial"/>
+        </w:rPr>
+        <w:t xml:space="preserve"> y es imposible predecirlos de cara al </w:t>
       </w:r>
       <w:r>
         <w:rPr>
@@ -8002,11 +8776,19 @@
           <w:rFonts w:ascii="Arial" w:hAnsi="Arial" w:cs="Arial"/>
         </w:rPr>
       </w:pPr>
-      <w:r>
-        <w:rPr>
-          <w:rFonts w:ascii="Arial" w:hAnsi="Arial" w:cs="Arial"/>
-        </w:rPr>
-        <w:t>Grafico de evolución económica</w:t>
+      <w:proofErr w:type="spellStart"/>
+      <w:r>
+        <w:rPr>
+          <w:rFonts w:ascii="Arial" w:hAnsi="Arial" w:cs="Arial"/>
+        </w:rPr>
+        <w:t>Grafico</w:t>
+      </w:r>
+      <w:proofErr w:type="spellEnd"/>
+      <w:r>
+        <w:rPr>
+          <w:rFonts w:ascii="Arial" w:hAnsi="Arial" w:cs="Arial"/>
+        </w:rPr>
+        <w:t xml:space="preserve"> de evolución económica</w:t>
       </w:r>
     </w:p>
     <w:p>
@@ -8044,7 +8826,21 @@
         <w:rPr>
           <w:rFonts w:ascii="Arial" w:hAnsi="Arial" w:cs="Arial"/>
         </w:rPr>
-        <w:t>Añadir ingresos periódicos (Ej sueldo)</w:t>
+        <w:t>Añadir ingresos periódicos (</w:t>
+      </w:r>
+      <w:proofErr w:type="spellStart"/>
+      <w:r>
+        <w:rPr>
+          <w:rFonts w:ascii="Arial" w:hAnsi="Arial" w:cs="Arial"/>
+        </w:rPr>
+        <w:t>Ej</w:t>
+      </w:r>
+      <w:proofErr w:type="spellEnd"/>
+      <w:r>
+        <w:rPr>
+          <w:rFonts w:ascii="Arial" w:hAnsi="Arial" w:cs="Arial"/>
+        </w:rPr>
+        <w:t xml:space="preserve"> sueldo)</w:t>
       </w:r>
     </w:p>
     <w:p>
@@ -8101,7 +8897,49 @@
         <w:rPr>
           <w:rFonts w:ascii="Arial" w:hAnsi="Arial" w:cs="Arial"/>
         </w:rPr>
-        <w:t>aplicación son admin y usuario, también puede existir un usuario teórico que seria el guest que es un usuario que no ha iniciado sesión</w:t>
+        <w:t xml:space="preserve">aplicación son </w:t>
+      </w:r>
+      <w:proofErr w:type="spellStart"/>
+      <w:r>
+        <w:rPr>
+          <w:rFonts w:ascii="Arial" w:hAnsi="Arial" w:cs="Arial"/>
+        </w:rPr>
+        <w:t>admin</w:t>
+      </w:r>
+      <w:proofErr w:type="spellEnd"/>
+      <w:r>
+        <w:rPr>
+          <w:rFonts w:ascii="Arial" w:hAnsi="Arial" w:cs="Arial"/>
+        </w:rPr>
+        <w:t xml:space="preserve"> y usuario, también puede existir un usuario teórico que </w:t>
+      </w:r>
+      <w:proofErr w:type="spellStart"/>
+      <w:r>
+        <w:rPr>
+          <w:rFonts w:ascii="Arial" w:hAnsi="Arial" w:cs="Arial"/>
+        </w:rPr>
+        <w:t>seria</w:t>
+      </w:r>
+      <w:proofErr w:type="spellEnd"/>
+      <w:r>
+        <w:rPr>
+          <w:rFonts w:ascii="Arial" w:hAnsi="Arial" w:cs="Arial"/>
+        </w:rPr>
+        <w:t xml:space="preserve"> el </w:t>
+      </w:r>
+      <w:proofErr w:type="spellStart"/>
+      <w:r>
+        <w:rPr>
+          <w:rFonts w:ascii="Arial" w:hAnsi="Arial" w:cs="Arial"/>
+        </w:rPr>
+        <w:t>guest</w:t>
+      </w:r>
+      <w:proofErr w:type="spellEnd"/>
+      <w:r>
+        <w:rPr>
+          <w:rFonts w:ascii="Arial" w:hAnsi="Arial" w:cs="Arial"/>
+        </w:rPr>
+        <w:t xml:space="preserve"> que es un usuario que no ha iniciado sesión</w:t>
       </w:r>
     </w:p>
     <w:p>
@@ -8117,19 +8955,31 @@
         </w:rPr>
         <w:t xml:space="preserve">Estos usuarios se </w:t>
       </w:r>
-      <w:proofErr w:type="gramStart"/>
-      <w:r>
-        <w:rPr>
-          <w:rFonts w:ascii="Arial" w:hAnsi="Arial" w:cs="Arial"/>
-        </w:rPr>
-        <w:t>almacenaran</w:t>
-      </w:r>
-      <w:proofErr w:type="gramEnd"/>
-      <w:r>
-        <w:rPr>
-          <w:rFonts w:ascii="Arial" w:hAnsi="Arial" w:cs="Arial"/>
-        </w:rPr>
-        <w:t xml:space="preserve"> en una tabla de users.</w:t>
+      <w:r>
+        <w:rPr>
+          <w:rFonts w:ascii="Arial" w:hAnsi="Arial" w:cs="Arial"/>
+        </w:rPr>
+        <w:t>almacenarán</w:t>
+      </w:r>
+      <w:r>
+        <w:rPr>
+          <w:rFonts w:ascii="Arial" w:hAnsi="Arial" w:cs="Arial"/>
+        </w:rPr>
+        <w:t xml:space="preserve"> en una tabla de </w:t>
+      </w:r>
+      <w:proofErr w:type="spellStart"/>
+      <w:r>
+        <w:rPr>
+          <w:rFonts w:ascii="Arial" w:hAnsi="Arial" w:cs="Arial"/>
+        </w:rPr>
+        <w:t>users</w:t>
+      </w:r>
+      <w:proofErr w:type="spellEnd"/>
+      <w:r>
+        <w:rPr>
+          <w:rFonts w:ascii="Arial" w:hAnsi="Arial" w:cs="Arial"/>
+        </w:rPr>
+        <w:t>.</w:t>
       </w:r>
     </w:p>
     <w:p>
@@ -8186,8 +9036,30 @@
         <w:rPr>
           <w:rFonts w:ascii="Arial" w:hAnsi="Arial" w:cs="Arial"/>
         </w:rPr>
-        <w:t>(panel web de inicio de sesión, bd, rol de admin</w:t>
-      </w:r>
+        <w:t xml:space="preserve">(panel web de inicio de sesión, </w:t>
+      </w:r>
+      <w:proofErr w:type="spellStart"/>
+      <w:r>
+        <w:rPr>
+          <w:rFonts w:ascii="Arial" w:hAnsi="Arial" w:cs="Arial"/>
+        </w:rPr>
+        <w:t>bd</w:t>
+      </w:r>
+      <w:proofErr w:type="spellEnd"/>
+      <w:r>
+        <w:rPr>
+          <w:rFonts w:ascii="Arial" w:hAnsi="Arial" w:cs="Arial"/>
+        </w:rPr>
+        <w:t xml:space="preserve">, rol de </w:t>
+      </w:r>
+      <w:proofErr w:type="spellStart"/>
+      <w:r>
+        <w:rPr>
+          <w:rFonts w:ascii="Arial" w:hAnsi="Arial" w:cs="Arial"/>
+        </w:rPr>
+        <w:t>admin</w:t>
+      </w:r>
+      <w:proofErr w:type="spellEnd"/>
       <w:r>
         <w:rPr>
           <w:rFonts w:ascii="Arial" w:hAnsi="Arial" w:cs="Arial"/>
@@ -8274,8 +9146,16 @@
         <w:rPr>
           <w:rFonts w:ascii="Arial" w:hAnsi="Arial" w:cs="Arial"/>
         </w:rPr>
-        <w:t xml:space="preserve"> estará alojada en un servidor de vercel</w:t>
-      </w:r>
+        <w:t xml:space="preserve"> estará alojada en un servidor de </w:t>
+      </w:r>
+      <w:proofErr w:type="spellStart"/>
+      <w:r>
+        <w:rPr>
+          <w:rFonts w:ascii="Arial" w:hAnsi="Arial" w:cs="Arial"/>
+        </w:rPr>
+        <w:t>vercel</w:t>
+      </w:r>
+      <w:proofErr w:type="spellEnd"/>
       <w:r>
         <w:rPr>
           <w:rFonts w:ascii="Arial" w:hAnsi="Arial" w:cs="Arial"/>
@@ -8299,13 +9179,41 @@
         <w:rPr>
           <w:rFonts w:ascii="Arial" w:hAnsi="Arial" w:cs="Arial"/>
         </w:rPr>
-        <w:t xml:space="preserve">El Docker compose </w:t>
-      </w:r>
-      <w:r>
-        <w:rPr>
-          <w:rFonts w:ascii="Arial" w:hAnsi="Arial" w:cs="Arial"/>
-        </w:rPr>
-        <w:t xml:space="preserve">y Dockerfile </w:t>
+        <w:t xml:space="preserve">El Docker </w:t>
+      </w:r>
+      <w:proofErr w:type="spellStart"/>
+      <w:r>
+        <w:rPr>
+          <w:rFonts w:ascii="Arial" w:hAnsi="Arial" w:cs="Arial"/>
+        </w:rPr>
+        <w:t>compose</w:t>
+      </w:r>
+      <w:proofErr w:type="spellEnd"/>
+      <w:r>
+        <w:rPr>
+          <w:rFonts w:ascii="Arial" w:hAnsi="Arial" w:cs="Arial"/>
+        </w:rPr>
+        <w:t xml:space="preserve"> </w:t>
+      </w:r>
+      <w:r>
+        <w:rPr>
+          <w:rFonts w:ascii="Arial" w:hAnsi="Arial" w:cs="Arial"/>
+        </w:rPr>
+        <w:t xml:space="preserve">y </w:t>
+      </w:r>
+      <w:proofErr w:type="spellStart"/>
+      <w:r>
+        <w:rPr>
+          <w:rFonts w:ascii="Arial" w:hAnsi="Arial" w:cs="Arial"/>
+        </w:rPr>
+        <w:t>Dockerfile</w:t>
+      </w:r>
+      <w:proofErr w:type="spellEnd"/>
+      <w:r>
+        <w:rPr>
+          <w:rFonts w:ascii="Arial" w:hAnsi="Arial" w:cs="Arial"/>
+        </w:rPr>
+        <w:t xml:space="preserve"> </w:t>
       </w:r>
       <w:r>
         <w:rPr>
@@ -8334,12 +9242,20 @@
           <w:rFonts w:ascii="Arial" w:hAnsi="Arial" w:cs="Arial"/>
         </w:rPr>
       </w:pPr>
+      <w:proofErr w:type="spellStart"/>
       <w:r>
         <w:rPr>
           <w:rFonts w:ascii="Arial" w:hAnsi="Arial" w:cs="Arial"/>
         </w:rPr>
         <w:lastRenderedPageBreak/>
-        <w:t>Compose:</w:t>
+        <w:t>Compose</w:t>
+      </w:r>
+      <w:proofErr w:type="spellEnd"/>
+      <w:r>
+        <w:rPr>
+          <w:rFonts w:ascii="Arial" w:hAnsi="Arial" w:cs="Arial"/>
+        </w:rPr>
+        <w:t>:</w:t>
       </w:r>
       <w:r>
         <w:rPr>
@@ -8368,7 +9284,7 @@
                     <pic:cNvPicPr/>
                   </pic:nvPicPr>
                   <pic:blipFill>
-                    <a:blip r:embed="rId23"/>
+                    <a:blip r:embed="rId25"/>
                     <a:stretch>
                       <a:fillRect/>
                     </a:stretch>
@@ -8418,7 +9334,7 @@
                     <pic:cNvPicPr/>
                   </pic:nvPicPr>
                   <pic:blipFill>
-                    <a:blip r:embed="rId24"/>
+                    <a:blip r:embed="rId26"/>
                     <a:stretch>
                       <a:fillRect/>
                     </a:stretch>
@@ -8445,11 +9361,19 @@
           <w:rFonts w:ascii="Arial" w:hAnsi="Arial" w:cs="Arial"/>
         </w:rPr>
       </w:pPr>
-      <w:r>
-        <w:rPr>
-          <w:rFonts w:ascii="Arial" w:hAnsi="Arial" w:cs="Arial"/>
-        </w:rPr>
-        <w:t>Dokerfile:</w:t>
+      <w:proofErr w:type="spellStart"/>
+      <w:r>
+        <w:rPr>
+          <w:rFonts w:ascii="Arial" w:hAnsi="Arial" w:cs="Arial"/>
+        </w:rPr>
+        <w:t>Dokerfile</w:t>
+      </w:r>
+      <w:proofErr w:type="spellEnd"/>
+      <w:r>
+        <w:rPr>
+          <w:rFonts w:ascii="Arial" w:hAnsi="Arial" w:cs="Arial"/>
+        </w:rPr>
+        <w:t>:</w:t>
       </w:r>
     </w:p>
     <w:p>
@@ -8479,7 +9403,7 @@
                     <pic:cNvPicPr/>
                   </pic:nvPicPr>
                   <pic:blipFill>
-                    <a:blip r:embed="rId25"/>
+                    <a:blip r:embed="rId27"/>
                     <a:stretch>
                       <a:fillRect/>
                     </a:stretch>
@@ -8513,7 +9437,23 @@
           <w:lang w:val="en-US"/>
         </w:rPr>
         <w:lastRenderedPageBreak/>
-        <w:t xml:space="preserve">Script entrypoint de auto </w:t>
+        <w:t xml:space="preserve">Script </w:t>
+      </w:r>
+      <w:proofErr w:type="spellStart"/>
+      <w:r>
+        <w:rPr>
+          <w:rFonts w:ascii="Arial" w:hAnsi="Arial" w:cs="Arial"/>
+          <w:lang w:val="en-US"/>
+        </w:rPr>
+        <w:t>entrypoint</w:t>
+      </w:r>
+      <w:proofErr w:type="spellEnd"/>
+      <w:r>
+        <w:rPr>
+          <w:rFonts w:ascii="Arial" w:hAnsi="Arial" w:cs="Arial"/>
+          <w:lang w:val="en-US"/>
+        </w:rPr>
+        <w:t xml:space="preserve"> de auto </w:t>
       </w:r>
       <w:proofErr w:type="gramStart"/>
       <w:r>
@@ -8561,7 +9501,7 @@
                     <pic:cNvPicPr/>
                   </pic:nvPicPr>
                   <pic:blipFill>
-                    <a:blip r:embed="rId26"/>
+                    <a:blip r:embed="rId28"/>
                     <a:stretch>
                       <a:fillRect/>
                     </a:stretch>
@@ -8601,7 +9541,119 @@
         <w:rPr>
           <w:rFonts w:ascii="Arial" w:hAnsi="Arial" w:cs="Arial"/>
         </w:rPr>
-        <w:t xml:space="preserve">Una vez descargado el docker compose con el proyecto que estará en github simplemente haciendo un compose up y ejecutando el script sql de la bd con el php my admin se debería </w:t>
+        <w:t xml:space="preserve">Una vez descargado el </w:t>
+      </w:r>
+      <w:proofErr w:type="spellStart"/>
+      <w:r>
+        <w:rPr>
+          <w:rFonts w:ascii="Arial" w:hAnsi="Arial" w:cs="Arial"/>
+        </w:rPr>
+        <w:t>docker</w:t>
+      </w:r>
+      <w:proofErr w:type="spellEnd"/>
+      <w:r>
+        <w:rPr>
+          <w:rFonts w:ascii="Arial" w:hAnsi="Arial" w:cs="Arial"/>
+        </w:rPr>
+        <w:t xml:space="preserve"> </w:t>
+      </w:r>
+      <w:proofErr w:type="spellStart"/>
+      <w:r>
+        <w:rPr>
+          <w:rFonts w:ascii="Arial" w:hAnsi="Arial" w:cs="Arial"/>
+        </w:rPr>
+        <w:t>compose</w:t>
+      </w:r>
+      <w:proofErr w:type="spellEnd"/>
+      <w:r>
+        <w:rPr>
+          <w:rFonts w:ascii="Arial" w:hAnsi="Arial" w:cs="Arial"/>
+        </w:rPr>
+        <w:t xml:space="preserve"> con el proyecto que estará en github simplemente haciendo un </w:t>
+      </w:r>
+      <w:proofErr w:type="spellStart"/>
+      <w:r>
+        <w:rPr>
+          <w:rFonts w:ascii="Arial" w:hAnsi="Arial" w:cs="Arial"/>
+        </w:rPr>
+        <w:t>compose</w:t>
+      </w:r>
+      <w:proofErr w:type="spellEnd"/>
+      <w:r>
+        <w:rPr>
+          <w:rFonts w:ascii="Arial" w:hAnsi="Arial" w:cs="Arial"/>
+        </w:rPr>
+        <w:t xml:space="preserve"> up y ejecutando el script </w:t>
+      </w:r>
+      <w:proofErr w:type="spellStart"/>
+      <w:r>
+        <w:rPr>
+          <w:rFonts w:ascii="Arial" w:hAnsi="Arial" w:cs="Arial"/>
+        </w:rPr>
+        <w:t>sql</w:t>
+      </w:r>
+      <w:proofErr w:type="spellEnd"/>
+      <w:r>
+        <w:rPr>
+          <w:rFonts w:ascii="Arial" w:hAnsi="Arial" w:cs="Arial"/>
+        </w:rPr>
+        <w:t xml:space="preserve"> de la </w:t>
+      </w:r>
+      <w:proofErr w:type="spellStart"/>
+      <w:r>
+        <w:rPr>
+          <w:rFonts w:ascii="Arial" w:hAnsi="Arial" w:cs="Arial"/>
+        </w:rPr>
+        <w:t>bd</w:t>
+      </w:r>
+      <w:proofErr w:type="spellEnd"/>
+      <w:r>
+        <w:rPr>
+          <w:rFonts w:ascii="Arial" w:hAnsi="Arial" w:cs="Arial"/>
+        </w:rPr>
+        <w:t xml:space="preserve"> con el </w:t>
+      </w:r>
+      <w:proofErr w:type="spellStart"/>
+      <w:r>
+        <w:rPr>
+          <w:rFonts w:ascii="Arial" w:hAnsi="Arial" w:cs="Arial"/>
+        </w:rPr>
+        <w:t>php</w:t>
+      </w:r>
+      <w:proofErr w:type="spellEnd"/>
+      <w:r>
+        <w:rPr>
+          <w:rFonts w:ascii="Arial" w:hAnsi="Arial" w:cs="Arial"/>
+        </w:rPr>
+        <w:t xml:space="preserve"> </w:t>
+      </w:r>
+      <w:proofErr w:type="spellStart"/>
+      <w:r>
+        <w:rPr>
+          <w:rFonts w:ascii="Arial" w:hAnsi="Arial" w:cs="Arial"/>
+        </w:rPr>
+        <w:t>my</w:t>
+      </w:r>
+      <w:proofErr w:type="spellEnd"/>
+      <w:r>
+        <w:rPr>
+          <w:rFonts w:ascii="Arial" w:hAnsi="Arial" w:cs="Arial"/>
+        </w:rPr>
+        <w:t xml:space="preserve"> </w:t>
+      </w:r>
+      <w:proofErr w:type="spellStart"/>
+      <w:r>
+        <w:rPr>
+          <w:rFonts w:ascii="Arial" w:hAnsi="Arial" w:cs="Arial"/>
+        </w:rPr>
+        <w:t>admin</w:t>
+      </w:r>
+      <w:proofErr w:type="spellEnd"/>
+      <w:r>
+        <w:rPr>
+          <w:rFonts w:ascii="Arial" w:hAnsi="Arial" w:cs="Arial"/>
+        </w:rPr>
+        <w:t xml:space="preserve"> se debería </w:t>
       </w:r>
       <w:r>
         <w:rPr>
@@ -8613,7 +9665,21 @@
         <w:rPr>
           <w:rFonts w:ascii="Arial" w:hAnsi="Arial" w:cs="Arial"/>
         </w:rPr>
-        <w:t xml:space="preserve"> ql 100% la </w:t>
+        <w:t xml:space="preserve"> </w:t>
+      </w:r>
+      <w:proofErr w:type="spellStart"/>
+      <w:r>
+        <w:rPr>
+          <w:rFonts w:ascii="Arial" w:hAnsi="Arial" w:cs="Arial"/>
+        </w:rPr>
+        <w:t>ql</w:t>
+      </w:r>
+      <w:proofErr w:type="spellEnd"/>
+      <w:r>
+        <w:rPr>
+          <w:rFonts w:ascii="Arial" w:hAnsi="Arial" w:cs="Arial"/>
+        </w:rPr>
+        <w:t xml:space="preserve"> 100% la </w:t>
       </w:r>
       <w:proofErr w:type="gramStart"/>
       <w:r>
@@ -8649,12 +9715,14 @@
         </w:rPr>
         <w:t xml:space="preserve">Incluso se pude valorar incluir un manual de </w:t>
       </w:r>
+      <w:proofErr w:type="spellStart"/>
       <w:r>
         <w:rPr>
           <w:rFonts w:ascii="Arial" w:hAnsi="Arial" w:cs="Arial"/>
         </w:rPr>
         <w:t>deploy</w:t>
       </w:r>
+      <w:proofErr w:type="spellEnd"/>
       <w:r>
         <w:rPr>
           <w:rFonts w:ascii="Arial" w:hAnsi="Arial" w:cs="Arial"/>
@@ -10703,7 +11771,33 @@
                 <w:lang w:eastAsia="es-ES"/>
                 <w14:ligatures w14:val="none"/>
               </w:rPr>
-              <w:t>Despliegue a producción (vps)</w:t>
+              <w:t>Despliegue a producción (</w:t>
+            </w:r>
+            <w:proofErr w:type="spellStart"/>
+            <w:r>
+              <w:rPr>
+                <w:rFonts w:ascii="Arial" w:eastAsia="Times New Roman" w:hAnsi="Arial" w:cs="Arial"/>
+                <w:color w:val="000000"/>
+                <w:kern w:val="0"/>
+                <w:sz w:val="22"/>
+                <w:szCs w:val="22"/>
+                <w:lang w:eastAsia="es-ES"/>
+                <w14:ligatures w14:val="none"/>
+              </w:rPr>
+              <w:t>vps</w:t>
+            </w:r>
+            <w:proofErr w:type="spellEnd"/>
+            <w:r>
+              <w:rPr>
+                <w:rFonts w:ascii="Arial" w:eastAsia="Times New Roman" w:hAnsi="Arial" w:cs="Arial"/>
+                <w:color w:val="000000"/>
+                <w:kern w:val="0"/>
+                <w:sz w:val="22"/>
+                <w:szCs w:val="22"/>
+                <w:lang w:eastAsia="es-ES"/>
+                <w14:ligatures w14:val="none"/>
+              </w:rPr>
+              <w:t>)</w:t>
             </w:r>
           </w:p>
         </w:tc>
@@ -11062,6 +12156,44 @@
     </w:p>
     <w:p>
       <w:pPr>
+        <w:pStyle w:val="Ttulo3"/>
+        <w:rPr>
+          <w:rFonts w:ascii="Arial" w:hAnsi="Arial" w:cs="Arial"/>
+        </w:rPr>
+      </w:pPr>
+      <w:r>
+        <w:rPr>
+          <w:rFonts w:ascii="Arial" w:hAnsi="Arial" w:cs="Arial"/>
+        </w:rPr>
+        <w:t>¿</w:t>
+      </w:r>
+      <w:r>
+        <w:rPr>
+          <w:rFonts w:ascii="Arial" w:hAnsi="Arial" w:cs="Arial"/>
+        </w:rPr>
+        <w:t>Cuánto</w:t>
+      </w:r>
+      <w:r>
+        <w:rPr>
+          <w:rFonts w:ascii="Arial" w:hAnsi="Arial" w:cs="Arial"/>
+        </w:rPr>
+        <w:t xml:space="preserve"> podría costar mi </w:t>
+      </w:r>
+      <w:r>
+        <w:rPr>
+          <w:rFonts w:ascii="Arial" w:hAnsi="Arial" w:cs="Arial"/>
+        </w:rPr>
+        <w:t>aplicación</w:t>
+      </w:r>
+      <w:r>
+        <w:rPr>
+          <w:rFonts w:ascii="Arial" w:hAnsi="Arial" w:cs="Arial"/>
+        </w:rPr>
+        <w:t>?</w:t>
+      </w:r>
+    </w:p>
+    <w:p>
+      <w:pPr>
         <w:jc w:val="both"/>
         <w:rPr>
           <w:rFonts w:ascii="Arial" w:hAnsi="Arial" w:cs="Arial"/>
@@ -11071,27 +12203,27 @@
         <w:rPr>
           <w:rFonts w:ascii="Arial" w:hAnsi="Arial" w:cs="Arial"/>
         </w:rPr>
-        <w:t>¿Cuanto podría costar mi applicacion?</w:t>
-      </w:r>
-    </w:p>
-    <w:p>
-      <w:pPr>
-        <w:jc w:val="both"/>
-        <w:rPr>
-          <w:rFonts w:ascii="Arial" w:hAnsi="Arial" w:cs="Arial"/>
-        </w:rPr>
-      </w:pPr>
-      <w:r>
-        <w:rPr>
-          <w:rFonts w:ascii="Arial" w:hAnsi="Arial" w:cs="Arial"/>
-        </w:rPr>
         <w:t xml:space="preserve">Este no es un numero fácil de estimar ya que </w:t>
       </w:r>
       <w:r>
         <w:rPr>
           <w:rFonts w:ascii="Arial" w:hAnsi="Arial" w:cs="Arial"/>
         </w:rPr>
-        <w:t xml:space="preserve">dependiendo de muchos factores el desarrollo puede durar mas o </w:t>
+        <w:t xml:space="preserve">dependiendo de muchos factores el desarrollo puede durar </w:t>
+      </w:r>
+      <w:proofErr w:type="spellStart"/>
+      <w:r>
+        <w:rPr>
+          <w:rFonts w:ascii="Arial" w:hAnsi="Arial" w:cs="Arial"/>
+        </w:rPr>
+        <w:t>mas</w:t>
+      </w:r>
+      <w:proofErr w:type="spellEnd"/>
+      <w:r>
+        <w:rPr>
+          <w:rFonts w:ascii="Arial" w:hAnsi="Arial" w:cs="Arial"/>
+        </w:rPr>
+        <w:t xml:space="preserve"> o </w:t>
       </w:r>
       <w:proofErr w:type="gramStart"/>
       <w:r>
@@ -11125,7 +12257,63 @@
         <w:rPr>
           <w:rFonts w:ascii="Arial" w:hAnsi="Arial" w:cs="Arial"/>
         </w:rPr>
-        <w:t>sobre javascript, typescript, react ni ningún fremwork realizaría el proyecto.</w:t>
+        <w:t xml:space="preserve">sobre </w:t>
+      </w:r>
+      <w:proofErr w:type="spellStart"/>
+      <w:r>
+        <w:rPr>
+          <w:rFonts w:ascii="Arial" w:hAnsi="Arial" w:cs="Arial"/>
+        </w:rPr>
+        <w:t>javascript</w:t>
+      </w:r>
+      <w:proofErr w:type="spellEnd"/>
+      <w:r>
+        <w:rPr>
+          <w:rFonts w:ascii="Arial" w:hAnsi="Arial" w:cs="Arial"/>
+        </w:rPr>
+        <w:t xml:space="preserve">, </w:t>
+      </w:r>
+      <w:proofErr w:type="spellStart"/>
+      <w:r>
+        <w:rPr>
+          <w:rFonts w:ascii="Arial" w:hAnsi="Arial" w:cs="Arial"/>
+        </w:rPr>
+        <w:t>typescript</w:t>
+      </w:r>
+      <w:proofErr w:type="spellEnd"/>
+      <w:r>
+        <w:rPr>
+          <w:rFonts w:ascii="Arial" w:hAnsi="Arial" w:cs="Arial"/>
+        </w:rPr>
+        <w:t xml:space="preserve">, </w:t>
+      </w:r>
+      <w:proofErr w:type="spellStart"/>
+      <w:r>
+        <w:rPr>
+          <w:rFonts w:ascii="Arial" w:hAnsi="Arial" w:cs="Arial"/>
+        </w:rPr>
+        <w:t>react</w:t>
+      </w:r>
+      <w:proofErr w:type="spellEnd"/>
+      <w:r>
+        <w:rPr>
+          <w:rFonts w:ascii="Arial" w:hAnsi="Arial" w:cs="Arial"/>
+        </w:rPr>
+        <w:t xml:space="preserve"> ni ningún </w:t>
+      </w:r>
+      <w:proofErr w:type="spellStart"/>
+      <w:r>
+        <w:rPr>
+          <w:rFonts w:ascii="Arial" w:hAnsi="Arial" w:cs="Arial"/>
+        </w:rPr>
+        <w:t>fremwork</w:t>
+      </w:r>
+      <w:proofErr w:type="spellEnd"/>
+      <w:r>
+        <w:rPr>
+          <w:rFonts w:ascii="Arial" w:hAnsi="Arial" w:cs="Arial"/>
+        </w:rPr>
+        <w:t xml:space="preserve"> realizaría el proyecto.</w:t>
       </w:r>
     </w:p>
     <w:p>
@@ -11154,7 +12342,21 @@
         <w:rPr>
           <w:rFonts w:ascii="Arial" w:hAnsi="Arial" w:cs="Arial"/>
         </w:rPr>
-        <w:t xml:space="preserve"> y </w:t>
+        <w:t xml:space="preserve"> </w:t>
+      </w:r>
+      <w:proofErr w:type="spellStart"/>
+      <w:r>
+        <w:rPr>
+          <w:rFonts w:ascii="Arial" w:hAnsi="Arial" w:cs="Arial"/>
+        </w:rPr>
+        <w:t>y</w:t>
+      </w:r>
+      <w:proofErr w:type="spellEnd"/>
+      <w:r>
+        <w:rPr>
+          <w:rFonts w:ascii="Arial" w:hAnsi="Arial" w:cs="Arial"/>
+        </w:rPr>
+        <w:t xml:space="preserve"> </w:t>
       </w:r>
       <w:proofErr w:type="gramStart"/>
       <w:r>
@@ -11168,7 +12370,49 @@
         <w:rPr>
           <w:rFonts w:ascii="Arial" w:hAnsi="Arial" w:cs="Arial"/>
         </w:rPr>
-        <w:t xml:space="preserve"> aprender a programar en react javascript y usar el framwork en el que esta desarrollado la </w:t>
+        <w:t xml:space="preserve"> aprender a programar en </w:t>
+      </w:r>
+      <w:proofErr w:type="spellStart"/>
+      <w:r>
+        <w:rPr>
+          <w:rFonts w:ascii="Arial" w:hAnsi="Arial" w:cs="Arial"/>
+        </w:rPr>
+        <w:t>react</w:t>
+      </w:r>
+      <w:proofErr w:type="spellEnd"/>
+      <w:r>
+        <w:rPr>
+          <w:rFonts w:ascii="Arial" w:hAnsi="Arial" w:cs="Arial"/>
+        </w:rPr>
+        <w:t xml:space="preserve"> </w:t>
+      </w:r>
+      <w:proofErr w:type="spellStart"/>
+      <w:r>
+        <w:rPr>
+          <w:rFonts w:ascii="Arial" w:hAnsi="Arial" w:cs="Arial"/>
+        </w:rPr>
+        <w:t>javascript</w:t>
+      </w:r>
+      <w:proofErr w:type="spellEnd"/>
+      <w:r>
+        <w:rPr>
+          <w:rFonts w:ascii="Arial" w:hAnsi="Arial" w:cs="Arial"/>
+        </w:rPr>
+        <w:t xml:space="preserve"> y usar el </w:t>
+      </w:r>
+      <w:proofErr w:type="spellStart"/>
+      <w:r>
+        <w:rPr>
+          <w:rFonts w:ascii="Arial" w:hAnsi="Arial" w:cs="Arial"/>
+        </w:rPr>
+        <w:t>framwork</w:t>
+      </w:r>
+      <w:proofErr w:type="spellEnd"/>
+      <w:r>
+        <w:rPr>
+          <w:rFonts w:ascii="Arial" w:hAnsi="Arial" w:cs="Arial"/>
+        </w:rPr>
+        <w:t xml:space="preserve"> en el que esta desarrollado la </w:t>
       </w:r>
       <w:proofErr w:type="gramStart"/>
       <w:r>
@@ -11418,7 +12662,21 @@
         <w:rPr>
           <w:rFonts w:ascii="Arial" w:hAnsi="Arial" w:cs="Arial"/>
         </w:rPr>
-        <w:t xml:space="preserve">Este seria el coste de una persona para una empresa realizando esta </w:t>
+        <w:t xml:space="preserve">Este </w:t>
+      </w:r>
+      <w:proofErr w:type="spellStart"/>
+      <w:r>
+        <w:rPr>
+          <w:rFonts w:ascii="Arial" w:hAnsi="Arial" w:cs="Arial"/>
+        </w:rPr>
+        <w:t>seria</w:t>
+      </w:r>
+      <w:proofErr w:type="spellEnd"/>
+      <w:r>
+        <w:rPr>
+          <w:rFonts w:ascii="Arial" w:hAnsi="Arial" w:cs="Arial"/>
+        </w:rPr>
+        <w:t xml:space="preserve"> el coste de una persona para una empresa realizando esta </w:t>
       </w:r>
       <w:r>
         <w:rPr>
@@ -11504,7 +12762,7 @@
     </w:p>
     <w:p>
       <w:pPr>
-        <w:jc w:val="both"/>
+        <w:pStyle w:val="Ttulo3"/>
         <w:rPr>
           <w:rFonts w:ascii="Arial" w:hAnsi="Arial" w:cs="Arial"/>
         </w:rPr>
@@ -11569,13 +12827,41 @@
         <w:rPr>
           <w:rFonts w:ascii="Arial" w:hAnsi="Arial" w:cs="Arial"/>
         </w:rPr>
-        <w:t xml:space="preserve">EL sistema ha de permitir visualizar los datos con un grafico interactivo. </w:t>
-      </w:r>
-      <w:r>
-        <w:rPr>
-          <w:rFonts w:ascii="Arial" w:hAnsi="Arial" w:cs="Arial"/>
-        </w:rPr>
-        <w:t xml:space="preserve">Separado por timestamps </w:t>
+        <w:t xml:space="preserve">EL sistema ha de permitir visualizar los datos con un </w:t>
+      </w:r>
+      <w:proofErr w:type="spellStart"/>
+      <w:r>
+        <w:rPr>
+          <w:rFonts w:ascii="Arial" w:hAnsi="Arial" w:cs="Arial"/>
+        </w:rPr>
+        <w:t>grafico</w:t>
+      </w:r>
+      <w:proofErr w:type="spellEnd"/>
+      <w:r>
+        <w:rPr>
+          <w:rFonts w:ascii="Arial" w:hAnsi="Arial" w:cs="Arial"/>
+        </w:rPr>
+        <w:t xml:space="preserve"> interactivo. </w:t>
+      </w:r>
+      <w:r>
+        <w:rPr>
+          <w:rFonts w:ascii="Arial" w:hAnsi="Arial" w:cs="Arial"/>
+        </w:rPr>
+        <w:t xml:space="preserve">Separado por </w:t>
+      </w:r>
+      <w:proofErr w:type="spellStart"/>
+      <w:r>
+        <w:rPr>
+          <w:rFonts w:ascii="Arial" w:hAnsi="Arial" w:cs="Arial"/>
+        </w:rPr>
+        <w:t>timestamps</w:t>
+      </w:r>
+      <w:proofErr w:type="spellEnd"/>
+      <w:r>
+        <w:rPr>
+          <w:rFonts w:ascii="Arial" w:hAnsi="Arial" w:cs="Arial"/>
+        </w:rPr>
+        <w:t xml:space="preserve"> </w:t>
       </w:r>
       <w:r>
         <w:rPr>
@@ -11689,12 +12975,26 @@
         <w:rPr>
           <w:rFonts w:ascii="Arial" w:hAnsi="Arial" w:cs="Arial"/>
         </w:rPr>
-        <w:t xml:space="preserve"> (ej sueldo, alquiler, …) (RF-06)</w:t>
-      </w:r>
-    </w:p>
-    <w:p>
-      <w:pPr>
-        <w:jc w:val="both"/>
+        <w:t xml:space="preserve"> (</w:t>
+      </w:r>
+      <w:proofErr w:type="spellStart"/>
+      <w:r>
+        <w:rPr>
+          <w:rFonts w:ascii="Arial" w:hAnsi="Arial" w:cs="Arial"/>
+        </w:rPr>
+        <w:t>ej</w:t>
+      </w:r>
+      <w:proofErr w:type="spellEnd"/>
+      <w:r>
+        <w:rPr>
+          <w:rFonts w:ascii="Arial" w:hAnsi="Arial" w:cs="Arial"/>
+        </w:rPr>
+        <w:t xml:space="preserve"> sueldo, alquiler, …) (RF-06)</w:t>
+      </w:r>
+    </w:p>
+    <w:p>
+      <w:pPr>
+        <w:pStyle w:val="Ttulo3"/>
         <w:rPr>
           <w:rFonts w:ascii="Arial" w:hAnsi="Arial" w:cs="Arial"/>
         </w:rPr>
@@ -11889,7 +13189,21 @@
         <w:rPr>
           <w:rFonts w:ascii="Arial" w:hAnsi="Arial" w:cs="Arial"/>
         </w:rPr>
-        <w:t>Contraseñas cifradas (hash tipo bcrypt)</w:t>
+        <w:t xml:space="preserve">Contraseñas cifradas (hash tipo </w:t>
+      </w:r>
+      <w:proofErr w:type="spellStart"/>
+      <w:r>
+        <w:rPr>
+          <w:rFonts w:ascii="Arial" w:hAnsi="Arial" w:cs="Arial"/>
+        </w:rPr>
+        <w:t>bcrypt</w:t>
+      </w:r>
+      <w:proofErr w:type="spellEnd"/>
+      <w:r>
+        <w:rPr>
+          <w:rFonts w:ascii="Arial" w:hAnsi="Arial" w:cs="Arial"/>
+        </w:rPr>
+        <w:t>)</w:t>
       </w:r>
       <w:r>
         <w:rPr>
@@ -11914,7 +13228,35 @@
         <w:rPr>
           <w:rFonts w:ascii="Arial" w:hAnsi="Arial" w:cs="Arial"/>
         </w:rPr>
-        <w:t>Validación de datos en frontend y backend (RNF-06)</w:t>
+        <w:t xml:space="preserve">Validación de datos en </w:t>
+      </w:r>
+      <w:proofErr w:type="spellStart"/>
+      <w:r>
+        <w:rPr>
+          <w:rFonts w:ascii="Arial" w:hAnsi="Arial" w:cs="Arial"/>
+        </w:rPr>
+        <w:t>frontend</w:t>
+      </w:r>
+      <w:proofErr w:type="spellEnd"/>
+      <w:r>
+        <w:rPr>
+          <w:rFonts w:ascii="Arial" w:hAnsi="Arial" w:cs="Arial"/>
+        </w:rPr>
+        <w:t xml:space="preserve"> y </w:t>
+      </w:r>
+      <w:proofErr w:type="spellStart"/>
+      <w:r>
+        <w:rPr>
+          <w:rFonts w:ascii="Arial" w:hAnsi="Arial" w:cs="Arial"/>
+        </w:rPr>
+        <w:t>backend</w:t>
+      </w:r>
+      <w:proofErr w:type="spellEnd"/>
+      <w:r>
+        <w:rPr>
+          <w:rFonts w:ascii="Arial" w:hAnsi="Arial" w:cs="Arial"/>
+        </w:rPr>
+        <w:t xml:space="preserve"> (RNF-06)</w:t>
       </w:r>
     </w:p>
     <w:p>
@@ -11955,11 +13297,7 @@
     </w:p>
     <w:p>
       <w:pPr>
-        <w:pStyle w:val="Prrafodelista"/>
-        <w:numPr>
-          <w:ilvl w:val="0"/>
-          <w:numId w:val="27"/>
-        </w:numPr>
+        <w:pStyle w:val="Ttulo3"/>
         <w:rPr>
           <w:rFonts w:ascii="Arial" w:hAnsi="Arial" w:cs="Arial"/>
         </w:rPr>
@@ -12006,11 +13344,19 @@
           <w:rFonts w:ascii="Arial" w:hAnsi="Arial" w:cs="Arial"/>
         </w:rPr>
       </w:pPr>
-      <w:r>
-        <w:rPr>
-          <w:rFonts w:ascii="Arial" w:hAnsi="Arial" w:cs="Arial"/>
-        </w:rPr>
-        <w:t xml:space="preserve">Admin: Puede acceder a la base de datos y ver </w:t>
+      <w:proofErr w:type="spellStart"/>
+      <w:r>
+        <w:rPr>
+          <w:rFonts w:ascii="Arial" w:hAnsi="Arial" w:cs="Arial"/>
+        </w:rPr>
+        <w:t>Admin</w:t>
+      </w:r>
+      <w:proofErr w:type="spellEnd"/>
+      <w:r>
+        <w:rPr>
+          <w:rFonts w:ascii="Arial" w:hAnsi="Arial" w:cs="Arial"/>
+        </w:rPr>
+        <w:t xml:space="preserve">: Puede acceder a la base de datos y ver </w:t>
       </w:r>
       <w:r>
         <w:rPr>
@@ -12053,19 +13399,16 @@
     </w:p>
     <w:p>
       <w:pPr>
-        <w:pStyle w:val="Prrafodelista"/>
-        <w:numPr>
-          <w:ilvl w:val="0"/>
-          <w:numId w:val="27"/>
-        </w:numPr>
-        <w:rPr>
-          <w:rFonts w:ascii="Arial" w:hAnsi="Arial" w:cs="Arial"/>
-        </w:rPr>
-      </w:pPr>
-      <w:r>
-        <w:rPr>
-          <w:rFonts w:ascii="Arial" w:hAnsi="Arial" w:cs="Arial"/>
-        </w:rPr>
+        <w:pStyle w:val="Ttulo3"/>
+        <w:rPr>
+          <w:rFonts w:ascii="Arial" w:hAnsi="Arial" w:cs="Arial"/>
+        </w:rPr>
+      </w:pPr>
+      <w:r>
+        <w:rPr>
+          <w:rFonts w:ascii="Arial" w:hAnsi="Arial" w:cs="Arial"/>
+        </w:rPr>
+        <w:lastRenderedPageBreak/>
         <w:t>Procesos principales y flujo de funcionamiento</w:t>
       </w:r>
     </w:p>
@@ -12081,7 +13424,6 @@
           <w:rFonts w:ascii="Arial" w:hAnsi="Arial" w:cs="Arial"/>
           <w:noProof/>
         </w:rPr>
-        <w:lastRenderedPageBreak/>
         <w:drawing>
           <wp:inline distT="0" distB="0" distL="0" distR="0" wp14:anchorId="501056D4" wp14:editId="5C2DB0EF">
             <wp:extent cx="4581525" cy="2822782"/>
@@ -12100,7 +13442,7 @@
                     </pic:cNvPicPr>
                   </pic:nvPicPr>
                   <pic:blipFill>
-                    <a:blip r:embed="rId27">
+                    <a:blip r:embed="rId29">
                       <a:extLst>
                         <a:ext uri="{28A0092B-C50C-407E-A947-70E740481C1C}">
                           <a14:useLocalDpi xmlns:a14="http://schemas.microsoft.com/office/drawing/2010/main" val="0"/>
@@ -12134,11 +13476,7 @@
     </w:p>
     <w:p>
       <w:pPr>
-        <w:pStyle w:val="Prrafodelista"/>
-        <w:numPr>
-          <w:ilvl w:val="0"/>
-          <w:numId w:val="28"/>
-        </w:numPr>
+        <w:pStyle w:val="Ttulo3"/>
         <w:rPr>
           <w:rFonts w:ascii="Arial" w:hAnsi="Arial" w:cs="Arial"/>
         </w:rPr>
@@ -12265,7 +13603,21 @@
         <w:rPr>
           <w:rFonts w:ascii="Arial" w:hAnsi="Arial" w:cs="Arial"/>
         </w:rPr>
-        <w:t>Un usuario tiene un rol (admin o normal)</w:t>
+        <w:t>Un usuario tiene un rol (</w:t>
+      </w:r>
+      <w:proofErr w:type="spellStart"/>
+      <w:r>
+        <w:rPr>
+          <w:rFonts w:ascii="Arial" w:hAnsi="Arial" w:cs="Arial"/>
+        </w:rPr>
+        <w:t>admin</w:t>
+      </w:r>
+      <w:proofErr w:type="spellEnd"/>
+      <w:r>
+        <w:rPr>
+          <w:rFonts w:ascii="Arial" w:hAnsi="Arial" w:cs="Arial"/>
+        </w:rPr>
+        <w:t xml:space="preserve"> o normal)</w:t>
       </w:r>
       <w:r>
         <w:rPr>
@@ -12317,6 +13669,7 @@
         </w:rPr>
         <w:t xml:space="preserve">Cada usuario tiene un id y </w:t>
       </w:r>
+      <w:proofErr w:type="spellStart"/>
       <w:proofErr w:type="gramStart"/>
       <w:r>
         <w:rPr>
@@ -12324,6 +13677,7 @@
         </w:rPr>
         <w:t>password</w:t>
       </w:r>
+      <w:proofErr w:type="spellEnd"/>
       <w:proofErr w:type="gramEnd"/>
       <w:r>
         <w:rPr>
@@ -12348,11 +13702,7 @@
     </w:p>
     <w:p>
       <w:pPr>
-        <w:pStyle w:val="Prrafodelista"/>
-        <w:numPr>
-          <w:ilvl w:val="0"/>
-          <w:numId w:val="28"/>
-        </w:numPr>
+        <w:pStyle w:val="Ttulo3"/>
         <w:rPr>
           <w:rFonts w:ascii="Arial" w:hAnsi="Arial" w:cs="Arial"/>
         </w:rPr>
@@ -12401,7 +13751,7 @@
                     </pic:cNvPicPr>
                   </pic:nvPicPr>
                   <pic:blipFill>
-                    <a:blip r:embed="rId28">
+                    <a:blip r:embed="rId30">
                       <a:extLst>
                         <a:ext uri="{28A0092B-C50C-407E-A947-70E740481C1C}">
                           <a14:useLocalDpi xmlns:a14="http://schemas.microsoft.com/office/drawing/2010/main" val="0"/>
@@ -12518,7 +13868,6 @@
         <w:rPr>
           <w:rFonts w:ascii="Arial" w:hAnsi="Arial" w:cs="Arial"/>
         </w:rPr>
-        <w:lastRenderedPageBreak/>
         <w:t>Diseño del sistema</w:t>
       </w:r>
     </w:p>
@@ -12531,11 +13880,7 @@
     </w:p>
     <w:p>
       <w:pPr>
-        <w:pStyle w:val="Prrafodelista"/>
-        <w:numPr>
-          <w:ilvl w:val="0"/>
-          <w:numId w:val="28"/>
-        </w:numPr>
+        <w:pStyle w:val="Ttulo3"/>
         <w:rPr>
           <w:rFonts w:ascii="Arial" w:hAnsi="Arial" w:cs="Arial"/>
         </w:rPr>
@@ -12602,7 +13947,7 @@
                     </pic:cNvPicPr>
                   </pic:nvPicPr>
                   <pic:blipFill>
-                    <a:blip r:embed="rId29">
+                    <a:blip r:embed="rId31">
                       <a:extLst>
                         <a:ext uri="{28A0092B-C50C-407E-A947-70E740481C1C}">
                           <a14:useLocalDpi xmlns:a14="http://schemas.microsoft.com/office/drawing/2010/main" val="0"/>
@@ -12643,14 +13988,16 @@
     </w:p>
     <w:p>
       <w:pPr>
-        <w:rPr>
-          <w:rFonts w:ascii="Arial" w:hAnsi="Arial" w:cs="Arial"/>
-        </w:rPr>
-      </w:pPr>
-      <w:r>
-        <w:rPr>
-          <w:rFonts w:ascii="Arial" w:hAnsi="Arial" w:cs="Arial"/>
-        </w:rPr>
+        <w:pStyle w:val="Ttulo3"/>
+        <w:rPr>
+          <w:rFonts w:ascii="Arial" w:hAnsi="Arial" w:cs="Arial"/>
+        </w:rPr>
+      </w:pPr>
+      <w:r>
+        <w:rPr>
+          <w:rFonts w:ascii="Arial" w:hAnsi="Arial" w:cs="Arial"/>
+        </w:rPr>
+        <w:lastRenderedPageBreak/>
         <w:t>Grafo relacional:</w:t>
       </w:r>
     </w:p>
@@ -12684,7 +14031,7 @@
                     </pic:cNvPicPr>
                   </pic:nvPicPr>
                   <pic:blipFill>
-                    <a:blip r:embed="rId30">
+                    <a:blip r:embed="rId32">
                       <a:extLst>
                         <a:ext uri="{28A0092B-C50C-407E-A947-70E740481C1C}">
                           <a14:useLocalDpi xmlns:a14="http://schemas.microsoft.com/office/drawing/2010/main" val="0"/>
@@ -12718,11 +14065,1419 @@
     </w:p>
     <w:p>
       <w:pPr>
-        <w:rPr>
-          <w:rFonts w:ascii="Arial" w:hAnsi="Arial" w:cs="Arial"/>
-        </w:rPr>
-      </w:pPr>
-    </w:p>
+        <w:pStyle w:val="Ttulo3"/>
+        <w:rPr>
+          <w:rFonts w:ascii="Arial" w:hAnsi="Arial" w:cs="Arial"/>
+        </w:rPr>
+      </w:pPr>
+      <w:proofErr w:type="spellStart"/>
+      <w:r>
+        <w:rPr>
+          <w:rFonts w:ascii="Arial" w:hAnsi="Arial" w:cs="Arial"/>
+        </w:rPr>
+        <w:t>Mokups</w:t>
+      </w:r>
+      <w:proofErr w:type="spellEnd"/>
+      <w:r>
+        <w:rPr>
+          <w:rFonts w:ascii="Arial" w:hAnsi="Arial" w:cs="Arial"/>
+        </w:rPr>
+        <w:br/>
+      </w:r>
+    </w:p>
+    <w:p>
+      <w:pPr>
+        <w:rPr>
+          <w:rFonts w:ascii="Arial" w:hAnsi="Arial" w:cs="Arial"/>
+        </w:rPr>
+      </w:pPr>
+      <w:r>
+        <w:rPr>
+          <w:rFonts w:ascii="Arial" w:hAnsi="Arial" w:cs="Arial"/>
+        </w:rPr>
+        <w:t xml:space="preserve">Para los </w:t>
+      </w:r>
+      <w:proofErr w:type="spellStart"/>
+      <w:r>
+        <w:rPr>
+          <w:rFonts w:ascii="Arial" w:hAnsi="Arial" w:cs="Arial"/>
+        </w:rPr>
+        <w:t>mokups</w:t>
+      </w:r>
+      <w:proofErr w:type="spellEnd"/>
+      <w:r>
+        <w:rPr>
+          <w:rFonts w:ascii="Arial" w:hAnsi="Arial" w:cs="Arial"/>
+        </w:rPr>
+        <w:t xml:space="preserve"> y diseños he usado </w:t>
+      </w:r>
+      <w:proofErr w:type="spellStart"/>
+      <w:r>
+        <w:rPr>
+          <w:rFonts w:ascii="Arial" w:hAnsi="Arial" w:cs="Arial"/>
+        </w:rPr>
+        <w:t>F</w:t>
+      </w:r>
+      <w:r>
+        <w:rPr>
+          <w:rFonts w:ascii="Arial" w:hAnsi="Arial" w:cs="Arial"/>
+        </w:rPr>
+        <w:t>ingma</w:t>
+      </w:r>
+      <w:proofErr w:type="spellEnd"/>
+      <w:r>
+        <w:rPr>
+          <w:rFonts w:ascii="Arial" w:hAnsi="Arial" w:cs="Arial"/>
+        </w:rPr>
+        <w:t xml:space="preserve"> en conjunto con Google Stich inspirándome en interfaces como </w:t>
+      </w:r>
+      <w:proofErr w:type="spellStart"/>
+      <w:r>
+        <w:rPr>
+          <w:rFonts w:ascii="Arial" w:hAnsi="Arial" w:cs="Arial"/>
+        </w:rPr>
+        <w:t>R</w:t>
+      </w:r>
+      <w:r>
+        <w:rPr>
+          <w:rFonts w:ascii="Arial" w:hAnsi="Arial" w:cs="Arial"/>
+        </w:rPr>
+        <w:t>obinhood</w:t>
+      </w:r>
+      <w:proofErr w:type="spellEnd"/>
+      <w:r>
+        <w:rPr>
+          <w:rFonts w:ascii="Arial" w:hAnsi="Arial" w:cs="Arial"/>
+        </w:rPr>
+        <w:t xml:space="preserve"> y </w:t>
+      </w:r>
+      <w:r>
+        <w:rPr>
+          <w:rFonts w:ascii="Arial" w:hAnsi="Arial" w:cs="Arial"/>
+        </w:rPr>
+        <w:t>R</w:t>
+      </w:r>
+      <w:r>
+        <w:rPr>
+          <w:rFonts w:ascii="Arial" w:hAnsi="Arial" w:cs="Arial"/>
+        </w:rPr>
+        <w:t xml:space="preserve">rade </w:t>
+      </w:r>
+      <w:proofErr w:type="spellStart"/>
+      <w:r>
+        <w:rPr>
+          <w:rFonts w:ascii="Arial" w:hAnsi="Arial" w:cs="Arial"/>
+        </w:rPr>
+        <w:t>R</w:t>
+      </w:r>
+      <w:r>
+        <w:rPr>
+          <w:rFonts w:ascii="Arial" w:hAnsi="Arial" w:cs="Arial"/>
+        </w:rPr>
+        <w:t>epublic</w:t>
+      </w:r>
+      <w:proofErr w:type="spellEnd"/>
+      <w:r>
+        <w:rPr>
+          <w:rFonts w:ascii="Arial" w:hAnsi="Arial" w:cs="Arial"/>
+        </w:rPr>
+        <w:t>, que son aplicaciones de finanzas y bancos populares con un diseño moderno y que cuenta lo que tiene que contar.</w:t>
+      </w:r>
+    </w:p>
+    <w:p>
+      <w:pPr>
+        <w:ind w:firstLine="708"/>
+        <w:rPr>
+          <w:rFonts w:ascii="Arial" w:hAnsi="Arial" w:cs="Arial"/>
+          <w:lang w:val="en-US"/>
+        </w:rPr>
+      </w:pPr>
+      <w:r>
+        <w:rPr>
+          <w:rFonts w:ascii="Arial" w:hAnsi="Arial" w:cs="Arial"/>
+          <w:noProof/>
+        </w:rPr>
+        <w:drawing>
+          <wp:anchor distT="0" distB="0" distL="114300" distR="114300" simplePos="0" relativeHeight="251664384" behindDoc="0" locked="0" layoutInCell="1" allowOverlap="1" wp14:anchorId="76CC59CB" wp14:editId="31677E52">
+            <wp:simplePos x="0" y="0"/>
+            <wp:positionH relativeFrom="margin">
+              <wp:posOffset>339090</wp:posOffset>
+            </wp:positionH>
+            <wp:positionV relativeFrom="paragraph">
+              <wp:posOffset>260350</wp:posOffset>
+            </wp:positionV>
+            <wp:extent cx="1366838" cy="2733675"/>
+            <wp:effectExtent l="0" t="0" r="5080" b="0"/>
+            <wp:wrapNone/>
+            <wp:docPr id="1979895697" name="Imagen 4" descr="Trade Republic Webanwendung und App im Test (2026)"/>
+            <wp:cNvGraphicFramePr>
+              <a:graphicFrameLocks xmlns:a="http://schemas.openxmlformats.org/drawingml/2006/main" noChangeAspect="1"/>
+            </wp:cNvGraphicFramePr>
+            <a:graphic xmlns:a="http://schemas.openxmlformats.org/drawingml/2006/main">
+              <a:graphicData uri="http://schemas.openxmlformats.org/drawingml/2006/picture">
+                <pic:pic xmlns:pic="http://schemas.openxmlformats.org/drawingml/2006/picture">
+                  <pic:nvPicPr>
+                    <pic:cNvPr id="0" name="Picture 3" descr="Trade Republic Webanwendung und App im Test (2026)"/>
+                    <pic:cNvPicPr>
+                      <a:picLocks noChangeAspect="1" noChangeArrowheads="1"/>
+                    </pic:cNvPicPr>
+                  </pic:nvPicPr>
+                  <pic:blipFill>
+                    <a:blip r:embed="rId33">
+                      <a:extLst>
+                        <a:ext uri="{28A0092B-C50C-407E-A947-70E740481C1C}">
+                          <a14:useLocalDpi xmlns:a14="http://schemas.microsoft.com/office/drawing/2010/main" val="0"/>
+                        </a:ext>
+                      </a:extLst>
+                    </a:blip>
+                    <a:srcRect/>
+                    <a:stretch>
+                      <a:fillRect/>
+                    </a:stretch>
+                  </pic:blipFill>
+                  <pic:spPr bwMode="auto">
+                    <a:xfrm>
+                      <a:off x="0" y="0"/>
+                      <a:ext cx="1369769" cy="2739536"/>
+                    </a:xfrm>
+                    <a:prstGeom prst="rect">
+                      <a:avLst/>
+                    </a:prstGeom>
+                    <a:noFill/>
+                    <a:ln>
+                      <a:noFill/>
+                    </a:ln>
+                  </pic:spPr>
+                </pic:pic>
+              </a:graphicData>
+            </a:graphic>
+            <wp14:sizeRelH relativeFrom="margin">
+              <wp14:pctWidth>0</wp14:pctWidth>
+            </wp14:sizeRelH>
+            <wp14:sizeRelV relativeFrom="margin">
+              <wp14:pctHeight>0</wp14:pctHeight>
+            </wp14:sizeRelV>
+          </wp:anchor>
+        </w:drawing>
+      </w:r>
+      <w:r>
+        <w:rPr>
+          <w:rFonts w:ascii="Arial" w:hAnsi="Arial" w:cs="Arial"/>
+          <w:noProof/>
+        </w:rPr>
+        <w:drawing>
+          <wp:anchor distT="0" distB="0" distL="114300" distR="114300" simplePos="0" relativeHeight="251665408" behindDoc="0" locked="0" layoutInCell="1" allowOverlap="1" wp14:anchorId="559B80A1" wp14:editId="06B45D8C">
+            <wp:simplePos x="0" y="0"/>
+            <wp:positionH relativeFrom="column">
+              <wp:posOffset>3806190</wp:posOffset>
+            </wp:positionH>
+            <wp:positionV relativeFrom="paragraph">
+              <wp:posOffset>279400</wp:posOffset>
+            </wp:positionV>
+            <wp:extent cx="1428750" cy="2687172"/>
+            <wp:effectExtent l="0" t="0" r="0" b="0"/>
+            <wp:wrapNone/>
+            <wp:docPr id="1964683372" name="Imagen 5" descr="Download the app | Robinhood"/>
+            <wp:cNvGraphicFramePr>
+              <a:graphicFrameLocks xmlns:a="http://schemas.openxmlformats.org/drawingml/2006/main" noChangeAspect="1"/>
+            </wp:cNvGraphicFramePr>
+            <a:graphic xmlns:a="http://schemas.openxmlformats.org/drawingml/2006/main">
+              <a:graphicData uri="http://schemas.openxmlformats.org/drawingml/2006/picture">
+                <pic:pic xmlns:pic="http://schemas.openxmlformats.org/drawingml/2006/picture">
+                  <pic:nvPicPr>
+                    <pic:cNvPr id="0" name="Picture 5" descr="Download the app | Robinhood"/>
+                    <pic:cNvPicPr>
+                      <a:picLocks noChangeAspect="1" noChangeArrowheads="1"/>
+                    </pic:cNvPicPr>
+                  </pic:nvPicPr>
+                  <pic:blipFill>
+                    <a:blip r:embed="rId34" cstate="print">
+                      <a:extLst>
+                        <a:ext uri="{28A0092B-C50C-407E-A947-70E740481C1C}">
+                          <a14:useLocalDpi xmlns:a14="http://schemas.microsoft.com/office/drawing/2010/main" val="0"/>
+                        </a:ext>
+                      </a:extLst>
+                    </a:blip>
+                    <a:srcRect/>
+                    <a:stretch>
+                      <a:fillRect/>
+                    </a:stretch>
+                  </pic:blipFill>
+                  <pic:spPr bwMode="auto">
+                    <a:xfrm>
+                      <a:off x="0" y="0"/>
+                      <a:ext cx="1428750" cy="2687172"/>
+                    </a:xfrm>
+                    <a:prstGeom prst="rect">
+                      <a:avLst/>
+                    </a:prstGeom>
+                    <a:noFill/>
+                    <a:ln>
+                      <a:noFill/>
+                    </a:ln>
+                  </pic:spPr>
+                </pic:pic>
+              </a:graphicData>
+            </a:graphic>
+            <wp14:sizeRelH relativeFrom="margin">
+              <wp14:pctWidth>0</wp14:pctWidth>
+            </wp14:sizeRelH>
+            <wp14:sizeRelV relativeFrom="margin">
+              <wp14:pctHeight>0</wp14:pctHeight>
+            </wp14:sizeRelV>
+          </wp:anchor>
+        </w:drawing>
+      </w:r>
+      <w:proofErr w:type="spellStart"/>
+      <w:r>
+        <w:rPr>
+          <w:rFonts w:ascii="Arial" w:hAnsi="Arial" w:cs="Arial"/>
+          <w:lang w:val="en-US"/>
+        </w:rPr>
+        <w:t>Ej</w:t>
+      </w:r>
+      <w:proofErr w:type="spellEnd"/>
+      <w:r>
+        <w:rPr>
+          <w:rFonts w:ascii="Arial" w:hAnsi="Arial" w:cs="Arial"/>
+          <w:lang w:val="en-US"/>
+        </w:rPr>
+        <w:t xml:space="preserve"> </w:t>
+      </w:r>
+      <w:r>
+        <w:rPr>
+          <w:rFonts w:ascii="Arial" w:hAnsi="Arial" w:cs="Arial"/>
+          <w:lang w:val="en-US"/>
+        </w:rPr>
+        <w:t>T</w:t>
+      </w:r>
+      <w:r>
+        <w:rPr>
+          <w:rFonts w:ascii="Arial" w:hAnsi="Arial" w:cs="Arial"/>
+          <w:lang w:val="en-US"/>
+        </w:rPr>
+        <w:t xml:space="preserve">rade </w:t>
+      </w:r>
+      <w:r>
+        <w:rPr>
+          <w:rFonts w:ascii="Arial" w:hAnsi="Arial" w:cs="Arial"/>
+          <w:lang w:val="en-US"/>
+        </w:rPr>
+        <w:t>R</w:t>
+      </w:r>
+      <w:r>
+        <w:rPr>
+          <w:rFonts w:ascii="Arial" w:hAnsi="Arial" w:cs="Arial"/>
+          <w:lang w:val="en-US"/>
+        </w:rPr>
+        <w:t>epublic:</w:t>
+      </w:r>
+      <w:r>
+        <w:rPr>
+          <w:rFonts w:ascii="Arial" w:hAnsi="Arial" w:cs="Arial"/>
+          <w:lang w:val="en-US"/>
+        </w:rPr>
+        <w:tab/>
+      </w:r>
+      <w:r>
+        <w:rPr>
+          <w:rFonts w:ascii="Arial" w:hAnsi="Arial" w:cs="Arial"/>
+          <w:lang w:val="en-US"/>
+        </w:rPr>
+        <w:tab/>
+      </w:r>
+      <w:r>
+        <w:rPr>
+          <w:rFonts w:ascii="Arial" w:hAnsi="Arial" w:cs="Arial"/>
+          <w:lang w:val="en-US"/>
+        </w:rPr>
+        <w:tab/>
+      </w:r>
+      <w:r>
+        <w:rPr>
+          <w:rFonts w:ascii="Arial" w:hAnsi="Arial" w:cs="Arial"/>
+          <w:lang w:val="en-US"/>
+        </w:rPr>
+        <w:tab/>
+      </w:r>
+      <w:r>
+        <w:rPr>
+          <w:rFonts w:ascii="Arial" w:hAnsi="Arial" w:cs="Arial"/>
+          <w:lang w:val="en-US"/>
+        </w:rPr>
+        <w:tab/>
+      </w:r>
+      <w:r>
+        <w:rPr>
+          <w:rFonts w:ascii="Arial" w:hAnsi="Arial" w:cs="Arial"/>
+          <w:lang w:val="en-US"/>
+        </w:rPr>
+        <w:tab/>
+      </w:r>
+      <w:proofErr w:type="spellStart"/>
+      <w:r>
+        <w:rPr>
+          <w:rFonts w:ascii="Arial" w:hAnsi="Arial" w:cs="Arial"/>
+          <w:lang w:val="en-US"/>
+        </w:rPr>
+        <w:t>Ej</w:t>
+      </w:r>
+      <w:proofErr w:type="spellEnd"/>
+      <w:r>
+        <w:rPr>
+          <w:rFonts w:ascii="Arial" w:hAnsi="Arial" w:cs="Arial"/>
+          <w:lang w:val="en-US"/>
+        </w:rPr>
+        <w:t xml:space="preserve"> </w:t>
+      </w:r>
+      <w:r>
+        <w:rPr>
+          <w:rFonts w:ascii="Arial" w:hAnsi="Arial" w:cs="Arial"/>
+          <w:lang w:val="en-US"/>
+        </w:rPr>
+        <w:t>R</w:t>
+      </w:r>
+      <w:r>
+        <w:rPr>
+          <w:rFonts w:ascii="Arial" w:hAnsi="Arial" w:cs="Arial"/>
+          <w:lang w:val="en-US"/>
+        </w:rPr>
+        <w:t>obinhood:</w:t>
+      </w:r>
+      <w:r>
+        <w:rPr>
+          <w:rFonts w:ascii="Arial" w:hAnsi="Arial" w:cs="Arial"/>
+          <w:lang w:val="en-US"/>
+        </w:rPr>
+        <w:br/>
+      </w:r>
+      <w:r>
+        <w:rPr>
+          <w:rFonts w:ascii="Arial" w:hAnsi="Arial" w:cs="Arial"/>
+          <w:lang w:val="en-US"/>
+        </w:rPr>
+        <w:br/>
+      </w:r>
+    </w:p>
+    <w:p>
+      <w:pPr>
+        <w:ind w:firstLine="708"/>
+        <w:rPr>
+          <w:rFonts w:ascii="Arial" w:hAnsi="Arial" w:cs="Arial"/>
+          <w:lang w:val="en-US"/>
+        </w:rPr>
+      </w:pPr>
+    </w:p>
+    <w:p>
+      <w:pPr>
+        <w:ind w:firstLine="708"/>
+        <w:rPr>
+          <w:rFonts w:ascii="Arial" w:hAnsi="Arial" w:cs="Arial"/>
+          <w:lang w:val="en-US"/>
+        </w:rPr>
+      </w:pPr>
+    </w:p>
+    <w:p>
+      <w:pPr>
+        <w:ind w:firstLine="708"/>
+        <w:rPr>
+          <w:rFonts w:ascii="Arial" w:hAnsi="Arial" w:cs="Arial"/>
+          <w:lang w:val="en-US"/>
+        </w:rPr>
+      </w:pPr>
+    </w:p>
+    <w:p>
+      <w:pPr>
+        <w:ind w:firstLine="708"/>
+        <w:rPr>
+          <w:rFonts w:ascii="Arial" w:hAnsi="Arial" w:cs="Arial"/>
+          <w:lang w:val="en-US"/>
+        </w:rPr>
+      </w:pPr>
+    </w:p>
+    <w:p>
+      <w:pPr>
+        <w:ind w:firstLine="708"/>
+        <w:rPr>
+          <w:rFonts w:ascii="Arial" w:hAnsi="Arial" w:cs="Arial"/>
+          <w:lang w:val="en-US"/>
+        </w:rPr>
+      </w:pPr>
+    </w:p>
+    <w:p>
+      <w:pPr>
+        <w:ind w:firstLine="708"/>
+        <w:rPr>
+          <w:rFonts w:ascii="Arial" w:hAnsi="Arial" w:cs="Arial"/>
+          <w:lang w:val="en-US"/>
+        </w:rPr>
+      </w:pPr>
+    </w:p>
+    <w:p>
+      <w:pPr>
+        <w:ind w:firstLine="708"/>
+        <w:rPr>
+          <w:rFonts w:ascii="Arial" w:hAnsi="Arial" w:cs="Arial"/>
+          <w:lang w:val="en-US"/>
+        </w:rPr>
+      </w:pPr>
+    </w:p>
+    <w:p>
+      <w:pPr>
+        <w:ind w:firstLine="708"/>
+        <w:rPr>
+          <w:rFonts w:ascii="Arial" w:hAnsi="Arial" w:cs="Arial"/>
+          <w:lang w:val="en-US"/>
+        </w:rPr>
+      </w:pPr>
+    </w:p>
+    <w:p>
+      <w:pPr>
+        <w:ind w:firstLine="708"/>
+        <w:rPr>
+          <w:rFonts w:ascii="Arial" w:hAnsi="Arial" w:cs="Arial"/>
+          <w:lang w:val="en-US"/>
+        </w:rPr>
+      </w:pPr>
+    </w:p>
+    <w:p>
+      <w:pPr>
+        <w:rPr>
+          <w:rFonts w:ascii="Arial" w:hAnsi="Arial" w:cs="Arial"/>
+        </w:rPr>
+      </w:pPr>
+      <w:r>
+        <w:rPr>
+          <w:rFonts w:ascii="Arial" w:hAnsi="Arial" w:cs="Arial"/>
+        </w:rPr>
+        <w:t>Basándome</w:t>
+      </w:r>
+      <w:r>
+        <w:rPr>
+          <w:rFonts w:ascii="Arial" w:hAnsi="Arial" w:cs="Arial"/>
+        </w:rPr>
+        <w:t xml:space="preserve"> en estos diseños he hecho </w:t>
+      </w:r>
+      <w:r>
+        <w:rPr>
+          <w:rFonts w:ascii="Arial" w:hAnsi="Arial" w:cs="Arial"/>
+        </w:rPr>
+        <w:t xml:space="preserve">unos bocetos que se </w:t>
+      </w:r>
+      <w:r>
+        <w:rPr>
+          <w:rFonts w:ascii="Arial" w:hAnsi="Arial" w:cs="Arial"/>
+        </w:rPr>
+        <w:t>encuentran</w:t>
+      </w:r>
+      <w:r>
+        <w:rPr>
+          <w:rFonts w:ascii="Arial" w:hAnsi="Arial" w:cs="Arial"/>
+        </w:rPr>
+        <w:t xml:space="preserve"> en la carpeta </w:t>
+      </w:r>
+      <w:proofErr w:type="spellStart"/>
+      <w:r>
+        <w:rPr>
+          <w:rFonts w:ascii="Arial" w:hAnsi="Arial" w:cs="Arial"/>
+        </w:rPr>
+        <w:t>mokups</w:t>
+      </w:r>
+      <w:proofErr w:type="spellEnd"/>
+      <w:r>
+        <w:rPr>
+          <w:rFonts w:ascii="Arial" w:hAnsi="Arial" w:cs="Arial"/>
+        </w:rPr>
+        <w:t xml:space="preserve">, estos bocetos son una simple idea inicial para tener una base de </w:t>
+      </w:r>
+      <w:r>
+        <w:rPr>
+          <w:rFonts w:ascii="Arial" w:hAnsi="Arial" w:cs="Arial"/>
+        </w:rPr>
+        <w:t>cómo</w:t>
+      </w:r>
+      <w:r>
+        <w:rPr>
+          <w:rFonts w:ascii="Arial" w:hAnsi="Arial" w:cs="Arial"/>
+        </w:rPr>
+        <w:t xml:space="preserve"> tiene que ser la </w:t>
+      </w:r>
+      <w:proofErr w:type="gramStart"/>
+      <w:r>
+        <w:rPr>
+          <w:rFonts w:ascii="Arial" w:hAnsi="Arial" w:cs="Arial"/>
+        </w:rPr>
+        <w:t>app</w:t>
+      </w:r>
+      <w:proofErr w:type="gramEnd"/>
+      <w:r>
+        <w:rPr>
+          <w:rFonts w:ascii="Arial" w:hAnsi="Arial" w:cs="Arial"/>
+        </w:rPr>
+        <w:t>.</w:t>
+      </w:r>
+    </w:p>
+    <w:p>
+      <w:pPr>
+        <w:jc w:val="center"/>
+        <w:rPr>
+          <w:rFonts w:ascii="Arial" w:hAnsi="Arial" w:cs="Arial"/>
+        </w:rPr>
+      </w:pPr>
+      <w:r>
+        <w:rPr>
+          <w:rFonts w:ascii="Arial" w:hAnsi="Arial" w:cs="Arial"/>
+          <w:noProof/>
+        </w:rPr>
+        <w:lastRenderedPageBreak/>
+        <w:drawing>
+          <wp:inline distT="0" distB="0" distL="0" distR="0" wp14:anchorId="533C6686" wp14:editId="1BBEBD33">
+            <wp:extent cx="4895850" cy="3065087"/>
+            <wp:effectExtent l="0" t="0" r="0" b="2540"/>
+            <wp:docPr id="436122279" name="Imagen 6"/>
+            <wp:cNvGraphicFramePr>
+              <a:graphicFrameLocks xmlns:a="http://schemas.openxmlformats.org/drawingml/2006/main" noChangeAspect="1"/>
+            </wp:cNvGraphicFramePr>
+            <a:graphic xmlns:a="http://schemas.openxmlformats.org/drawingml/2006/main">
+              <a:graphicData uri="http://schemas.openxmlformats.org/drawingml/2006/picture">
+                <pic:pic xmlns:pic="http://schemas.openxmlformats.org/drawingml/2006/picture">
+                  <pic:nvPicPr>
+                    <pic:cNvPr id="0" name="Picture 7"/>
+                    <pic:cNvPicPr>
+                      <a:picLocks noChangeAspect="1" noChangeArrowheads="1"/>
+                    </pic:cNvPicPr>
+                  </pic:nvPicPr>
+                  <pic:blipFill>
+                    <a:blip r:embed="rId35">
+                      <a:extLst>
+                        <a:ext uri="{28A0092B-C50C-407E-A947-70E740481C1C}">
+                          <a14:useLocalDpi xmlns:a14="http://schemas.microsoft.com/office/drawing/2010/main" val="0"/>
+                        </a:ext>
+                      </a:extLst>
+                    </a:blip>
+                    <a:srcRect/>
+                    <a:stretch>
+                      <a:fillRect/>
+                    </a:stretch>
+                  </pic:blipFill>
+                  <pic:spPr bwMode="auto">
+                    <a:xfrm>
+                      <a:off x="0" y="0"/>
+                      <a:ext cx="4913676" cy="3076247"/>
+                    </a:xfrm>
+                    <a:prstGeom prst="rect">
+                      <a:avLst/>
+                    </a:prstGeom>
+                    <a:noFill/>
+                    <a:ln>
+                      <a:noFill/>
+                    </a:ln>
+                  </pic:spPr>
+                </pic:pic>
+              </a:graphicData>
+            </a:graphic>
+          </wp:inline>
+        </w:drawing>
+      </w:r>
+    </w:p>
+    <w:p>
+      <w:pPr>
+        <w:rPr>
+          <w:rFonts w:ascii="Arial" w:hAnsi="Arial" w:cs="Arial"/>
+        </w:rPr>
+      </w:pPr>
+      <w:r>
+        <w:rPr>
+          <w:rFonts w:ascii="Arial" w:hAnsi="Arial" w:cs="Arial"/>
+        </w:rPr>
+        <w:drawing>
+          <wp:inline distT="0" distB="0" distL="0" distR="0" wp14:anchorId="005B090A" wp14:editId="0458F376">
+            <wp:extent cx="5400040" cy="2624455"/>
+            <wp:effectExtent l="0" t="0" r="0" b="4445"/>
+            <wp:docPr id="1580197480" name="Imagen 8"/>
+            <wp:cNvGraphicFramePr>
+              <a:graphicFrameLocks xmlns:a="http://schemas.openxmlformats.org/drawingml/2006/main" noChangeAspect="1"/>
+            </wp:cNvGraphicFramePr>
+            <a:graphic xmlns:a="http://schemas.openxmlformats.org/drawingml/2006/main">
+              <a:graphicData uri="http://schemas.openxmlformats.org/drawingml/2006/picture">
+                <pic:pic xmlns:pic="http://schemas.openxmlformats.org/drawingml/2006/picture">
+                  <pic:nvPicPr>
+                    <pic:cNvPr id="0" name="Picture 14"/>
+                    <pic:cNvPicPr>
+                      <a:picLocks noChangeAspect="1" noChangeArrowheads="1"/>
+                    </pic:cNvPicPr>
+                  </pic:nvPicPr>
+                  <pic:blipFill>
+                    <a:blip r:embed="rId36" cstate="print">
+                      <a:extLst>
+                        <a:ext uri="{28A0092B-C50C-407E-A947-70E740481C1C}">
+                          <a14:useLocalDpi xmlns:a14="http://schemas.microsoft.com/office/drawing/2010/main" val="0"/>
+                        </a:ext>
+                      </a:extLst>
+                    </a:blip>
+                    <a:srcRect/>
+                    <a:stretch>
+                      <a:fillRect/>
+                    </a:stretch>
+                  </pic:blipFill>
+                  <pic:spPr bwMode="auto">
+                    <a:xfrm>
+                      <a:off x="0" y="0"/>
+                      <a:ext cx="5400040" cy="2624455"/>
+                    </a:xfrm>
+                    <a:prstGeom prst="rect">
+                      <a:avLst/>
+                    </a:prstGeom>
+                    <a:noFill/>
+                    <a:ln>
+                      <a:noFill/>
+                    </a:ln>
+                  </pic:spPr>
+                </pic:pic>
+              </a:graphicData>
+            </a:graphic>
+          </wp:inline>
+        </w:drawing>
+      </w:r>
+    </w:p>
+    <w:p>
+      <w:pPr>
+        <w:rPr>
+          <w:rFonts w:ascii="Arial" w:hAnsi="Arial" w:cs="Arial"/>
+        </w:rPr>
+      </w:pPr>
+      <w:r>
+        <w:rPr>
+          <w:rFonts w:ascii="Arial" w:hAnsi="Arial" w:cs="Arial"/>
+        </w:rPr>
+        <w:drawing>
+          <wp:inline distT="0" distB="0" distL="0" distR="0" wp14:anchorId="430B7041" wp14:editId="2EAB7FF7">
+            <wp:extent cx="5400040" cy="2604770"/>
+            <wp:effectExtent l="0" t="0" r="0" b="5080"/>
+            <wp:docPr id="1398191088" name="Imagen 10"/>
+            <wp:cNvGraphicFramePr>
+              <a:graphicFrameLocks xmlns:a="http://schemas.openxmlformats.org/drawingml/2006/main" noChangeAspect="1"/>
+            </wp:cNvGraphicFramePr>
+            <a:graphic xmlns:a="http://schemas.openxmlformats.org/drawingml/2006/main">
+              <a:graphicData uri="http://schemas.openxmlformats.org/drawingml/2006/picture">
+                <pic:pic xmlns:pic="http://schemas.openxmlformats.org/drawingml/2006/picture">
+                  <pic:nvPicPr>
+                    <pic:cNvPr id="0" name="Picture 21"/>
+                    <pic:cNvPicPr>
+                      <a:picLocks noChangeAspect="1" noChangeArrowheads="1"/>
+                    </pic:cNvPicPr>
+                  </pic:nvPicPr>
+                  <pic:blipFill>
+                    <a:blip r:embed="rId37" cstate="print">
+                      <a:extLst>
+                        <a:ext uri="{28A0092B-C50C-407E-A947-70E740481C1C}">
+                          <a14:useLocalDpi xmlns:a14="http://schemas.microsoft.com/office/drawing/2010/main" val="0"/>
+                        </a:ext>
+                      </a:extLst>
+                    </a:blip>
+                    <a:srcRect/>
+                    <a:stretch>
+                      <a:fillRect/>
+                    </a:stretch>
+                  </pic:blipFill>
+                  <pic:spPr bwMode="auto">
+                    <a:xfrm>
+                      <a:off x="0" y="0"/>
+                      <a:ext cx="5400040" cy="2604770"/>
+                    </a:xfrm>
+                    <a:prstGeom prst="rect">
+                      <a:avLst/>
+                    </a:prstGeom>
+                    <a:noFill/>
+                    <a:ln>
+                      <a:noFill/>
+                    </a:ln>
+                  </pic:spPr>
+                </pic:pic>
+              </a:graphicData>
+            </a:graphic>
+          </wp:inline>
+        </w:drawing>
+      </w:r>
+    </w:p>
+    <w:p>
+      <w:pPr>
+        <w:rPr>
+          <w:rFonts w:ascii="Arial" w:hAnsi="Arial" w:cs="Arial"/>
+        </w:rPr>
+      </w:pPr>
+      <w:r>
+        <w:rPr>
+          <w:rFonts w:ascii="Arial" w:hAnsi="Arial" w:cs="Arial"/>
+        </w:rPr>
+        <w:lastRenderedPageBreak/>
+        <w:t xml:space="preserve">Se puede ver en los </w:t>
+      </w:r>
+      <w:proofErr w:type="spellStart"/>
+      <w:r>
+        <w:rPr>
+          <w:rFonts w:ascii="Arial" w:hAnsi="Arial" w:cs="Arial"/>
+        </w:rPr>
+        <w:t>mokups</w:t>
+      </w:r>
+      <w:proofErr w:type="spellEnd"/>
+      <w:r>
+        <w:rPr>
+          <w:rFonts w:ascii="Arial" w:hAnsi="Arial" w:cs="Arial"/>
+        </w:rPr>
+        <w:t xml:space="preserve"> que tengo un diseño negro y otro blanco, esto es debido a que como mi aplicación puede tener modo oscuro he preferido tener la base de ambos para </w:t>
+      </w:r>
+      <w:r>
+        <w:rPr>
+          <w:rFonts w:ascii="Arial" w:hAnsi="Arial" w:cs="Arial"/>
+        </w:rPr>
+        <w:t>así tener mas opciones y tener un proceso mas creativo a la hora de desarrollar la aplicación.</w:t>
+      </w:r>
+    </w:p>
+    <w:p>
+      <w:pPr>
+        <w:rPr>
+          <w:rFonts w:ascii="Arial" w:hAnsi="Arial" w:cs="Arial"/>
+        </w:rPr>
+      </w:pPr>
+      <w:r>
+        <w:rPr>
+          <w:rFonts w:ascii="Arial" w:hAnsi="Arial" w:cs="Arial"/>
+        </w:rPr>
+        <w:br w:type="page"/>
+      </w:r>
+    </w:p>
+    <w:p>
+      <w:pPr>
+        <w:pStyle w:val="Ttulo2"/>
+        <w:numPr>
+          <w:ilvl w:val="1"/>
+          <w:numId w:val="1"/>
+        </w:numPr>
+        <w:jc w:val="both"/>
+        <w:rPr>
+          <w:rFonts w:ascii="Arial" w:hAnsi="Arial" w:cs="Arial"/>
+        </w:rPr>
+      </w:pPr>
+      <w:r>
+        <w:rPr>
+          <w:rFonts w:ascii="Arial" w:hAnsi="Arial" w:cs="Arial"/>
+        </w:rPr>
+        <w:lastRenderedPageBreak/>
+        <w:t>Implementación</w:t>
+      </w:r>
+    </w:p>
+    <w:p>
+      <w:pPr>
+        <w:pStyle w:val="Ttulo3"/>
+        <w:rPr>
+          <w:rFonts w:ascii="Arial" w:hAnsi="Arial" w:cs="Arial"/>
+        </w:rPr>
+      </w:pPr>
+      <w:r>
+        <w:rPr>
+          <w:rFonts w:ascii="Arial" w:hAnsi="Arial" w:cs="Arial"/>
+        </w:rPr>
+        <w:t>Organización del código</w:t>
+      </w:r>
+    </w:p>
+    <w:p>
+      <w:pPr>
+        <w:rPr>
+          <w:rFonts w:ascii="Arial" w:eastAsiaTheme="majorEastAsia" w:hAnsi="Arial" w:cs="Arial"/>
+          <w:color w:val="0F4761" w:themeColor="accent1" w:themeShade="BF"/>
+          <w:sz w:val="28"/>
+          <w:szCs w:val="28"/>
+        </w:rPr>
+      </w:pPr>
+      <w:r>
+        <w:rPr>
+          <w:rFonts w:ascii="Arial" w:hAnsi="Arial" w:cs="Arial"/>
+        </w:rPr>
+        <w:br w:type="page"/>
+      </w:r>
+    </w:p>
+    <w:p>
+      <w:pPr>
+        <w:pStyle w:val="Ttulo3"/>
+        <w:rPr>
+          <w:rFonts w:ascii="Arial" w:hAnsi="Arial" w:cs="Arial"/>
+        </w:rPr>
+      </w:pPr>
+      <w:r>
+        <w:rPr>
+          <w:rFonts w:ascii="Arial" w:hAnsi="Arial" w:cs="Arial"/>
+        </w:rPr>
+        <w:lastRenderedPageBreak/>
+        <w:t>Script de creación de la base de datos</w:t>
+      </w:r>
+    </w:p>
+    <w:p>
+      <w:pPr>
+        <w:rPr>
+          <w:rFonts w:ascii="Arial" w:eastAsiaTheme="majorEastAsia" w:hAnsi="Arial" w:cs="Arial"/>
+          <w:color w:val="0F4761" w:themeColor="accent1" w:themeShade="BF"/>
+          <w:sz w:val="28"/>
+          <w:szCs w:val="28"/>
+        </w:rPr>
+      </w:pPr>
+      <w:r>
+        <w:rPr>
+          <w:rFonts w:ascii="Arial" w:hAnsi="Arial" w:cs="Arial"/>
+        </w:rPr>
+        <w:br w:type="page"/>
+      </w:r>
+    </w:p>
+    <w:p>
+      <w:pPr>
+        <w:pStyle w:val="Ttulo3"/>
+        <w:rPr>
+          <w:rFonts w:ascii="Arial" w:hAnsi="Arial" w:cs="Arial"/>
+        </w:rPr>
+      </w:pPr>
+      <w:r>
+        <w:rPr>
+          <w:rFonts w:ascii="Arial" w:hAnsi="Arial" w:cs="Arial"/>
+        </w:rPr>
+        <w:lastRenderedPageBreak/>
+        <w:t>Hojas de estilo</w:t>
+      </w:r>
+      <w:r>
+        <w:rPr>
+          <w:rFonts w:ascii="Arial" w:hAnsi="Arial" w:cs="Arial"/>
+        </w:rPr>
+        <w:br/>
+      </w:r>
+    </w:p>
+    <w:p>
+      <w:pPr>
+        <w:rPr>
+          <w:rFonts w:ascii="Arial" w:hAnsi="Arial" w:cs="Arial"/>
+        </w:rPr>
+      </w:pPr>
+      <w:r>
+        <w:rPr>
+          <w:rFonts w:ascii="Arial" w:hAnsi="Arial" w:cs="Arial"/>
+        </w:rPr>
+        <w:t xml:space="preserve">Las hojas de </w:t>
+      </w:r>
+      <w:proofErr w:type="gramStart"/>
+      <w:r>
+        <w:rPr>
+          <w:rFonts w:ascii="Arial" w:hAnsi="Arial" w:cs="Arial"/>
+        </w:rPr>
+        <w:t>estilo,</w:t>
+      </w:r>
+      <w:proofErr w:type="gramEnd"/>
+      <w:r>
+        <w:rPr>
+          <w:rFonts w:ascii="Arial" w:hAnsi="Arial" w:cs="Arial"/>
+        </w:rPr>
+        <w:t xml:space="preserve"> </w:t>
+      </w:r>
+      <w:proofErr w:type="spellStart"/>
+      <w:r>
+        <w:rPr>
+          <w:rFonts w:ascii="Arial" w:hAnsi="Arial" w:cs="Arial"/>
+        </w:rPr>
+        <w:t>serian</w:t>
+      </w:r>
+      <w:proofErr w:type="spellEnd"/>
+      <w:r>
+        <w:rPr>
+          <w:rFonts w:ascii="Arial" w:hAnsi="Arial" w:cs="Arial"/>
+        </w:rPr>
+        <w:t xml:space="preserve"> las siguientes:</w:t>
+      </w:r>
+    </w:p>
+    <w:p>
+      <w:pPr>
+        <w:rPr>
+          <w:rFonts w:ascii="Arial" w:hAnsi="Arial" w:cs="Arial"/>
+        </w:rPr>
+      </w:pPr>
+      <w:r>
+        <w:rPr>
+          <w:rFonts w:ascii="Arial" w:hAnsi="Arial" w:cs="Arial"/>
+        </w:rPr>
+        <w:t>Modo claro:</w:t>
+      </w:r>
+    </w:p>
+    <w:p>
+      <w:pPr>
+        <w:rPr>
+          <w:rFonts w:ascii="Arial" w:hAnsi="Arial" w:cs="Arial"/>
+        </w:rPr>
+      </w:pPr>
+      <w:r>
+        <w:rPr>
+          <w:rFonts w:ascii="Arial" w:hAnsi="Arial" w:cs="Arial"/>
+        </w:rPr>
+        <w:drawing>
+          <wp:inline distT="0" distB="0" distL="0" distR="0" wp14:anchorId="15E45118" wp14:editId="060E6E9B">
+            <wp:extent cx="5400040" cy="3007995"/>
+            <wp:effectExtent l="0" t="0" r="0" b="1905"/>
+            <wp:docPr id="1297286521" name="Imagen 1"/>
+            <wp:cNvGraphicFramePr>
+              <a:graphicFrameLocks xmlns:a="http://schemas.openxmlformats.org/drawingml/2006/main" noChangeAspect="1"/>
+            </wp:cNvGraphicFramePr>
+            <a:graphic xmlns:a="http://schemas.openxmlformats.org/drawingml/2006/main">
+              <a:graphicData uri="http://schemas.openxmlformats.org/drawingml/2006/picture">
+                <pic:pic xmlns:pic="http://schemas.openxmlformats.org/drawingml/2006/picture">
+                  <pic:nvPicPr>
+                    <pic:cNvPr id="1297286521" name=""/>
+                    <pic:cNvPicPr/>
+                  </pic:nvPicPr>
+                  <pic:blipFill>
+                    <a:blip r:embed="rId38"/>
+                    <a:stretch>
+                      <a:fillRect/>
+                    </a:stretch>
+                  </pic:blipFill>
+                  <pic:spPr>
+                    <a:xfrm>
+                      <a:off x="0" y="0"/>
+                      <a:ext cx="5400040" cy="3007995"/>
+                    </a:xfrm>
+                    <a:prstGeom prst="rect">
+                      <a:avLst/>
+                    </a:prstGeom>
+                  </pic:spPr>
+                </pic:pic>
+              </a:graphicData>
+            </a:graphic>
+          </wp:inline>
+        </w:drawing>
+      </w:r>
+    </w:p>
+    <w:p>
+      <w:pPr>
+        <w:rPr>
+          <w:rFonts w:ascii="Arial" w:hAnsi="Arial" w:cs="Arial"/>
+        </w:rPr>
+      </w:pPr>
+      <w:r>
+        <w:rPr>
+          <w:rFonts w:ascii="Arial" w:hAnsi="Arial" w:cs="Arial"/>
+        </w:rPr>
+        <w:t>Modo oscuro</w:t>
+      </w:r>
+      <w:r>
+        <w:rPr>
+          <w:rFonts w:ascii="Arial" w:hAnsi="Arial" w:cs="Arial"/>
+        </w:rPr>
+        <w:t>:</w:t>
+      </w:r>
+    </w:p>
+    <w:p>
+      <w:pPr>
+        <w:rPr>
+          <w:rFonts w:ascii="Arial" w:hAnsi="Arial" w:cs="Arial"/>
+        </w:rPr>
+      </w:pPr>
+      <w:r>
+        <w:rPr>
+          <w:rFonts w:ascii="Arial" w:hAnsi="Arial" w:cs="Arial"/>
+        </w:rPr>
+        <w:drawing>
+          <wp:inline distT="0" distB="0" distL="0" distR="0" wp14:anchorId="562F97BC" wp14:editId="0B3A989D">
+            <wp:extent cx="5400040" cy="2994025"/>
+            <wp:effectExtent l="0" t="0" r="0" b="0"/>
+            <wp:docPr id="847376152" name="Imagen 1"/>
+            <wp:cNvGraphicFramePr>
+              <a:graphicFrameLocks xmlns:a="http://schemas.openxmlformats.org/drawingml/2006/main" noChangeAspect="1"/>
+            </wp:cNvGraphicFramePr>
+            <a:graphic xmlns:a="http://schemas.openxmlformats.org/drawingml/2006/main">
+              <a:graphicData uri="http://schemas.openxmlformats.org/drawingml/2006/picture">
+                <pic:pic xmlns:pic="http://schemas.openxmlformats.org/drawingml/2006/picture">
+                  <pic:nvPicPr>
+                    <pic:cNvPr id="847376152" name=""/>
+                    <pic:cNvPicPr/>
+                  </pic:nvPicPr>
+                  <pic:blipFill>
+                    <a:blip r:embed="rId39"/>
+                    <a:stretch>
+                      <a:fillRect/>
+                    </a:stretch>
+                  </pic:blipFill>
+                  <pic:spPr>
+                    <a:xfrm>
+                      <a:off x="0" y="0"/>
+                      <a:ext cx="5400040" cy="2994025"/>
+                    </a:xfrm>
+                    <a:prstGeom prst="rect">
+                      <a:avLst/>
+                    </a:prstGeom>
+                  </pic:spPr>
+                </pic:pic>
+              </a:graphicData>
+            </a:graphic>
+          </wp:inline>
+        </w:drawing>
+      </w:r>
+    </w:p>
+    <w:p>
+      <w:r>
+        <w:rPr>
+          <w:rFonts w:ascii="Arial" w:hAnsi="Arial" w:cs="Arial"/>
+        </w:rPr>
+        <w:t xml:space="preserve">La elección de estilos es clara </w:t>
+      </w:r>
+      <w:r>
+        <w:rPr>
+          <w:rFonts w:ascii="Arial" w:hAnsi="Arial" w:cs="Arial"/>
+        </w:rPr>
+        <w:t xml:space="preserve">fondos blancos y botones y textos en negro para el tema claro y colores secundarios como el rojo y el verde para gráficos puede que algún botón de eliminar o demás de elementos pequeños. La fuente seria IBM Plex </w:t>
+      </w:r>
+      <w:proofErr w:type="gramStart"/>
+      <w:r>
+        <w:rPr>
+          <w:rFonts w:ascii="Arial" w:hAnsi="Arial" w:cs="Arial"/>
+        </w:rPr>
+        <w:t>Sanas</w:t>
+      </w:r>
+      <w:proofErr w:type="gramEnd"/>
+      <w:r>
+        <w:rPr>
+          <w:rFonts w:ascii="Arial" w:hAnsi="Arial" w:cs="Arial"/>
+        </w:rPr>
+        <w:t xml:space="preserve"> aunque también se </w:t>
+      </w:r>
+      <w:r>
+        <w:rPr>
+          <w:rFonts w:ascii="Arial" w:hAnsi="Arial" w:cs="Arial"/>
+        </w:rPr>
+        <w:t>puede tener en cuenta la fuente roboto.</w:t>
+      </w:r>
+      <w:r>
+        <w:br w:type="page"/>
+      </w:r>
+    </w:p>
+    <w:p>
+      <w:pPr>
+        <w:pStyle w:val="Ttulo3"/>
+      </w:pPr>
+      <w:r>
+        <w:lastRenderedPageBreak/>
+        <w:t>Cuestiones de implementación y codificación reseñables</w:t>
+      </w:r>
+    </w:p>
+    <w:p>
+      <w:pPr>
+        <w:rPr>
+          <w:rFonts w:eastAsiaTheme="majorEastAsia" w:cstheme="majorBidi"/>
+          <w:color w:val="0F4761" w:themeColor="accent1" w:themeShade="BF"/>
+          <w:sz w:val="28"/>
+          <w:szCs w:val="28"/>
+        </w:rPr>
+      </w:pPr>
+      <w:r>
+        <w:br w:type="page"/>
+      </w:r>
+    </w:p>
+    <w:p>
+      <w:pPr>
+        <w:pStyle w:val="Ttulo2"/>
+        <w:numPr>
+          <w:ilvl w:val="1"/>
+          <w:numId w:val="1"/>
+        </w:numPr>
+      </w:pPr>
+      <w:r>
+        <w:lastRenderedPageBreak/>
+        <w:t xml:space="preserve">Gestión de </w:t>
+      </w:r>
+      <w:r>
+        <w:t>y versionado</w:t>
+      </w:r>
+    </w:p>
+    <w:p/>
+    <w:p>
+      <w:r>
+        <w:t xml:space="preserve">Como he seguido un versionado del </w:t>
+      </w:r>
+      <w:proofErr w:type="spellStart"/>
+      <w:r>
+        <w:t>codigo</w:t>
+      </w:r>
+      <w:proofErr w:type="spellEnd"/>
+      <w:r>
+        <w:t xml:space="preserve"> y de todos los archivos referentes al proyecto, pues muy </w:t>
+      </w:r>
+      <w:proofErr w:type="spellStart"/>
+      <w:r>
+        <w:t>secillo</w:t>
+      </w:r>
+      <w:proofErr w:type="spellEnd"/>
+      <w:r>
+        <w:t xml:space="preserve"> con la mejor herramienta que existe para este </w:t>
+      </w:r>
+      <w:proofErr w:type="spellStart"/>
+      <w:r>
+        <w:t>topico</w:t>
+      </w:r>
+      <w:proofErr w:type="spellEnd"/>
+      <w:r>
+        <w:t>,</w:t>
+      </w:r>
+    </w:p>
+    <w:p>
+      <w:r>
+        <w:t>GIT</w:t>
+      </w:r>
+      <w:r>
+        <w:t>.</w:t>
+      </w:r>
+    </w:p>
+    <w:p>
+      <w:r>
+        <w:t xml:space="preserve">Lo que he hecho a sido crear un proyecto para el </w:t>
+      </w:r>
+      <w:proofErr w:type="spellStart"/>
+      <w:r>
+        <w:t>codigo</w:t>
+      </w:r>
+      <w:proofErr w:type="spellEnd"/>
+      <w:r>
+        <w:t xml:space="preserve"> y luego otro proyecto para todo, la memoria, </w:t>
+      </w:r>
+      <w:proofErr w:type="spellStart"/>
+      <w:r>
+        <w:t>mokups</w:t>
+      </w:r>
+      <w:proofErr w:type="spellEnd"/>
+      <w:r>
+        <w:t xml:space="preserve">, </w:t>
+      </w:r>
+      <w:r>
+        <w:t xml:space="preserve">capturas, </w:t>
+      </w:r>
+      <w:proofErr w:type="spellStart"/>
+      <w:r>
+        <w:t>etc</w:t>
+      </w:r>
+      <w:proofErr w:type="spellEnd"/>
+    </w:p>
+    <w:p>
+      <w:r>
+        <w:t xml:space="preserve">Para crear el proyecto del </w:t>
+      </w:r>
+      <w:proofErr w:type="spellStart"/>
+      <w:r>
+        <w:t>codigo</w:t>
+      </w:r>
+      <w:proofErr w:type="spellEnd"/>
+      <w:r>
+        <w:t xml:space="preserve"> he usado los siguientes comandos de terminal en el </w:t>
+      </w:r>
+      <w:proofErr w:type="spellStart"/>
+      <w:r>
+        <w:t>cmd</w:t>
+      </w:r>
+      <w:proofErr w:type="spellEnd"/>
+      <w:r>
+        <w:t xml:space="preserve"> de Windows: </w:t>
+      </w:r>
+      <w:r>
+        <w:br/>
+      </w:r>
+      <w:r>
+        <w:drawing>
+          <wp:inline distT="0" distB="0" distL="0" distR="0" wp14:anchorId="018E3258" wp14:editId="26A74353">
+            <wp:extent cx="5400040" cy="2880995"/>
+            <wp:effectExtent l="0" t="0" r="0" b="0"/>
+            <wp:docPr id="1620738646" name="Imagen 1"/>
+            <wp:cNvGraphicFramePr>
+              <a:graphicFrameLocks xmlns:a="http://schemas.openxmlformats.org/drawingml/2006/main" noChangeAspect="1"/>
+            </wp:cNvGraphicFramePr>
+            <a:graphic xmlns:a="http://schemas.openxmlformats.org/drawingml/2006/main">
+              <a:graphicData uri="http://schemas.openxmlformats.org/drawingml/2006/picture">
+                <pic:pic xmlns:pic="http://schemas.openxmlformats.org/drawingml/2006/picture">
+                  <pic:nvPicPr>
+                    <pic:cNvPr id="1620738646" name=""/>
+                    <pic:cNvPicPr/>
+                  </pic:nvPicPr>
+                  <pic:blipFill>
+                    <a:blip r:embed="rId40"/>
+                    <a:stretch>
+                      <a:fillRect/>
+                    </a:stretch>
+                  </pic:blipFill>
+                  <pic:spPr>
+                    <a:xfrm>
+                      <a:off x="0" y="0"/>
+                      <a:ext cx="5400040" cy="2880995"/>
+                    </a:xfrm>
+                    <a:prstGeom prst="rect">
+                      <a:avLst/>
+                    </a:prstGeom>
+                  </pic:spPr>
+                </pic:pic>
+              </a:graphicData>
+            </a:graphic>
+          </wp:inline>
+        </w:drawing>
+      </w:r>
+    </w:p>
+    <w:p>
+      <w:r>
+        <w:t>Después</w:t>
+      </w:r>
+      <w:r>
+        <w:t xml:space="preserve"> la mayoría de los comandos y commits les he hecho usado git en vs code y github desktop.</w:t>
+      </w:r>
+    </w:p>
+    <w:p>
+      <w:r>
+        <w:t xml:space="preserve">Y para subir el proyecto a github e usado github desktop, (no he usado terminal ya que el proceso de </w:t>
+      </w:r>
+      <w:r>
+        <w:t>creación de claves ssh no es recomendable por motivos de seguridad</w:t>
+      </w:r>
+      <w:r>
+        <w:t>)</w:t>
+      </w:r>
+    </w:p>
+    <w:p>
+      <w:r>
+        <w:t xml:space="preserve">Estas son algunas capturas de </w:t>
+      </w:r>
+      <w:r>
+        <w:t>como es el proceso en github desktop.</w:t>
+      </w:r>
+    </w:p>
+    <w:p>
+      <w:r>
+        <w:drawing>
+          <wp:anchor distT="0" distB="0" distL="114300" distR="114300" simplePos="0" relativeHeight="251666432" behindDoc="0" locked="0" layoutInCell="1" allowOverlap="1" wp14:anchorId="0A394721" wp14:editId="5D25D80A">
+            <wp:simplePos x="0" y="0"/>
+            <wp:positionH relativeFrom="margin">
+              <wp:align>center</wp:align>
+            </wp:positionH>
+            <wp:positionV relativeFrom="paragraph">
+              <wp:posOffset>103505</wp:posOffset>
+            </wp:positionV>
+            <wp:extent cx="3466465" cy="2365463"/>
+            <wp:effectExtent l="0" t="0" r="635" b="0"/>
+            <wp:wrapNone/>
+            <wp:docPr id="1665163919" name="Imagen 14"/>
+            <wp:cNvGraphicFramePr>
+              <a:graphicFrameLocks xmlns:a="http://schemas.openxmlformats.org/drawingml/2006/main" noChangeAspect="1"/>
+            </wp:cNvGraphicFramePr>
+            <a:graphic xmlns:a="http://schemas.openxmlformats.org/drawingml/2006/main">
+              <a:graphicData uri="http://schemas.openxmlformats.org/drawingml/2006/picture">
+                <pic:pic xmlns:pic="http://schemas.openxmlformats.org/drawingml/2006/picture">
+                  <pic:nvPicPr>
+                    <pic:cNvPr id="0" name="Picture 35"/>
+                    <pic:cNvPicPr>
+                      <a:picLocks noChangeAspect="1" noChangeArrowheads="1"/>
+                    </pic:cNvPicPr>
+                  </pic:nvPicPr>
+                  <pic:blipFill>
+                    <a:blip r:embed="rId41" cstate="print">
+                      <a:extLst>
+                        <a:ext uri="{28A0092B-C50C-407E-A947-70E740481C1C}">
+                          <a14:useLocalDpi xmlns:a14="http://schemas.microsoft.com/office/drawing/2010/main" val="0"/>
+                        </a:ext>
+                      </a:extLst>
+                    </a:blip>
+                    <a:srcRect/>
+                    <a:stretch>
+                      <a:fillRect/>
+                    </a:stretch>
+                  </pic:blipFill>
+                  <pic:spPr bwMode="auto">
+                    <a:xfrm>
+                      <a:off x="0" y="0"/>
+                      <a:ext cx="3466465" cy="2365463"/>
+                    </a:xfrm>
+                    <a:prstGeom prst="rect">
+                      <a:avLst/>
+                    </a:prstGeom>
+                    <a:noFill/>
+                    <a:ln>
+                      <a:noFill/>
+                    </a:ln>
+                  </pic:spPr>
+                </pic:pic>
+              </a:graphicData>
+            </a:graphic>
+            <wp14:sizeRelH relativeFrom="margin">
+              <wp14:pctWidth>0</wp14:pctWidth>
+            </wp14:sizeRelH>
+            <wp14:sizeRelV relativeFrom="margin">
+              <wp14:pctHeight>0</wp14:pctHeight>
+            </wp14:sizeRelV>
+          </wp:anchor>
+        </w:drawing>
+      </w:r>
+      <w:r>
+        <w:t>Crear el repo:</w:t>
+      </w:r>
+    </w:p>
+    <w:p/>
+    <w:p/>
+    <w:p/>
+    <w:p>
+      <w:r>
+        <w:lastRenderedPageBreak/>
+        <w:t xml:space="preserve">Push a github </w:t>
+      </w:r>
+      <w:r>
+        <w:br/>
+      </w:r>
+      <w:r>
+        <w:drawing>
+          <wp:inline distT="0" distB="0" distL="0" distR="0" wp14:anchorId="4A2FD823" wp14:editId="204A7D58">
+            <wp:extent cx="4257675" cy="2924175"/>
+            <wp:effectExtent l="0" t="0" r="9525" b="9525"/>
+            <wp:docPr id="1032100031" name="Imagen 12"/>
+            <wp:cNvGraphicFramePr>
+              <a:graphicFrameLocks xmlns:a="http://schemas.openxmlformats.org/drawingml/2006/main" noChangeAspect="1"/>
+            </wp:cNvGraphicFramePr>
+            <a:graphic xmlns:a="http://schemas.openxmlformats.org/drawingml/2006/main">
+              <a:graphicData uri="http://schemas.openxmlformats.org/drawingml/2006/picture">
+                <pic:pic xmlns:pic="http://schemas.openxmlformats.org/drawingml/2006/picture">
+                  <pic:nvPicPr>
+                    <pic:cNvPr id="0" name="Picture 28"/>
+                    <pic:cNvPicPr>
+                      <a:picLocks noChangeAspect="1" noChangeArrowheads="1"/>
+                    </pic:cNvPicPr>
+                  </pic:nvPicPr>
+                  <pic:blipFill>
+                    <a:blip r:embed="rId42">
+                      <a:extLst>
+                        <a:ext uri="{28A0092B-C50C-407E-A947-70E740481C1C}">
+                          <a14:useLocalDpi xmlns:a14="http://schemas.microsoft.com/office/drawing/2010/main" val="0"/>
+                        </a:ext>
+                      </a:extLst>
+                    </a:blip>
+                    <a:srcRect/>
+                    <a:stretch>
+                      <a:fillRect/>
+                    </a:stretch>
+                  </pic:blipFill>
+                  <pic:spPr bwMode="auto">
+                    <a:xfrm>
+                      <a:off x="0" y="0"/>
+                      <a:ext cx="4257675" cy="2924175"/>
+                    </a:xfrm>
+                    <a:prstGeom prst="rect">
+                      <a:avLst/>
+                    </a:prstGeom>
+                    <a:noFill/>
+                    <a:ln>
+                      <a:noFill/>
+                    </a:ln>
+                  </pic:spPr>
+                </pic:pic>
+              </a:graphicData>
+            </a:graphic>
+          </wp:inline>
+        </w:drawing>
+      </w:r>
+    </w:p>
+    <w:p/>
     <w:sectPr>
       <w:pgSz w:w="11906" w:h="16838"/>
       <w:pgMar w:top="1417" w:right="1701" w:bottom="1417" w:left="1701" w:header="708" w:footer="708" w:gutter="0"/>
@@ -13751,6 +16506,127 @@
     </w:lvl>
   </w:abstractNum>
   <w:abstractNum w:abstractNumId="8" w15:restartNumberingAfterBreak="0">
+    <w:nsid w:val="3076654A"/>
+    <w:multiLevelType w:val="multilevel"/>
+    <w:tmpl w:val="616871FE"/>
+    <w:lvl w:ilvl="0">
+      <w:start w:val="1"/>
+      <w:numFmt w:val="decimal"/>
+      <w:lvlText w:val="%1."/>
+      <w:lvlJc w:val="left"/>
+      <w:pPr>
+        <w:ind w:left="720" w:hanging="360"/>
+      </w:pPr>
+      <w:rPr>
+        <w:rFonts w:hint="default"/>
+      </w:rPr>
+    </w:lvl>
+    <w:lvl w:ilvl="1">
+      <w:start w:val="1"/>
+      <w:numFmt w:val="decimal"/>
+      <w:isLgl/>
+      <w:lvlText w:val="%1.%2"/>
+      <w:lvlJc w:val="left"/>
+      <w:pPr>
+        <w:ind w:left="840" w:hanging="480"/>
+      </w:pPr>
+      <w:rPr>
+        <w:rFonts w:hint="default"/>
+      </w:rPr>
+    </w:lvl>
+    <w:lvl w:ilvl="2">
+      <w:start w:val="1"/>
+      <w:numFmt w:val="decimal"/>
+      <w:isLgl/>
+      <w:lvlText w:val="%1.%2.%3"/>
+      <w:lvlJc w:val="left"/>
+      <w:pPr>
+        <w:ind w:left="1080" w:hanging="720"/>
+      </w:pPr>
+      <w:rPr>
+        <w:rFonts w:hint="default"/>
+      </w:rPr>
+    </w:lvl>
+    <w:lvl w:ilvl="3">
+      <w:start w:val="1"/>
+      <w:numFmt w:val="decimal"/>
+      <w:isLgl/>
+      <w:lvlText w:val="%1.%2.%3.%4"/>
+      <w:lvlJc w:val="left"/>
+      <w:pPr>
+        <w:ind w:left="1440" w:hanging="1080"/>
+      </w:pPr>
+      <w:rPr>
+        <w:rFonts w:hint="default"/>
+      </w:rPr>
+    </w:lvl>
+    <w:lvl w:ilvl="4">
+      <w:start w:val="1"/>
+      <w:numFmt w:val="decimal"/>
+      <w:isLgl/>
+      <w:lvlText w:val="%1.%2.%3.%4.%5"/>
+      <w:lvlJc w:val="left"/>
+      <w:pPr>
+        <w:ind w:left="1440" w:hanging="1080"/>
+      </w:pPr>
+      <w:rPr>
+        <w:rFonts w:hint="default"/>
+      </w:rPr>
+    </w:lvl>
+    <w:lvl w:ilvl="5">
+      <w:start w:val="1"/>
+      <w:numFmt w:val="decimal"/>
+      <w:isLgl/>
+      <w:lvlText w:val="%1.%2.%3.%4.%5.%6"/>
+      <w:lvlJc w:val="left"/>
+      <w:pPr>
+        <w:ind w:left="1800" w:hanging="1440"/>
+      </w:pPr>
+      <w:rPr>
+        <w:rFonts w:hint="default"/>
+      </w:rPr>
+    </w:lvl>
+    <w:lvl w:ilvl="6">
+      <w:start w:val="1"/>
+      <w:numFmt w:val="decimal"/>
+      <w:isLgl/>
+      <w:lvlText w:val="%1.%2.%3.%4.%5.%6.%7"/>
+      <w:lvlJc w:val="left"/>
+      <w:pPr>
+        <w:ind w:left="1800" w:hanging="1440"/>
+      </w:pPr>
+      <w:rPr>
+        <w:rFonts w:hint="default"/>
+      </w:rPr>
+    </w:lvl>
+    <w:lvl w:ilvl="7">
+      <w:start w:val="1"/>
+      <w:numFmt w:val="decimal"/>
+      <w:isLgl/>
+      <w:lvlText w:val="%1.%2.%3.%4.%5.%6.%7.%8"/>
+      <w:lvlJc w:val="left"/>
+      <w:pPr>
+        <w:ind w:left="2160" w:hanging="1800"/>
+      </w:pPr>
+      <w:rPr>
+        <w:rFonts w:hint="default"/>
+      </w:rPr>
+    </w:lvl>
+    <w:lvl w:ilvl="8">
+      <w:start w:val="1"/>
+      <w:numFmt w:val="decimal"/>
+      <w:isLgl/>
+      <w:lvlText w:val="%1.%2.%3.%4.%5.%6.%7.%8.%9"/>
+      <w:lvlJc w:val="left"/>
+      <w:pPr>
+        <w:ind w:left="2160" w:hanging="1800"/>
+      </w:pPr>
+      <w:rPr>
+        <w:rFonts w:hint="default"/>
+      </w:rPr>
+    </w:lvl>
+  </w:abstractNum>
+  <w:abstractNum w:abstractNumId="9" w15:restartNumberingAfterBreak="0">
     <w:nsid w:val="31BE72D8"/>
     <w:multiLevelType w:val="hybridMultilevel"/>
     <w:tmpl w:val="11623A0A"/>
@@ -13863,7 +16739,7 @@
       </w:rPr>
     </w:lvl>
   </w:abstractNum>
-  <w:abstractNum w:abstractNumId="9" w15:restartNumberingAfterBreak="0">
+  <w:abstractNum w:abstractNumId="10" w15:restartNumberingAfterBreak="0">
     <w:nsid w:val="3E532B22"/>
     <w:multiLevelType w:val="hybridMultilevel"/>
     <w:tmpl w:val="C56A10F8"/>
@@ -13976,7 +16852,7 @@
       </w:rPr>
     </w:lvl>
   </w:abstractNum>
-  <w:abstractNum w:abstractNumId="10" w15:restartNumberingAfterBreak="0">
+  <w:abstractNum w:abstractNumId="11" w15:restartNumberingAfterBreak="0">
     <w:nsid w:val="4BA4215F"/>
     <w:multiLevelType w:val="multilevel"/>
     <w:tmpl w:val="DE5A9C6A"/>
@@ -14125,7 +17001,7 @@
       </w:rPr>
     </w:lvl>
   </w:abstractNum>
-  <w:abstractNum w:abstractNumId="11" w15:restartNumberingAfterBreak="0">
+  <w:abstractNum w:abstractNumId="12" w15:restartNumberingAfterBreak="0">
     <w:nsid w:val="4D446FD3"/>
     <w:multiLevelType w:val="hybridMultilevel"/>
     <w:tmpl w:val="2138A96C"/>
@@ -14213,7 +17089,7 @@
       </w:pPr>
     </w:lvl>
   </w:abstractNum>
-  <w:abstractNum w:abstractNumId="12" w15:restartNumberingAfterBreak="0">
+  <w:abstractNum w:abstractNumId="13" w15:restartNumberingAfterBreak="0">
     <w:nsid w:val="595D060A"/>
     <w:multiLevelType w:val="multilevel"/>
     <w:tmpl w:val="616871FE"/>
@@ -14334,7 +17210,7 @@
       </w:rPr>
     </w:lvl>
   </w:abstractNum>
-  <w:abstractNum w:abstractNumId="13" w15:restartNumberingAfterBreak="0">
+  <w:abstractNum w:abstractNumId="14" w15:restartNumberingAfterBreak="0">
     <w:nsid w:val="5D26465D"/>
     <w:multiLevelType w:val="multilevel"/>
     <w:tmpl w:val="616871FE"/>
@@ -14455,7 +17331,7 @@
       </w:rPr>
     </w:lvl>
   </w:abstractNum>
-  <w:abstractNum w:abstractNumId="14" w15:restartNumberingAfterBreak="0">
+  <w:abstractNum w:abstractNumId="15" w15:restartNumberingAfterBreak="0">
     <w:nsid w:val="5D7518BC"/>
     <w:multiLevelType w:val="hybridMultilevel"/>
     <w:tmpl w:val="4176A31A"/>
@@ -14544,7 +17420,7 @@
       </w:pPr>
     </w:lvl>
   </w:abstractNum>
-  <w:abstractNum w:abstractNumId="15" w15:restartNumberingAfterBreak="0">
+  <w:abstractNum w:abstractNumId="16" w15:restartNumberingAfterBreak="0">
     <w:nsid w:val="5EC27785"/>
     <w:multiLevelType w:val="hybridMultilevel"/>
     <w:tmpl w:val="1F240BE2"/>
@@ -14657,7 +17533,7 @@
       </w:rPr>
     </w:lvl>
   </w:abstractNum>
-  <w:abstractNum w:abstractNumId="16" w15:restartNumberingAfterBreak="0">
+  <w:abstractNum w:abstractNumId="17" w15:restartNumberingAfterBreak="0">
     <w:nsid w:val="66687175"/>
     <w:multiLevelType w:val="hybridMultilevel"/>
     <w:tmpl w:val="2EB66ECE"/>
@@ -14746,7 +17622,7 @@
       </w:pPr>
     </w:lvl>
   </w:abstractNum>
-  <w:abstractNum w:abstractNumId="17" w15:restartNumberingAfterBreak="0">
+  <w:abstractNum w:abstractNumId="18" w15:restartNumberingAfterBreak="0">
     <w:nsid w:val="6A256425"/>
     <w:multiLevelType w:val="multilevel"/>
     <w:tmpl w:val="616871FE"/>
@@ -14867,7 +17743,7 @@
       </w:rPr>
     </w:lvl>
   </w:abstractNum>
-  <w:abstractNum w:abstractNumId="18" w15:restartNumberingAfterBreak="0">
+  <w:abstractNum w:abstractNumId="19" w15:restartNumberingAfterBreak="0">
     <w:nsid w:val="6A935BDE"/>
     <w:multiLevelType w:val="multilevel"/>
     <w:tmpl w:val="616871FE"/>
@@ -14988,7 +17864,7 @@
       </w:rPr>
     </w:lvl>
   </w:abstractNum>
-  <w:abstractNum w:abstractNumId="19" w15:restartNumberingAfterBreak="0">
+  <w:abstractNum w:abstractNumId="20" w15:restartNumberingAfterBreak="0">
     <w:nsid w:val="6B126ED8"/>
     <w:multiLevelType w:val="hybridMultilevel"/>
     <w:tmpl w:val="9B58273E"/>
@@ -15101,7 +17977,7 @@
       </w:rPr>
     </w:lvl>
   </w:abstractNum>
-  <w:abstractNum w:abstractNumId="20" w15:restartNumberingAfterBreak="0">
+  <w:abstractNum w:abstractNumId="21" w15:restartNumberingAfterBreak="0">
     <w:nsid w:val="6EA74052"/>
     <w:multiLevelType w:val="multilevel"/>
     <w:tmpl w:val="83A6F570"/>
@@ -15250,7 +18126,7 @@
       </w:rPr>
     </w:lvl>
   </w:abstractNum>
-  <w:abstractNum w:abstractNumId="21" w15:restartNumberingAfterBreak="0">
+  <w:abstractNum w:abstractNumId="22" w15:restartNumberingAfterBreak="0">
     <w:nsid w:val="72087262"/>
     <w:multiLevelType w:val="multilevel"/>
     <w:tmpl w:val="616871FE"/>
@@ -15371,7 +18247,7 @@
       </w:rPr>
     </w:lvl>
   </w:abstractNum>
-  <w:abstractNum w:abstractNumId="22" w15:restartNumberingAfterBreak="0">
+  <w:abstractNum w:abstractNumId="23" w15:restartNumberingAfterBreak="0">
     <w:nsid w:val="743319BA"/>
     <w:multiLevelType w:val="hybridMultilevel"/>
     <w:tmpl w:val="5D6428F2"/>
@@ -15484,7 +18360,7 @@
       </w:rPr>
     </w:lvl>
   </w:abstractNum>
-  <w:abstractNum w:abstractNumId="23" w15:restartNumberingAfterBreak="0">
+  <w:abstractNum w:abstractNumId="24" w15:restartNumberingAfterBreak="0">
     <w:nsid w:val="7472784F"/>
     <w:multiLevelType w:val="hybridMultilevel"/>
     <w:tmpl w:val="C54A455E"/>
@@ -15572,7 +18448,7 @@
       </w:pPr>
     </w:lvl>
   </w:abstractNum>
-  <w:abstractNum w:abstractNumId="24" w15:restartNumberingAfterBreak="0">
+  <w:abstractNum w:abstractNumId="25" w15:restartNumberingAfterBreak="0">
     <w:nsid w:val="7A6B3893"/>
     <w:multiLevelType w:val="hybridMultilevel"/>
     <w:tmpl w:val="5FAE1D1A"/>
@@ -15685,7 +18561,7 @@
       </w:rPr>
     </w:lvl>
   </w:abstractNum>
-  <w:abstractNum w:abstractNumId="25" w15:restartNumberingAfterBreak="0">
+  <w:abstractNum w:abstractNumId="26" w15:restartNumberingAfterBreak="0">
     <w:nsid w:val="7C120CE7"/>
     <w:multiLevelType w:val="hybridMultilevel"/>
     <w:tmpl w:val="109C8E42"/>
@@ -15774,7 +18650,7 @@
       </w:pPr>
     </w:lvl>
   </w:abstractNum>
-  <w:abstractNum w:abstractNumId="26" w15:restartNumberingAfterBreak="0">
+  <w:abstractNum w:abstractNumId="27" w15:restartNumberingAfterBreak="0">
     <w:nsid w:val="7CAD5C99"/>
     <w:multiLevelType w:val="multilevel"/>
     <w:tmpl w:val="22A44A34"/>
@@ -15894,7 +18770,7 @@
       </w:rPr>
     </w:lvl>
   </w:abstractNum>
-  <w:abstractNum w:abstractNumId="27" w15:restartNumberingAfterBreak="0">
+  <w:abstractNum w:abstractNumId="28" w15:restartNumberingAfterBreak="0">
     <w:nsid w:val="7DAC1368"/>
     <w:multiLevelType w:val="multilevel"/>
     <w:tmpl w:val="616871FE"/>
@@ -16015,7 +18891,128 @@
       </w:rPr>
     </w:lvl>
   </w:abstractNum>
-  <w:abstractNum w:abstractNumId="28" w15:restartNumberingAfterBreak="0">
+  <w:abstractNum w:abstractNumId="29" w15:restartNumberingAfterBreak="0">
+    <w:nsid w:val="7EA43C3A"/>
+    <w:multiLevelType w:val="multilevel"/>
+    <w:tmpl w:val="616871FE"/>
+    <w:lvl w:ilvl="0">
+      <w:start w:val="1"/>
+      <w:numFmt w:val="decimal"/>
+      <w:lvlText w:val="%1."/>
+      <w:lvlJc w:val="left"/>
+      <w:pPr>
+        <w:ind w:left="720" w:hanging="360"/>
+      </w:pPr>
+      <w:rPr>
+        <w:rFonts w:hint="default"/>
+      </w:rPr>
+    </w:lvl>
+    <w:lvl w:ilvl="1">
+      <w:start w:val="1"/>
+      <w:numFmt w:val="decimal"/>
+      <w:isLgl/>
+      <w:lvlText w:val="%1.%2"/>
+      <w:lvlJc w:val="left"/>
+      <w:pPr>
+        <w:ind w:left="840" w:hanging="480"/>
+      </w:pPr>
+      <w:rPr>
+        <w:rFonts w:hint="default"/>
+      </w:rPr>
+    </w:lvl>
+    <w:lvl w:ilvl="2">
+      <w:start w:val="1"/>
+      <w:numFmt w:val="decimal"/>
+      <w:isLgl/>
+      <w:lvlText w:val="%1.%2.%3"/>
+      <w:lvlJc w:val="left"/>
+      <w:pPr>
+        <w:ind w:left="1080" w:hanging="720"/>
+      </w:pPr>
+      <w:rPr>
+        <w:rFonts w:hint="default"/>
+      </w:rPr>
+    </w:lvl>
+    <w:lvl w:ilvl="3">
+      <w:start w:val="1"/>
+      <w:numFmt w:val="decimal"/>
+      <w:isLgl/>
+      <w:lvlText w:val="%1.%2.%3.%4"/>
+      <w:lvlJc w:val="left"/>
+      <w:pPr>
+        <w:ind w:left="1440" w:hanging="1080"/>
+      </w:pPr>
+      <w:rPr>
+        <w:rFonts w:hint="default"/>
+      </w:rPr>
+    </w:lvl>
+    <w:lvl w:ilvl="4">
+      <w:start w:val="1"/>
+      <w:numFmt w:val="decimal"/>
+      <w:isLgl/>
+      <w:lvlText w:val="%1.%2.%3.%4.%5"/>
+      <w:lvlJc w:val="left"/>
+      <w:pPr>
+        <w:ind w:left="1440" w:hanging="1080"/>
+      </w:pPr>
+      <w:rPr>
+        <w:rFonts w:hint="default"/>
+      </w:rPr>
+    </w:lvl>
+    <w:lvl w:ilvl="5">
+      <w:start w:val="1"/>
+      <w:numFmt w:val="decimal"/>
+      <w:isLgl/>
+      <w:lvlText w:val="%1.%2.%3.%4.%5.%6"/>
+      <w:lvlJc w:val="left"/>
+      <w:pPr>
+        <w:ind w:left="1800" w:hanging="1440"/>
+      </w:pPr>
+      <w:rPr>
+        <w:rFonts w:hint="default"/>
+      </w:rPr>
+    </w:lvl>
+    <w:lvl w:ilvl="6">
+      <w:start w:val="1"/>
+      <w:numFmt w:val="decimal"/>
+      <w:isLgl/>
+      <w:lvlText w:val="%1.%2.%3.%4.%5.%6.%7"/>
+      <w:lvlJc w:val="left"/>
+      <w:pPr>
+        <w:ind w:left="1800" w:hanging="1440"/>
+      </w:pPr>
+      <w:rPr>
+        <w:rFonts w:hint="default"/>
+      </w:rPr>
+    </w:lvl>
+    <w:lvl w:ilvl="7">
+      <w:start w:val="1"/>
+      <w:numFmt w:val="decimal"/>
+      <w:isLgl/>
+      <w:lvlText w:val="%1.%2.%3.%4.%5.%6.%7.%8"/>
+      <w:lvlJc w:val="left"/>
+      <w:pPr>
+        <w:ind w:left="2160" w:hanging="1800"/>
+      </w:pPr>
+      <w:rPr>
+        <w:rFonts w:hint="default"/>
+      </w:rPr>
+    </w:lvl>
+    <w:lvl w:ilvl="8">
+      <w:start w:val="1"/>
+      <w:numFmt w:val="decimal"/>
+      <w:isLgl/>
+      <w:lvlText w:val="%1.%2.%3.%4.%5.%6.%7.%8.%9"/>
+      <w:lvlJc w:val="left"/>
+      <w:pPr>
+        <w:ind w:left="2160" w:hanging="1800"/>
+      </w:pPr>
+      <w:rPr>
+        <w:rFonts w:hint="default"/>
+      </w:rPr>
+    </w:lvl>
+  </w:abstractNum>
+  <w:abstractNum w:abstractNumId="30" w15:restartNumberingAfterBreak="0">
     <w:nsid w:val="7FCB61FC"/>
     <w:multiLevelType w:val="multilevel"/>
     <w:tmpl w:val="616871FE"/>
@@ -16137,52 +19134,52 @@
     </w:lvl>
   </w:abstractNum>
   <w:num w:numId="1" w16cid:durableId="1271471921">
-    <w:abstractNumId w:val="28"/>
+    <w:abstractNumId w:val="30"/>
   </w:num>
   <w:num w:numId="2" w16cid:durableId="1815179332">
-    <w:abstractNumId w:val="14"/>
+    <w:abstractNumId w:val="15"/>
   </w:num>
   <w:num w:numId="3" w16cid:durableId="1842818403">
-    <w:abstractNumId w:val="16"/>
+    <w:abstractNumId w:val="17"/>
   </w:num>
   <w:num w:numId="4" w16cid:durableId="45643440">
-    <w:abstractNumId w:val="25"/>
+    <w:abstractNumId w:val="26"/>
   </w:num>
   <w:num w:numId="5" w16cid:durableId="1614822858">
     <w:abstractNumId w:val="5"/>
   </w:num>
   <w:num w:numId="6" w16cid:durableId="1415660050">
-    <w:abstractNumId w:val="22"/>
+    <w:abstractNumId w:val="23"/>
   </w:num>
   <w:num w:numId="7" w16cid:durableId="1227373009">
     <w:abstractNumId w:val="0"/>
   </w:num>
   <w:num w:numId="8" w16cid:durableId="473983111">
-    <w:abstractNumId w:val="10"/>
+    <w:abstractNumId w:val="11"/>
   </w:num>
   <w:num w:numId="9" w16cid:durableId="1032463250">
-    <w:abstractNumId w:val="20"/>
+    <w:abstractNumId w:val="21"/>
   </w:num>
   <w:num w:numId="10" w16cid:durableId="1141649543">
-    <w:abstractNumId w:val="23"/>
+    <w:abstractNumId w:val="24"/>
   </w:num>
   <w:num w:numId="11" w16cid:durableId="588848072">
-    <w:abstractNumId w:val="11"/>
+    <w:abstractNumId w:val="12"/>
   </w:num>
   <w:num w:numId="12" w16cid:durableId="758480631">
-    <w:abstractNumId w:val="26"/>
+    <w:abstractNumId w:val="27"/>
   </w:num>
   <w:num w:numId="13" w16cid:durableId="2047095648">
-    <w:abstractNumId w:val="8"/>
+    <w:abstractNumId w:val="9"/>
   </w:num>
   <w:num w:numId="14" w16cid:durableId="688604191">
-    <w:abstractNumId w:val="13"/>
+    <w:abstractNumId w:val="14"/>
   </w:num>
   <w:num w:numId="15" w16cid:durableId="1783184958">
     <w:abstractNumId w:val="2"/>
   </w:num>
   <w:num w:numId="16" w16cid:durableId="722876433">
-    <w:abstractNumId w:val="27"/>
+    <w:abstractNumId w:val="28"/>
   </w:num>
   <w:num w:numId="17" w16cid:durableId="619654256">
     <w:abstractNumId w:val="4"/>
@@ -16191,10 +19188,10 @@
     <w:abstractNumId w:val="6"/>
   </w:num>
   <w:num w:numId="19" w16cid:durableId="2067138921">
-    <w:abstractNumId w:val="9"/>
+    <w:abstractNumId w:val="10"/>
   </w:num>
   <w:num w:numId="20" w16cid:durableId="999192683">
-    <w:abstractNumId w:val="17"/>
+    <w:abstractNumId w:val="18"/>
   </w:num>
   <w:num w:numId="21" w16cid:durableId="327942855">
     <w:abstractNumId w:val="3"/>
@@ -16203,25 +19200,31 @@
     <w:abstractNumId w:val="1"/>
   </w:num>
   <w:num w:numId="23" w16cid:durableId="262618225">
-    <w:abstractNumId w:val="18"/>
+    <w:abstractNumId w:val="19"/>
   </w:num>
   <w:num w:numId="24" w16cid:durableId="1398940470">
     <w:abstractNumId w:val="7"/>
   </w:num>
   <w:num w:numId="25" w16cid:durableId="984118983">
-    <w:abstractNumId w:val="21"/>
+    <w:abstractNumId w:val="22"/>
   </w:num>
   <w:num w:numId="26" w16cid:durableId="1288002482">
-    <w:abstractNumId w:val="24"/>
+    <w:abstractNumId w:val="25"/>
   </w:num>
   <w:num w:numId="27" w16cid:durableId="1290279422">
-    <w:abstractNumId w:val="19"/>
+    <w:abstractNumId w:val="20"/>
   </w:num>
   <w:num w:numId="28" w16cid:durableId="1404833187">
-    <w:abstractNumId w:val="15"/>
+    <w:abstractNumId w:val="16"/>
   </w:num>
   <w:num w:numId="29" w16cid:durableId="1505586518">
-    <w:abstractNumId w:val="12"/>
+    <w:abstractNumId w:val="13"/>
+  </w:num>
+  <w:num w:numId="30" w16cid:durableId="1027409641">
+    <w:abstractNumId w:val="29"/>
+  </w:num>
+  <w:num w:numId="31" w16cid:durableId="364403812">
+    <w:abstractNumId w:val="8"/>
   </w:num>
 </w:numbering>
 </file>
@@ -18110,6 +21113,17 @@
       <w:vertAlign w:val="superscript"/>
     </w:rPr>
   </w:style>
+  <w:style w:type="paragraph" w:styleId="NormalWeb">
+    <w:name w:val="Normal (Web)"/>
+    <w:basedOn w:val="Normal"/>
+    <w:uiPriority w:val="99"/>
+    <w:semiHidden/>
+    <w:unhideWhenUsed/>
+    <w:rsid w:val="00AA7C0F"/>
+    <w:rPr>
+      <w:rFonts w:ascii="Times New Roman" w:hAnsi="Times New Roman" w:cs="Times New Roman"/>
+    </w:rPr>
+  </w:style>
 </w:styles>
 </file>
 
@@ -18439,10 +21453,22 @@
 </CoverPageProperties>
 </file>
 
+<file path=customXml/item2.xml><?xml version="1.0" encoding="utf-8"?>
+<b:Sources xmlns:b="http://schemas.openxmlformats.org/officeDocument/2006/bibliography" xmlns="http://schemas.openxmlformats.org/officeDocument/2006/bibliography" SelectedStyle="\APASixthEditionOfficeOnline.xsl" StyleName="APA" Version="6"/>
+</file>
+
 <file path=customXml/itemProps1.xml><?xml version="1.0" encoding="utf-8"?>
 <ds:datastoreItem xmlns:ds="http://schemas.openxmlformats.org/officeDocument/2006/customXml" ds:itemID="{55AF091B-3C7A-41E3-B477-F2FDAA23CFDA}">
   <ds:schemaRefs>
     <ds:schemaRef ds:uri="http://schemas.microsoft.com/office/2006/coverPageProps"/>
   </ds:schemaRefs>
 </ds:datastoreItem>
+</file>
+
+<file path=customXml/itemProps2.xml><?xml version="1.0" encoding="utf-8"?>
+<ds:datastoreItem xmlns:ds="http://schemas.openxmlformats.org/officeDocument/2006/customXml" ds:itemID="{6AB7F1AB-376E-495F-8CEF-704337E3C2FD}">
+  <ds:schemaRefs>
+    <ds:schemaRef ds:uri="http://schemas.openxmlformats.org/officeDocument/2006/bibliography"/>
+  </ds:schemaRefs>
+</ds:datastoreItem>
 </file>
</xml_diff>

<commit_message>
ultimos cambios casi 24/5
</commit_message>
<xml_diff>
--- a/Memoria_ProyectoV1.docx
+++ b/Memoria_ProyectoV1.docx
@@ -6181,6 +6181,25 @@
       <w:shd w:val="clear" w:color="auto" w:fill="E1DFDD"/>
     </w:rPr>
   </w:style>
+  <w:style w:type="paragraph" w:styleId="Descripcin">
+    <w:name w:val="caption"/>
+    <w:basedOn w:val="Normal"/>
+    <w:next w:val="Normal"/>
+    <w:uiPriority w:val="35"/>
+    <w:unhideWhenUsed/>
+    <w:qFormat/>
+    <w:rsid w:val="00AA1EA3"/>
+    <w:pPr>
+      <w:spacing w:after="200" w:line="240" w:lineRule="auto"/>
+    </w:pPr>
+    <w:rPr>
+      <w:i/>
+      <w:iCs/>
+      <w:color w:val="0E2841" w:themeColor="text2"/>
+      <w:sz w:val="18"/>
+      <w:szCs w:val="18"/>
+    </w:rPr>
+  </w:style>
 </w:styles>
 </file>
 

</xml_diff>